<commit_message>
Add fitur generate laporan
</commit_message>
<xml_diff>
--- a/static/templates/laporan/BLANKO LAPORAN BULANAN.docx
+++ b/static/templates/laporan/BLANKO LAPORAN BULANAN.docx
@@ -655,17 +655,17 @@
         <w:tblLook w:val="04A0" w:firstRow="1" w:lastRow="0" w:firstColumn="1" w:lastColumn="0" w:noHBand="0" w:noVBand="1"/>
       </w:tblPr>
       <w:tblGrid>
-        <w:gridCol w:w="753"/>
-        <w:gridCol w:w="1707"/>
-        <w:gridCol w:w="2935"/>
-        <w:gridCol w:w="1644"/>
-        <w:gridCol w:w="1716"/>
-        <w:gridCol w:w="880"/>
+        <w:gridCol w:w="737"/>
+        <w:gridCol w:w="1362"/>
+        <w:gridCol w:w="2174"/>
+        <w:gridCol w:w="3031"/>
+        <w:gridCol w:w="2480"/>
+        <w:gridCol w:w="512"/>
       </w:tblGrid>
       <w:tr>
         <w:tc>
           <w:tcPr>
-            <w:tcW w:w="753" w:type="dxa"/>
+            <w:tcW w:w="737" w:type="dxa"/>
             <w:vMerge w:val="restart"/>
           </w:tcPr>
           <w:p>
@@ -687,7 +687,7 @@
         </w:tc>
         <w:tc>
           <w:tcPr>
-            <w:tcW w:w="1707" w:type="dxa"/>
+            <w:tcW w:w="1362" w:type="dxa"/>
             <w:vMerge w:val="restart"/>
           </w:tcPr>
           <w:p>
@@ -701,7 +701,7 @@
         </w:tc>
         <w:tc>
           <w:tcPr>
-            <w:tcW w:w="2935" w:type="dxa"/>
+            <w:tcW w:w="2174" w:type="dxa"/>
             <w:vMerge w:val="restart"/>
           </w:tcPr>
           <w:p>
@@ -715,7 +715,7 @@
         </w:tc>
         <w:tc>
           <w:tcPr>
-            <w:tcW w:w="4240" w:type="dxa"/>
+            <w:tcW w:w="6023" w:type="dxa"/>
             <w:gridSpan w:val="3"/>
           </w:tcPr>
           <w:p>
@@ -731,7 +731,7 @@
       <w:tr>
         <w:tc>
           <w:tcPr>
-            <w:tcW w:w="753" w:type="dxa"/>
+            <w:tcW w:w="737" w:type="dxa"/>
             <w:vMerge/>
           </w:tcPr>
           <w:p>
@@ -742,7 +742,7 @@
         </w:tc>
         <w:tc>
           <w:tcPr>
-            <w:tcW w:w="1707" w:type="dxa"/>
+            <w:tcW w:w="1362" w:type="dxa"/>
             <w:vMerge/>
           </w:tcPr>
           <w:p>
@@ -753,7 +753,7 @@
         </w:tc>
         <w:tc>
           <w:tcPr>
-            <w:tcW w:w="2935" w:type="dxa"/>
+            <w:tcW w:w="2174" w:type="dxa"/>
             <w:vMerge/>
           </w:tcPr>
           <w:p>
@@ -764,7 +764,7 @@
         </w:tc>
         <w:tc>
           <w:tcPr>
-            <w:tcW w:w="1644" w:type="dxa"/>
+            <w:tcW w:w="3031" w:type="dxa"/>
           </w:tcPr>
           <w:p>
             <w:pPr>
@@ -777,7 +777,7 @@
         </w:tc>
         <w:tc>
           <w:tcPr>
-            <w:tcW w:w="1716" w:type="dxa"/>
+            <w:tcW w:w="2480" w:type="dxa"/>
           </w:tcPr>
           <w:p>
             <w:pPr>
@@ -796,7 +796,7 @@
         </w:tc>
         <w:tc>
           <w:tcPr>
-            <w:tcW w:w="880" w:type="dxa"/>
+            <w:tcW w:w="512" w:type="dxa"/>
           </w:tcPr>
           <w:p>
             <w:pPr>
@@ -808,37 +808,37 @@
       <w:tr>
         <w:tc>
           <w:tcPr>
-            <w:tcW w:w="753" w:type="dxa"/>
-          </w:tcPr>
-          <w:p/>
-        </w:tc>
-        <w:tc>
-          <w:tcPr>
-            <w:tcW w:w="1707" w:type="dxa"/>
-          </w:tcPr>
-          <w:p/>
-        </w:tc>
-        <w:tc>
-          <w:tcPr>
-            <w:tcW w:w="2935" w:type="dxa"/>
-          </w:tcPr>
-          <w:p/>
-        </w:tc>
-        <w:tc>
-          <w:tcPr>
-            <w:tcW w:w="1644" w:type="dxa"/>
-          </w:tcPr>
-          <w:p/>
-        </w:tc>
-        <w:tc>
-          <w:tcPr>
-            <w:tcW w:w="1716" w:type="dxa"/>
-          </w:tcPr>
-          <w:p/>
-        </w:tc>
-        <w:tc>
-          <w:tcPr>
-            <w:tcW w:w="880" w:type="dxa"/>
+            <w:tcW w:w="737" w:type="dxa"/>
+          </w:tcPr>
+          <w:p/>
+        </w:tc>
+        <w:tc>
+          <w:tcPr>
+            <w:tcW w:w="1362" w:type="dxa"/>
+          </w:tcPr>
+          <w:p/>
+        </w:tc>
+        <w:tc>
+          <w:tcPr>
+            <w:tcW w:w="2174" w:type="dxa"/>
+          </w:tcPr>
+          <w:p/>
+        </w:tc>
+        <w:tc>
+          <w:tcPr>
+            <w:tcW w:w="3031" w:type="dxa"/>
+          </w:tcPr>
+          <w:p/>
+        </w:tc>
+        <w:tc>
+          <w:tcPr>
+            <w:tcW w:w="2480" w:type="dxa"/>
+          </w:tcPr>
+          <w:p/>
+        </w:tc>
+        <w:tc>
+          <w:tcPr>
+            <w:tcW w:w="512" w:type="dxa"/>
           </w:tcPr>
           <w:p/>
         </w:tc>
@@ -846,7 +846,7 @@
       <w:tr>
         <w:tc>
           <w:tcPr>
-            <w:tcW w:w="753" w:type="dxa"/>
+            <w:tcW w:w="737" w:type="dxa"/>
             <w:vMerge w:val="restart"/>
           </w:tcPr>
           <w:p>
@@ -870,7 +870,7 @@
         </w:tc>
         <w:tc>
           <w:tcPr>
-            <w:tcW w:w="1707" w:type="dxa"/>
+            <w:tcW w:w="1362" w:type="dxa"/>
             <w:vMerge w:val="restart"/>
           </w:tcPr>
           <w:p/>
@@ -883,7 +883,7 @@
         </w:tc>
         <w:tc>
           <w:tcPr>
-            <w:tcW w:w="2935" w:type="dxa"/>
+            <w:tcW w:w="2174" w:type="dxa"/>
           </w:tcPr>
           <w:p>
             <w:r>
@@ -893,33 +893,95 @@
         </w:tc>
         <w:tc>
           <w:tcPr>
-            <w:tcW w:w="1644" w:type="dxa"/>
-          </w:tcPr>
-          <w:p>
-            <w:pPr>
-              <w:jc w:val="center"/>
-              <w:rPr>
-                <w:lang w:val="id-ID"/>
-              </w:rPr>
-            </w:pPr>
-          </w:p>
-        </w:tc>
-        <w:tc>
-          <w:tcPr>
-            <w:tcW w:w="1716" w:type="dxa"/>
-          </w:tcPr>
-          <w:p>
-            <w:pPr>
-              <w:jc w:val="center"/>
-              <w:rPr>
-                <w:lang w:val="id-ID"/>
-              </w:rPr>
-            </w:pPr>
-          </w:p>
-        </w:tc>
-        <w:tc>
-          <w:tcPr>
-            <w:tcW w:w="880" w:type="dxa"/>
+            <w:tcW w:w="3031" w:type="dxa"/>
+          </w:tcPr>
+          <w:p>
+            <w:pPr>
+              <w:jc w:val="center"/>
+              <w:rPr>
+                <w:lang w:val="id-ID"/>
+              </w:rPr>
+            </w:pPr>
+            <w:r>
+              <w:rPr>
+                <w:lang w:val="id-ID"/>
+              </w:rPr>
+              <w:fldChar w:fldCharType="begin"/>
+            </w:r>
+            <w:r>
+              <w:rPr>
+                <w:lang w:val="id-ID"/>
+              </w:rPr>
+              <w:instrText xml:space="preserve"> MERGEFIELD persediaan_awal_pertamax </w:instrText>
+            </w:r>
+            <w:r>
+              <w:rPr>
+                <w:lang w:val="id-ID"/>
+              </w:rPr>
+              <w:fldChar w:fldCharType="separate"/>
+            </w:r>
+            <w:r>
+              <w:rPr>
+                <w:noProof/>
+                <w:lang w:val="id-ID"/>
+              </w:rPr>
+              <w:t>1,025</w:t>
+            </w:r>
+            <w:r>
+              <w:rPr>
+                <w:lang w:val="id-ID"/>
+              </w:rPr>
+              <w:fldChar w:fldCharType="end"/>
+            </w:r>
+          </w:p>
+        </w:tc>
+        <w:tc>
+          <w:tcPr>
+            <w:tcW w:w="2480" w:type="dxa"/>
+          </w:tcPr>
+          <w:p>
+            <w:pPr>
+              <w:jc w:val="center"/>
+              <w:rPr>
+                <w:lang w:val="id-ID"/>
+              </w:rPr>
+            </w:pPr>
+            <w:r>
+              <w:rPr>
+                <w:lang w:val="id-ID"/>
+              </w:rPr>
+              <w:fldChar w:fldCharType="begin"/>
+            </w:r>
+            <w:r>
+              <w:rPr>
+                <w:lang w:val="id-ID"/>
+              </w:rPr>
+              <w:instrText xml:space="preserve"> MERGEFIELD persediaan_awal_dex </w:instrText>
+            </w:r>
+            <w:r>
+              <w:rPr>
+                <w:lang w:val="id-ID"/>
+              </w:rPr>
+              <w:fldChar w:fldCharType="separate"/>
+            </w:r>
+            <w:r>
+              <w:rPr>
+                <w:noProof/>
+                <w:lang w:val="id-ID"/>
+              </w:rPr>
+              <w:t>522</w:t>
+            </w:r>
+            <w:r>
+              <w:rPr>
+                <w:lang w:val="id-ID"/>
+              </w:rPr>
+              <w:fldChar w:fldCharType="end"/>
+            </w:r>
+          </w:p>
+        </w:tc>
+        <w:tc>
+          <w:tcPr>
+            <w:tcW w:w="512" w:type="dxa"/>
           </w:tcPr>
           <w:p/>
         </w:tc>
@@ -927,7 +989,7 @@
       <w:tr>
         <w:tc>
           <w:tcPr>
-            <w:tcW w:w="753" w:type="dxa"/>
+            <w:tcW w:w="737" w:type="dxa"/>
             <w:vMerge/>
           </w:tcPr>
           <w:p>
@@ -938,14 +1000,14 @@
         </w:tc>
         <w:tc>
           <w:tcPr>
-            <w:tcW w:w="1707" w:type="dxa"/>
+            <w:tcW w:w="1362" w:type="dxa"/>
             <w:vMerge/>
           </w:tcPr>
           <w:p/>
         </w:tc>
         <w:tc>
           <w:tcPr>
-            <w:tcW w:w="2935" w:type="dxa"/>
+            <w:tcW w:w="2174" w:type="dxa"/>
           </w:tcPr>
           <w:p>
             <w:r>
@@ -955,33 +1017,95 @@
         </w:tc>
         <w:tc>
           <w:tcPr>
-            <w:tcW w:w="1644" w:type="dxa"/>
-          </w:tcPr>
-          <w:p>
-            <w:pPr>
-              <w:jc w:val="center"/>
-              <w:rPr>
-                <w:lang w:val="id-ID"/>
-              </w:rPr>
-            </w:pPr>
-          </w:p>
-        </w:tc>
-        <w:tc>
-          <w:tcPr>
-            <w:tcW w:w="1716" w:type="dxa"/>
-          </w:tcPr>
-          <w:p>
-            <w:pPr>
-              <w:jc w:val="center"/>
-              <w:rPr>
-                <w:lang w:val="id-ID"/>
-              </w:rPr>
-            </w:pPr>
-          </w:p>
-        </w:tc>
-        <w:tc>
-          <w:tcPr>
-            <w:tcW w:w="880" w:type="dxa"/>
+            <w:tcW w:w="3031" w:type="dxa"/>
+          </w:tcPr>
+          <w:p>
+            <w:pPr>
+              <w:jc w:val="center"/>
+              <w:rPr>
+                <w:lang w:val="id-ID"/>
+              </w:rPr>
+            </w:pPr>
+            <w:r>
+              <w:rPr>
+                <w:lang w:val="id-ID"/>
+              </w:rPr>
+              <w:fldChar w:fldCharType="begin"/>
+            </w:r>
+            <w:r>
+              <w:rPr>
+                <w:lang w:val="id-ID"/>
+              </w:rPr>
+              <w:instrText xml:space="preserve"> MERGEFIELD penerimaan_pertamax </w:instrText>
+            </w:r>
+            <w:r>
+              <w:rPr>
+                <w:lang w:val="id-ID"/>
+              </w:rPr>
+              <w:fldChar w:fldCharType="separate"/>
+            </w:r>
+            <w:r>
+              <w:rPr>
+                <w:noProof/>
+                <w:lang w:val="id-ID"/>
+              </w:rPr>
+              <w:t>8,000</w:t>
+            </w:r>
+            <w:r>
+              <w:rPr>
+                <w:lang w:val="id-ID"/>
+              </w:rPr>
+              <w:fldChar w:fldCharType="end"/>
+            </w:r>
+          </w:p>
+        </w:tc>
+        <w:tc>
+          <w:tcPr>
+            <w:tcW w:w="2480" w:type="dxa"/>
+          </w:tcPr>
+          <w:p>
+            <w:pPr>
+              <w:jc w:val="center"/>
+              <w:rPr>
+                <w:lang w:val="id-ID"/>
+              </w:rPr>
+            </w:pPr>
+            <w:r>
+              <w:rPr>
+                <w:lang w:val="id-ID"/>
+              </w:rPr>
+              <w:fldChar w:fldCharType="begin"/>
+            </w:r>
+            <w:r>
+              <w:rPr>
+                <w:lang w:val="id-ID"/>
+              </w:rPr>
+              <w:instrText xml:space="preserve"> MERGEFIELD penerimaan_dex </w:instrText>
+            </w:r>
+            <w:r>
+              <w:rPr>
+                <w:lang w:val="id-ID"/>
+              </w:rPr>
+              <w:fldChar w:fldCharType="separate"/>
+            </w:r>
+            <w:r>
+              <w:rPr>
+                <w:noProof/>
+                <w:lang w:val="id-ID"/>
+              </w:rPr>
+              <w:t>8,000</w:t>
+            </w:r>
+            <w:r>
+              <w:rPr>
+                <w:lang w:val="id-ID"/>
+              </w:rPr>
+              <w:fldChar w:fldCharType="end"/>
+            </w:r>
+          </w:p>
+        </w:tc>
+        <w:tc>
+          <w:tcPr>
+            <w:tcW w:w="512" w:type="dxa"/>
           </w:tcPr>
           <w:p/>
         </w:tc>
@@ -989,7 +1113,7 @@
       <w:tr>
         <w:tc>
           <w:tcPr>
-            <w:tcW w:w="753" w:type="dxa"/>
+            <w:tcW w:w="737" w:type="dxa"/>
             <w:vMerge/>
           </w:tcPr>
           <w:p>
@@ -1000,14 +1124,14 @@
         </w:tc>
         <w:tc>
           <w:tcPr>
-            <w:tcW w:w="1707" w:type="dxa"/>
+            <w:tcW w:w="1362" w:type="dxa"/>
             <w:vMerge/>
           </w:tcPr>
           <w:p/>
         </w:tc>
         <w:tc>
           <w:tcPr>
-            <w:tcW w:w="2935" w:type="dxa"/>
+            <w:tcW w:w="2174" w:type="dxa"/>
           </w:tcPr>
           <w:p>
             <w:r>
@@ -1017,33 +1141,95 @@
         </w:tc>
         <w:tc>
           <w:tcPr>
-            <w:tcW w:w="1644" w:type="dxa"/>
-          </w:tcPr>
-          <w:p>
-            <w:pPr>
-              <w:jc w:val="center"/>
-              <w:rPr>
-                <w:lang w:val="id-ID"/>
-              </w:rPr>
-            </w:pPr>
-          </w:p>
-        </w:tc>
-        <w:tc>
-          <w:tcPr>
-            <w:tcW w:w="1716" w:type="dxa"/>
-          </w:tcPr>
-          <w:p>
-            <w:pPr>
-              <w:jc w:val="center"/>
-              <w:rPr>
-                <w:lang w:val="id-ID"/>
-              </w:rPr>
-            </w:pPr>
-          </w:p>
-        </w:tc>
-        <w:tc>
-          <w:tcPr>
-            <w:tcW w:w="880" w:type="dxa"/>
+            <w:tcW w:w="3031" w:type="dxa"/>
+          </w:tcPr>
+          <w:p>
+            <w:pPr>
+              <w:jc w:val="center"/>
+              <w:rPr>
+                <w:lang w:val="id-ID"/>
+              </w:rPr>
+            </w:pPr>
+            <w:r>
+              <w:rPr>
+                <w:lang w:val="id-ID"/>
+              </w:rPr>
+              <w:fldChar w:fldCharType="begin"/>
+            </w:r>
+            <w:r>
+              <w:rPr>
+                <w:lang w:val="id-ID"/>
+              </w:rPr>
+              <w:instrText xml:space="preserve"> MERGEFIELD jumlah_pertamax </w:instrText>
+            </w:r>
+            <w:r>
+              <w:rPr>
+                <w:lang w:val="id-ID"/>
+              </w:rPr>
+              <w:fldChar w:fldCharType="separate"/>
+            </w:r>
+            <w:r>
+              <w:rPr>
+                <w:noProof/>
+                <w:lang w:val="id-ID"/>
+              </w:rPr>
+              <w:t>9,025</w:t>
+            </w:r>
+            <w:r>
+              <w:rPr>
+                <w:lang w:val="id-ID"/>
+              </w:rPr>
+              <w:fldChar w:fldCharType="end"/>
+            </w:r>
+          </w:p>
+        </w:tc>
+        <w:tc>
+          <w:tcPr>
+            <w:tcW w:w="2480" w:type="dxa"/>
+          </w:tcPr>
+          <w:p>
+            <w:pPr>
+              <w:jc w:val="center"/>
+              <w:rPr>
+                <w:lang w:val="id-ID"/>
+              </w:rPr>
+            </w:pPr>
+            <w:r>
+              <w:rPr>
+                <w:lang w:val="id-ID"/>
+              </w:rPr>
+              <w:fldChar w:fldCharType="begin"/>
+            </w:r>
+            <w:r>
+              <w:rPr>
+                <w:lang w:val="id-ID"/>
+              </w:rPr>
+              <w:instrText xml:space="preserve"> MERGEFIELD jumlah_dex </w:instrText>
+            </w:r>
+            <w:r>
+              <w:rPr>
+                <w:lang w:val="id-ID"/>
+              </w:rPr>
+              <w:fldChar w:fldCharType="separate"/>
+            </w:r>
+            <w:r>
+              <w:rPr>
+                <w:noProof/>
+                <w:lang w:val="id-ID"/>
+              </w:rPr>
+              <w:t>8,522</w:t>
+            </w:r>
+            <w:r>
+              <w:rPr>
+                <w:lang w:val="id-ID"/>
+              </w:rPr>
+              <w:fldChar w:fldCharType="end"/>
+            </w:r>
+          </w:p>
+        </w:tc>
+        <w:tc>
+          <w:tcPr>
+            <w:tcW w:w="512" w:type="dxa"/>
           </w:tcPr>
           <w:p/>
         </w:tc>
@@ -1051,7 +1237,7 @@
       <w:tr>
         <w:tc>
           <w:tcPr>
-            <w:tcW w:w="753" w:type="dxa"/>
+            <w:tcW w:w="737" w:type="dxa"/>
             <w:vMerge/>
           </w:tcPr>
           <w:p>
@@ -1062,14 +1248,14 @@
         </w:tc>
         <w:tc>
           <w:tcPr>
-            <w:tcW w:w="1707" w:type="dxa"/>
+            <w:tcW w:w="1362" w:type="dxa"/>
             <w:vMerge/>
           </w:tcPr>
           <w:p/>
         </w:tc>
         <w:tc>
           <w:tcPr>
-            <w:tcW w:w="2935" w:type="dxa"/>
+            <w:tcW w:w="2174" w:type="dxa"/>
           </w:tcPr>
           <w:p>
             <w:r>
@@ -1079,33 +1265,95 @@
         </w:tc>
         <w:tc>
           <w:tcPr>
-            <w:tcW w:w="1644" w:type="dxa"/>
-          </w:tcPr>
-          <w:p>
-            <w:pPr>
-              <w:jc w:val="center"/>
-              <w:rPr>
-                <w:lang w:val="id-ID"/>
-              </w:rPr>
-            </w:pPr>
-          </w:p>
-        </w:tc>
-        <w:tc>
-          <w:tcPr>
-            <w:tcW w:w="1716" w:type="dxa"/>
-          </w:tcPr>
-          <w:p>
-            <w:pPr>
-              <w:jc w:val="center"/>
-              <w:rPr>
-                <w:lang w:val="id-ID"/>
-              </w:rPr>
-            </w:pPr>
-          </w:p>
-        </w:tc>
-        <w:tc>
-          <w:tcPr>
-            <w:tcW w:w="880" w:type="dxa"/>
+            <w:tcW w:w="3031" w:type="dxa"/>
+          </w:tcPr>
+          <w:p>
+            <w:pPr>
+              <w:jc w:val="center"/>
+              <w:rPr>
+                <w:lang w:val="id-ID"/>
+              </w:rPr>
+            </w:pPr>
+            <w:r>
+              <w:rPr>
+                <w:lang w:val="id-ID"/>
+              </w:rPr>
+              <w:fldChar w:fldCharType="begin"/>
+            </w:r>
+            <w:r>
+              <w:rPr>
+                <w:lang w:val="id-ID"/>
+              </w:rPr>
+              <w:instrText xml:space="preserve"> MERGEFIELD pengeluaran_pertamax </w:instrText>
+            </w:r>
+            <w:r>
+              <w:rPr>
+                <w:lang w:val="id-ID"/>
+              </w:rPr>
+              <w:fldChar w:fldCharType="separate"/>
+            </w:r>
+            <w:r>
+              <w:rPr>
+                <w:noProof/>
+                <w:lang w:val="id-ID"/>
+              </w:rPr>
+              <w:t>3,060</w:t>
+            </w:r>
+            <w:r>
+              <w:rPr>
+                <w:lang w:val="id-ID"/>
+              </w:rPr>
+              <w:fldChar w:fldCharType="end"/>
+            </w:r>
+          </w:p>
+        </w:tc>
+        <w:tc>
+          <w:tcPr>
+            <w:tcW w:w="2480" w:type="dxa"/>
+          </w:tcPr>
+          <w:p>
+            <w:pPr>
+              <w:jc w:val="center"/>
+              <w:rPr>
+                <w:lang w:val="id-ID"/>
+              </w:rPr>
+            </w:pPr>
+            <w:r>
+              <w:rPr>
+                <w:lang w:val="id-ID"/>
+              </w:rPr>
+              <w:fldChar w:fldCharType="begin"/>
+            </w:r>
+            <w:r>
+              <w:rPr>
+                <w:lang w:val="id-ID"/>
+              </w:rPr>
+              <w:instrText xml:space="preserve"> MERGEFIELD pengeluaran_dex </w:instrText>
+            </w:r>
+            <w:r>
+              <w:rPr>
+                <w:lang w:val="id-ID"/>
+              </w:rPr>
+              <w:fldChar w:fldCharType="separate"/>
+            </w:r>
+            <w:r>
+              <w:rPr>
+                <w:noProof/>
+                <w:lang w:val="id-ID"/>
+              </w:rPr>
+              <w:t>2,587</w:t>
+            </w:r>
+            <w:r>
+              <w:rPr>
+                <w:lang w:val="id-ID"/>
+              </w:rPr>
+              <w:fldChar w:fldCharType="end"/>
+            </w:r>
+          </w:p>
+        </w:tc>
+        <w:tc>
+          <w:tcPr>
+            <w:tcW w:w="512" w:type="dxa"/>
           </w:tcPr>
           <w:p/>
         </w:tc>
@@ -1113,7 +1361,7 @@
       <w:tr>
         <w:tc>
           <w:tcPr>
-            <w:tcW w:w="753" w:type="dxa"/>
+            <w:tcW w:w="737" w:type="dxa"/>
             <w:vMerge/>
           </w:tcPr>
           <w:p>
@@ -1124,14 +1372,14 @@
         </w:tc>
         <w:tc>
           <w:tcPr>
-            <w:tcW w:w="1707" w:type="dxa"/>
+            <w:tcW w:w="1362" w:type="dxa"/>
             <w:vMerge/>
           </w:tcPr>
           <w:p/>
         </w:tc>
         <w:tc>
           <w:tcPr>
-            <w:tcW w:w="2935" w:type="dxa"/>
+            <w:tcW w:w="2174" w:type="dxa"/>
           </w:tcPr>
           <w:p>
             <w:r>
@@ -1141,35 +1389,107 @@
         </w:tc>
         <w:tc>
           <w:tcPr>
-            <w:tcW w:w="1644" w:type="dxa"/>
-          </w:tcPr>
-          <w:p>
-            <w:pPr>
-              <w:jc w:val="center"/>
-              <w:rPr>
-                <w:b/>
-                <w:lang w:val="id-ID"/>
-              </w:rPr>
-            </w:pPr>
-          </w:p>
-        </w:tc>
-        <w:tc>
-          <w:tcPr>
-            <w:tcW w:w="1716" w:type="dxa"/>
-          </w:tcPr>
-          <w:p>
-            <w:pPr>
-              <w:jc w:val="center"/>
-              <w:rPr>
-                <w:b/>
-                <w:lang w:val="id-ID"/>
-              </w:rPr>
-            </w:pPr>
-          </w:p>
-        </w:tc>
-        <w:tc>
-          <w:tcPr>
-            <w:tcW w:w="880" w:type="dxa"/>
+            <w:tcW w:w="3031" w:type="dxa"/>
+          </w:tcPr>
+          <w:p>
+            <w:pPr>
+              <w:jc w:val="center"/>
+              <w:rPr>
+                <w:b/>
+                <w:lang w:val="id-ID"/>
+              </w:rPr>
+            </w:pPr>
+            <w:r>
+              <w:rPr>
+                <w:b/>
+                <w:lang w:val="id-ID"/>
+              </w:rPr>
+              <w:fldChar w:fldCharType="begin"/>
+            </w:r>
+            <w:r>
+              <w:rPr>
+                <w:b/>
+                <w:lang w:val="id-ID"/>
+              </w:rPr>
+              <w:instrText xml:space="preserve"> MERGEFIELD persediaan_akhir_pertamax </w:instrText>
+            </w:r>
+            <w:r>
+              <w:rPr>
+                <w:b/>
+                <w:lang w:val="id-ID"/>
+              </w:rPr>
+              <w:fldChar w:fldCharType="separate"/>
+            </w:r>
+            <w:r>
+              <w:rPr>
+                <w:b/>
+                <w:noProof/>
+                <w:lang w:val="id-ID"/>
+              </w:rPr>
+              <w:t>5,965</w:t>
+            </w:r>
+            <w:r>
+              <w:rPr>
+                <w:b/>
+                <w:lang w:val="id-ID"/>
+              </w:rPr>
+              <w:fldChar w:fldCharType="end"/>
+            </w:r>
+          </w:p>
+        </w:tc>
+        <w:tc>
+          <w:tcPr>
+            <w:tcW w:w="2480" w:type="dxa"/>
+          </w:tcPr>
+          <w:p>
+            <w:pPr>
+              <w:jc w:val="center"/>
+              <w:rPr>
+                <w:b/>
+                <w:lang w:val="id-ID"/>
+              </w:rPr>
+            </w:pPr>
+            <w:r>
+              <w:rPr>
+                <w:b/>
+                <w:lang w:val="id-ID"/>
+              </w:rPr>
+              <w:fldChar w:fldCharType="begin"/>
+            </w:r>
+            <w:r>
+              <w:rPr>
+                <w:b/>
+                <w:lang w:val="id-ID"/>
+              </w:rPr>
+              <w:instrText xml:space="preserve"> MERGEFIELD persediaan_akhir_dex </w:instrText>
+            </w:r>
+            <w:r>
+              <w:rPr>
+                <w:b/>
+                <w:lang w:val="id-ID"/>
+              </w:rPr>
+              <w:fldChar w:fldCharType="separate"/>
+            </w:r>
+            <w:r>
+              <w:rPr>
+                <w:b/>
+                <w:noProof/>
+                <w:lang w:val="id-ID"/>
+              </w:rPr>
+              <w:t>5,935</w:t>
+            </w:r>
+            <w:r>
+              <w:rPr>
+                <w:b/>
+                <w:lang w:val="id-ID"/>
+              </w:rPr>
+              <w:fldChar w:fldCharType="end"/>
+            </w:r>
+          </w:p>
+        </w:tc>
+        <w:tc>
+          <w:tcPr>
+            <w:tcW w:w="512" w:type="dxa"/>
           </w:tcPr>
           <w:p/>
         </w:tc>
@@ -1177,49 +1497,49 @@
       <w:tr>
         <w:tc>
           <w:tcPr>
-            <w:tcW w:w="753" w:type="dxa"/>
-          </w:tcPr>
-          <w:p>
-            <w:pPr>
-              <w:jc w:val="center"/>
-            </w:pPr>
-          </w:p>
-        </w:tc>
-        <w:tc>
-          <w:tcPr>
-            <w:tcW w:w="1707" w:type="dxa"/>
-          </w:tcPr>
-          <w:p/>
-        </w:tc>
-        <w:tc>
-          <w:tcPr>
-            <w:tcW w:w="2935" w:type="dxa"/>
-          </w:tcPr>
-          <w:p/>
-        </w:tc>
-        <w:tc>
-          <w:tcPr>
-            <w:tcW w:w="1644" w:type="dxa"/>
-          </w:tcPr>
-          <w:p>
-            <w:pPr>
-              <w:jc w:val="center"/>
-            </w:pPr>
-          </w:p>
-        </w:tc>
-        <w:tc>
-          <w:tcPr>
-            <w:tcW w:w="1716" w:type="dxa"/>
-          </w:tcPr>
-          <w:p>
-            <w:pPr>
-              <w:jc w:val="center"/>
-            </w:pPr>
-          </w:p>
-        </w:tc>
-        <w:tc>
-          <w:tcPr>
-            <w:tcW w:w="880" w:type="dxa"/>
+            <w:tcW w:w="737" w:type="dxa"/>
+          </w:tcPr>
+          <w:p>
+            <w:pPr>
+              <w:jc w:val="center"/>
+            </w:pPr>
+          </w:p>
+        </w:tc>
+        <w:tc>
+          <w:tcPr>
+            <w:tcW w:w="1362" w:type="dxa"/>
+          </w:tcPr>
+          <w:p/>
+        </w:tc>
+        <w:tc>
+          <w:tcPr>
+            <w:tcW w:w="2174" w:type="dxa"/>
+          </w:tcPr>
+          <w:p/>
+        </w:tc>
+        <w:tc>
+          <w:tcPr>
+            <w:tcW w:w="3031" w:type="dxa"/>
+          </w:tcPr>
+          <w:p>
+            <w:pPr>
+              <w:jc w:val="center"/>
+            </w:pPr>
+          </w:p>
+        </w:tc>
+        <w:tc>
+          <w:tcPr>
+            <w:tcW w:w="2480" w:type="dxa"/>
+          </w:tcPr>
+          <w:p>
+            <w:pPr>
+              <w:jc w:val="center"/>
+            </w:pPr>
+          </w:p>
+        </w:tc>
+        <w:tc>
+          <w:tcPr>
+            <w:tcW w:w="512" w:type="dxa"/>
           </w:tcPr>
           <w:p/>
         </w:tc>
@@ -1227,7 +1547,7 @@
       <w:tr>
         <w:tc>
           <w:tcPr>
-            <w:tcW w:w="753" w:type="dxa"/>
+            <w:tcW w:w="737" w:type="dxa"/>
             <w:vMerge w:val="restart"/>
             <w:vAlign w:val="center"/>
           </w:tcPr>
@@ -1264,7 +1584,7 @@
         </w:tc>
         <w:tc>
           <w:tcPr>
-            <w:tcW w:w="1707" w:type="dxa"/>
+            <w:tcW w:w="1362" w:type="dxa"/>
             <w:vMerge w:val="restart"/>
             <w:vAlign w:val="center"/>
           </w:tcPr>
@@ -1279,7 +1599,7 @@
         </w:tc>
         <w:tc>
           <w:tcPr>
-            <w:tcW w:w="2935" w:type="dxa"/>
+            <w:tcW w:w="2174" w:type="dxa"/>
           </w:tcPr>
           <w:p>
             <w:r>
@@ -1289,33 +1609,95 @@
         </w:tc>
         <w:tc>
           <w:tcPr>
-            <w:tcW w:w="1644" w:type="dxa"/>
-          </w:tcPr>
-          <w:p>
-            <w:pPr>
-              <w:jc w:val="center"/>
-              <w:rPr>
-                <w:lang w:val="id-ID"/>
-              </w:rPr>
-            </w:pPr>
-          </w:p>
-        </w:tc>
-        <w:tc>
-          <w:tcPr>
-            <w:tcW w:w="1716" w:type="dxa"/>
-          </w:tcPr>
-          <w:p>
-            <w:pPr>
-              <w:jc w:val="center"/>
-              <w:rPr>
-                <w:lang w:val="id-ID"/>
-              </w:rPr>
-            </w:pPr>
-          </w:p>
-        </w:tc>
-        <w:tc>
-          <w:tcPr>
-            <w:tcW w:w="880" w:type="dxa"/>
+            <w:tcW w:w="3031" w:type="dxa"/>
+          </w:tcPr>
+          <w:p>
+            <w:pPr>
+              <w:jc w:val="center"/>
+              <w:rPr>
+                <w:lang w:val="id-ID"/>
+              </w:rPr>
+            </w:pPr>
+            <w:r>
+              <w:rPr>
+                <w:lang w:val="id-ID"/>
+              </w:rPr>
+              <w:fldChar w:fldCharType="begin"/>
+            </w:r>
+            <w:r>
+              <w:rPr>
+                <w:lang w:val="id-ID"/>
+              </w:rPr>
+              <w:instrText xml:space="preserve"> MERGEFIELD persediaan_awal_pertamax </w:instrText>
+            </w:r>
+            <w:r>
+              <w:rPr>
+                <w:lang w:val="id-ID"/>
+              </w:rPr>
+              <w:fldChar w:fldCharType="separate"/>
+            </w:r>
+            <w:r>
+              <w:rPr>
+                <w:noProof/>
+                <w:lang w:val="id-ID"/>
+              </w:rPr>
+              <w:t>1,025</w:t>
+            </w:r>
+            <w:r>
+              <w:rPr>
+                <w:lang w:val="id-ID"/>
+              </w:rPr>
+              <w:fldChar w:fldCharType="end"/>
+            </w:r>
+          </w:p>
+        </w:tc>
+        <w:tc>
+          <w:tcPr>
+            <w:tcW w:w="2480" w:type="dxa"/>
+          </w:tcPr>
+          <w:p>
+            <w:pPr>
+              <w:jc w:val="center"/>
+              <w:rPr>
+                <w:lang w:val="id-ID"/>
+              </w:rPr>
+            </w:pPr>
+            <w:r>
+              <w:rPr>
+                <w:lang w:val="id-ID"/>
+              </w:rPr>
+              <w:fldChar w:fldCharType="begin"/>
+            </w:r>
+            <w:r>
+              <w:rPr>
+                <w:lang w:val="id-ID"/>
+              </w:rPr>
+              <w:instrText xml:space="preserve"> MERGEFIELD persediaan_awal_dex </w:instrText>
+            </w:r>
+            <w:r>
+              <w:rPr>
+                <w:lang w:val="id-ID"/>
+              </w:rPr>
+              <w:fldChar w:fldCharType="separate"/>
+            </w:r>
+            <w:r>
+              <w:rPr>
+                <w:noProof/>
+                <w:lang w:val="id-ID"/>
+              </w:rPr>
+              <w:t>522</w:t>
+            </w:r>
+            <w:r>
+              <w:rPr>
+                <w:lang w:val="id-ID"/>
+              </w:rPr>
+              <w:fldChar w:fldCharType="end"/>
+            </w:r>
+          </w:p>
+        </w:tc>
+        <w:tc>
+          <w:tcPr>
+            <w:tcW w:w="512" w:type="dxa"/>
           </w:tcPr>
           <w:p/>
         </w:tc>
@@ -1323,7 +1705,7 @@
       <w:tr>
         <w:tc>
           <w:tcPr>
-            <w:tcW w:w="753" w:type="dxa"/>
+            <w:tcW w:w="737" w:type="dxa"/>
             <w:vMerge/>
           </w:tcPr>
           <w:p>
@@ -1334,14 +1716,14 @@
         </w:tc>
         <w:tc>
           <w:tcPr>
-            <w:tcW w:w="1707" w:type="dxa"/>
+            <w:tcW w:w="1362" w:type="dxa"/>
             <w:vMerge/>
           </w:tcPr>
           <w:p/>
         </w:tc>
         <w:tc>
           <w:tcPr>
-            <w:tcW w:w="2935" w:type="dxa"/>
+            <w:tcW w:w="2174" w:type="dxa"/>
           </w:tcPr>
           <w:p>
             <w:r>
@@ -1354,33 +1736,95 @@
         </w:tc>
         <w:tc>
           <w:tcPr>
-            <w:tcW w:w="1644" w:type="dxa"/>
-          </w:tcPr>
-          <w:p>
-            <w:pPr>
-              <w:jc w:val="center"/>
-              <w:rPr>
-                <w:lang w:val="id-ID"/>
-              </w:rPr>
-            </w:pPr>
-          </w:p>
-        </w:tc>
-        <w:tc>
-          <w:tcPr>
-            <w:tcW w:w="1716" w:type="dxa"/>
-          </w:tcPr>
-          <w:p>
-            <w:pPr>
-              <w:jc w:val="center"/>
-              <w:rPr>
-                <w:lang w:val="id-ID"/>
-              </w:rPr>
-            </w:pPr>
-          </w:p>
-        </w:tc>
-        <w:tc>
-          <w:tcPr>
-            <w:tcW w:w="880" w:type="dxa"/>
+            <w:tcW w:w="3031" w:type="dxa"/>
+          </w:tcPr>
+          <w:p>
+            <w:pPr>
+              <w:jc w:val="center"/>
+              <w:rPr>
+                <w:lang w:val="id-ID"/>
+              </w:rPr>
+            </w:pPr>
+            <w:r>
+              <w:rPr>
+                <w:lang w:val="id-ID"/>
+              </w:rPr>
+              <w:fldChar w:fldCharType="begin"/>
+            </w:r>
+            <w:r>
+              <w:rPr>
+                <w:lang w:val="id-ID"/>
+              </w:rPr>
+              <w:instrText xml:space="preserve"> MERGEFIELD penerimaan_pertamax </w:instrText>
+            </w:r>
+            <w:r>
+              <w:rPr>
+                <w:lang w:val="id-ID"/>
+              </w:rPr>
+              <w:fldChar w:fldCharType="separate"/>
+            </w:r>
+            <w:r>
+              <w:rPr>
+                <w:noProof/>
+                <w:lang w:val="id-ID"/>
+              </w:rPr>
+              <w:t>8,000</w:t>
+            </w:r>
+            <w:r>
+              <w:rPr>
+                <w:lang w:val="id-ID"/>
+              </w:rPr>
+              <w:fldChar w:fldCharType="end"/>
+            </w:r>
+          </w:p>
+        </w:tc>
+        <w:tc>
+          <w:tcPr>
+            <w:tcW w:w="2480" w:type="dxa"/>
+          </w:tcPr>
+          <w:p>
+            <w:pPr>
+              <w:jc w:val="center"/>
+              <w:rPr>
+                <w:lang w:val="id-ID"/>
+              </w:rPr>
+            </w:pPr>
+            <w:r>
+              <w:rPr>
+                <w:lang w:val="id-ID"/>
+              </w:rPr>
+              <w:fldChar w:fldCharType="begin"/>
+            </w:r>
+            <w:r>
+              <w:rPr>
+                <w:lang w:val="id-ID"/>
+              </w:rPr>
+              <w:instrText xml:space="preserve"> MERGEFIELD penerimaan_dex </w:instrText>
+            </w:r>
+            <w:r>
+              <w:rPr>
+                <w:lang w:val="id-ID"/>
+              </w:rPr>
+              <w:fldChar w:fldCharType="separate"/>
+            </w:r>
+            <w:r>
+              <w:rPr>
+                <w:noProof/>
+                <w:lang w:val="id-ID"/>
+              </w:rPr>
+              <w:t>8,000</w:t>
+            </w:r>
+            <w:r>
+              <w:rPr>
+                <w:lang w:val="id-ID"/>
+              </w:rPr>
+              <w:fldChar w:fldCharType="end"/>
+            </w:r>
+          </w:p>
+        </w:tc>
+        <w:tc>
+          <w:tcPr>
+            <w:tcW w:w="512" w:type="dxa"/>
           </w:tcPr>
           <w:p/>
         </w:tc>
@@ -1388,7 +1832,7 @@
       <w:tr>
         <w:tc>
           <w:tcPr>
-            <w:tcW w:w="753" w:type="dxa"/>
+            <w:tcW w:w="737" w:type="dxa"/>
             <w:vMerge/>
           </w:tcPr>
           <w:p>
@@ -1399,14 +1843,14 @@
         </w:tc>
         <w:tc>
           <w:tcPr>
-            <w:tcW w:w="1707" w:type="dxa"/>
+            <w:tcW w:w="1362" w:type="dxa"/>
             <w:vMerge/>
           </w:tcPr>
           <w:p/>
         </w:tc>
         <w:tc>
           <w:tcPr>
-            <w:tcW w:w="2935" w:type="dxa"/>
+            <w:tcW w:w="2174" w:type="dxa"/>
           </w:tcPr>
           <w:p>
             <w:r>
@@ -1416,33 +1860,95 @@
         </w:tc>
         <w:tc>
           <w:tcPr>
-            <w:tcW w:w="1644" w:type="dxa"/>
-          </w:tcPr>
-          <w:p>
-            <w:pPr>
-              <w:jc w:val="center"/>
-              <w:rPr>
-                <w:lang w:val="id-ID"/>
-              </w:rPr>
-            </w:pPr>
-          </w:p>
-        </w:tc>
-        <w:tc>
-          <w:tcPr>
-            <w:tcW w:w="1716" w:type="dxa"/>
-          </w:tcPr>
-          <w:p>
-            <w:pPr>
-              <w:jc w:val="center"/>
-              <w:rPr>
-                <w:lang w:val="id-ID"/>
-              </w:rPr>
-            </w:pPr>
-          </w:p>
-        </w:tc>
-        <w:tc>
-          <w:tcPr>
-            <w:tcW w:w="880" w:type="dxa"/>
+            <w:tcW w:w="3031" w:type="dxa"/>
+          </w:tcPr>
+          <w:p>
+            <w:pPr>
+              <w:jc w:val="center"/>
+              <w:rPr>
+                <w:lang w:val="id-ID"/>
+              </w:rPr>
+            </w:pPr>
+            <w:r>
+              <w:rPr>
+                <w:lang w:val="id-ID"/>
+              </w:rPr>
+              <w:fldChar w:fldCharType="begin"/>
+            </w:r>
+            <w:r>
+              <w:rPr>
+                <w:lang w:val="id-ID"/>
+              </w:rPr>
+              <w:instrText xml:space="preserve"> MERGEFIELD jumlah_pertamax </w:instrText>
+            </w:r>
+            <w:r>
+              <w:rPr>
+                <w:lang w:val="id-ID"/>
+              </w:rPr>
+              <w:fldChar w:fldCharType="separate"/>
+            </w:r>
+            <w:r>
+              <w:rPr>
+                <w:noProof/>
+                <w:lang w:val="id-ID"/>
+              </w:rPr>
+              <w:t>9,025</w:t>
+            </w:r>
+            <w:r>
+              <w:rPr>
+                <w:lang w:val="id-ID"/>
+              </w:rPr>
+              <w:fldChar w:fldCharType="end"/>
+            </w:r>
+          </w:p>
+        </w:tc>
+        <w:tc>
+          <w:tcPr>
+            <w:tcW w:w="2480" w:type="dxa"/>
+          </w:tcPr>
+          <w:p>
+            <w:pPr>
+              <w:jc w:val="center"/>
+              <w:rPr>
+                <w:lang w:val="id-ID"/>
+              </w:rPr>
+            </w:pPr>
+            <w:r>
+              <w:rPr>
+                <w:lang w:val="id-ID"/>
+              </w:rPr>
+              <w:fldChar w:fldCharType="begin"/>
+            </w:r>
+            <w:r>
+              <w:rPr>
+                <w:lang w:val="id-ID"/>
+              </w:rPr>
+              <w:instrText xml:space="preserve"> MERGEFIELD jumlah_dex </w:instrText>
+            </w:r>
+            <w:r>
+              <w:rPr>
+                <w:lang w:val="id-ID"/>
+              </w:rPr>
+              <w:fldChar w:fldCharType="separate"/>
+            </w:r>
+            <w:r>
+              <w:rPr>
+                <w:noProof/>
+                <w:lang w:val="id-ID"/>
+              </w:rPr>
+              <w:t>8,522</w:t>
+            </w:r>
+            <w:r>
+              <w:rPr>
+                <w:lang w:val="id-ID"/>
+              </w:rPr>
+              <w:fldChar w:fldCharType="end"/>
+            </w:r>
+          </w:p>
+        </w:tc>
+        <w:tc>
+          <w:tcPr>
+            <w:tcW w:w="512" w:type="dxa"/>
           </w:tcPr>
           <w:p/>
         </w:tc>
@@ -1450,7 +1956,7 @@
       <w:tr>
         <w:tc>
           <w:tcPr>
-            <w:tcW w:w="753" w:type="dxa"/>
+            <w:tcW w:w="737" w:type="dxa"/>
             <w:vMerge/>
           </w:tcPr>
           <w:p>
@@ -1461,14 +1967,14 @@
         </w:tc>
         <w:tc>
           <w:tcPr>
-            <w:tcW w:w="1707" w:type="dxa"/>
+            <w:tcW w:w="1362" w:type="dxa"/>
             <w:vMerge/>
           </w:tcPr>
           <w:p/>
         </w:tc>
         <w:tc>
           <w:tcPr>
-            <w:tcW w:w="2935" w:type="dxa"/>
+            <w:tcW w:w="2174" w:type="dxa"/>
           </w:tcPr>
           <w:p>
             <w:pPr>
@@ -1483,33 +1989,95 @@
         </w:tc>
         <w:tc>
           <w:tcPr>
-            <w:tcW w:w="1644" w:type="dxa"/>
-          </w:tcPr>
-          <w:p>
-            <w:pPr>
-              <w:jc w:val="center"/>
-              <w:rPr>
-                <w:lang w:val="id-ID"/>
-              </w:rPr>
-            </w:pPr>
-          </w:p>
-        </w:tc>
-        <w:tc>
-          <w:tcPr>
-            <w:tcW w:w="1716" w:type="dxa"/>
-          </w:tcPr>
-          <w:p>
-            <w:pPr>
-              <w:jc w:val="center"/>
-              <w:rPr>
-                <w:lang w:val="id-ID"/>
-              </w:rPr>
-            </w:pPr>
-          </w:p>
-        </w:tc>
-        <w:tc>
-          <w:tcPr>
-            <w:tcW w:w="880" w:type="dxa"/>
+            <w:tcW w:w="3031" w:type="dxa"/>
+          </w:tcPr>
+          <w:p>
+            <w:pPr>
+              <w:jc w:val="center"/>
+              <w:rPr>
+                <w:lang w:val="id-ID"/>
+              </w:rPr>
+            </w:pPr>
+            <w:r>
+              <w:rPr>
+                <w:lang w:val="id-ID"/>
+              </w:rPr>
+              <w:fldChar w:fldCharType="begin"/>
+            </w:r>
+            <w:r>
+              <w:rPr>
+                <w:lang w:val="id-ID"/>
+              </w:rPr>
+              <w:instrText xml:space="preserve"> MERGEFIELD pengeluaran_pertamax </w:instrText>
+            </w:r>
+            <w:r>
+              <w:rPr>
+                <w:lang w:val="id-ID"/>
+              </w:rPr>
+              <w:fldChar w:fldCharType="separate"/>
+            </w:r>
+            <w:r>
+              <w:rPr>
+                <w:noProof/>
+                <w:lang w:val="id-ID"/>
+              </w:rPr>
+              <w:t>3,060</w:t>
+            </w:r>
+            <w:r>
+              <w:rPr>
+                <w:lang w:val="id-ID"/>
+              </w:rPr>
+              <w:fldChar w:fldCharType="end"/>
+            </w:r>
+          </w:p>
+        </w:tc>
+        <w:tc>
+          <w:tcPr>
+            <w:tcW w:w="2480" w:type="dxa"/>
+          </w:tcPr>
+          <w:p>
+            <w:pPr>
+              <w:jc w:val="center"/>
+              <w:rPr>
+                <w:lang w:val="id-ID"/>
+              </w:rPr>
+            </w:pPr>
+            <w:r>
+              <w:rPr>
+                <w:lang w:val="id-ID"/>
+              </w:rPr>
+              <w:fldChar w:fldCharType="begin"/>
+            </w:r>
+            <w:r>
+              <w:rPr>
+                <w:lang w:val="id-ID"/>
+              </w:rPr>
+              <w:instrText xml:space="preserve"> MERGEFIELD pengeluaran_dex </w:instrText>
+            </w:r>
+            <w:r>
+              <w:rPr>
+                <w:lang w:val="id-ID"/>
+              </w:rPr>
+              <w:fldChar w:fldCharType="separate"/>
+            </w:r>
+            <w:r>
+              <w:rPr>
+                <w:noProof/>
+                <w:lang w:val="id-ID"/>
+              </w:rPr>
+              <w:t>2,587</w:t>
+            </w:r>
+            <w:r>
+              <w:rPr>
+                <w:lang w:val="id-ID"/>
+              </w:rPr>
+              <w:fldChar w:fldCharType="end"/>
+            </w:r>
+          </w:p>
+        </w:tc>
+        <w:tc>
+          <w:tcPr>
+            <w:tcW w:w="512" w:type="dxa"/>
           </w:tcPr>
           <w:p/>
         </w:tc>
@@ -1517,7 +2085,7 @@
       <w:tr>
         <w:tc>
           <w:tcPr>
-            <w:tcW w:w="753" w:type="dxa"/>
+            <w:tcW w:w="737" w:type="dxa"/>
             <w:vMerge/>
           </w:tcPr>
           <w:p>
@@ -1528,14 +2096,14 @@
         </w:tc>
         <w:tc>
           <w:tcPr>
-            <w:tcW w:w="1707" w:type="dxa"/>
+            <w:tcW w:w="1362" w:type="dxa"/>
             <w:vMerge/>
           </w:tcPr>
           <w:p/>
         </w:tc>
         <w:tc>
           <w:tcPr>
-            <w:tcW w:w="2935" w:type="dxa"/>
+            <w:tcW w:w="2174" w:type="dxa"/>
           </w:tcPr>
           <w:p>
             <w:r>
@@ -1545,35 +2113,107 @@
         </w:tc>
         <w:tc>
           <w:tcPr>
-            <w:tcW w:w="1644" w:type="dxa"/>
-          </w:tcPr>
-          <w:p>
-            <w:pPr>
-              <w:jc w:val="center"/>
-              <w:rPr>
-                <w:b/>
-                <w:lang w:val="id-ID"/>
-              </w:rPr>
-            </w:pPr>
-          </w:p>
-        </w:tc>
-        <w:tc>
-          <w:tcPr>
-            <w:tcW w:w="1716" w:type="dxa"/>
-          </w:tcPr>
-          <w:p>
-            <w:pPr>
-              <w:jc w:val="center"/>
-              <w:rPr>
-                <w:b/>
-                <w:lang w:val="id-ID"/>
-              </w:rPr>
-            </w:pPr>
-          </w:p>
-        </w:tc>
-        <w:tc>
-          <w:tcPr>
-            <w:tcW w:w="880" w:type="dxa"/>
+            <w:tcW w:w="3031" w:type="dxa"/>
+          </w:tcPr>
+          <w:p>
+            <w:pPr>
+              <w:jc w:val="center"/>
+              <w:rPr>
+                <w:b/>
+                <w:lang w:val="id-ID"/>
+              </w:rPr>
+            </w:pPr>
+            <w:r>
+              <w:rPr>
+                <w:b/>
+                <w:lang w:val="id-ID"/>
+              </w:rPr>
+              <w:fldChar w:fldCharType="begin"/>
+            </w:r>
+            <w:r>
+              <w:rPr>
+                <w:b/>
+                <w:lang w:val="id-ID"/>
+              </w:rPr>
+              <w:instrText xml:space="preserve"> MERGEFIELD persediaan_akhir_pertamax </w:instrText>
+            </w:r>
+            <w:r>
+              <w:rPr>
+                <w:b/>
+                <w:lang w:val="id-ID"/>
+              </w:rPr>
+              <w:fldChar w:fldCharType="separate"/>
+            </w:r>
+            <w:r>
+              <w:rPr>
+                <w:b/>
+                <w:noProof/>
+                <w:lang w:val="id-ID"/>
+              </w:rPr>
+              <w:t>5,965</w:t>
+            </w:r>
+            <w:r>
+              <w:rPr>
+                <w:b/>
+                <w:lang w:val="id-ID"/>
+              </w:rPr>
+              <w:fldChar w:fldCharType="end"/>
+            </w:r>
+          </w:p>
+        </w:tc>
+        <w:tc>
+          <w:tcPr>
+            <w:tcW w:w="2480" w:type="dxa"/>
+          </w:tcPr>
+          <w:p>
+            <w:pPr>
+              <w:jc w:val="center"/>
+              <w:rPr>
+                <w:b/>
+                <w:lang w:val="id-ID"/>
+              </w:rPr>
+            </w:pPr>
+            <w:r>
+              <w:rPr>
+                <w:b/>
+                <w:lang w:val="id-ID"/>
+              </w:rPr>
+              <w:fldChar w:fldCharType="begin"/>
+            </w:r>
+            <w:r>
+              <w:rPr>
+                <w:b/>
+                <w:lang w:val="id-ID"/>
+              </w:rPr>
+              <w:instrText xml:space="preserve"> MERGEFIELD persediaan_akhir_dex </w:instrText>
+            </w:r>
+            <w:r>
+              <w:rPr>
+                <w:b/>
+                <w:lang w:val="id-ID"/>
+              </w:rPr>
+              <w:fldChar w:fldCharType="separate"/>
+            </w:r>
+            <w:r>
+              <w:rPr>
+                <w:b/>
+                <w:noProof/>
+                <w:lang w:val="id-ID"/>
+              </w:rPr>
+              <w:t>5,935</w:t>
+            </w:r>
+            <w:r>
+              <w:rPr>
+                <w:b/>
+                <w:lang w:val="id-ID"/>
+              </w:rPr>
+              <w:fldChar w:fldCharType="end"/>
+            </w:r>
+          </w:p>
+        </w:tc>
+        <w:tc>
+          <w:tcPr>
+            <w:tcW w:w="512" w:type="dxa"/>
           </w:tcPr>
           <w:p/>
         </w:tc>
@@ -1581,49 +2221,49 @@
       <w:tr>
         <w:tc>
           <w:tcPr>
-            <w:tcW w:w="753" w:type="dxa"/>
-          </w:tcPr>
-          <w:p>
-            <w:pPr>
-              <w:jc w:val="center"/>
-            </w:pPr>
-          </w:p>
-        </w:tc>
-        <w:tc>
-          <w:tcPr>
-            <w:tcW w:w="1707" w:type="dxa"/>
-          </w:tcPr>
-          <w:p/>
-        </w:tc>
-        <w:tc>
-          <w:tcPr>
-            <w:tcW w:w="2935" w:type="dxa"/>
-          </w:tcPr>
-          <w:p/>
-        </w:tc>
-        <w:tc>
-          <w:tcPr>
-            <w:tcW w:w="1644" w:type="dxa"/>
-          </w:tcPr>
-          <w:p>
-            <w:pPr>
-              <w:jc w:val="center"/>
-            </w:pPr>
-          </w:p>
-        </w:tc>
-        <w:tc>
-          <w:tcPr>
-            <w:tcW w:w="1716" w:type="dxa"/>
-          </w:tcPr>
-          <w:p>
-            <w:pPr>
-              <w:jc w:val="center"/>
-            </w:pPr>
-          </w:p>
-        </w:tc>
-        <w:tc>
-          <w:tcPr>
-            <w:tcW w:w="880" w:type="dxa"/>
+            <w:tcW w:w="737" w:type="dxa"/>
+          </w:tcPr>
+          <w:p>
+            <w:pPr>
+              <w:jc w:val="center"/>
+            </w:pPr>
+          </w:p>
+        </w:tc>
+        <w:tc>
+          <w:tcPr>
+            <w:tcW w:w="1362" w:type="dxa"/>
+          </w:tcPr>
+          <w:p/>
+        </w:tc>
+        <w:tc>
+          <w:tcPr>
+            <w:tcW w:w="2174" w:type="dxa"/>
+          </w:tcPr>
+          <w:p/>
+        </w:tc>
+        <w:tc>
+          <w:tcPr>
+            <w:tcW w:w="3031" w:type="dxa"/>
+          </w:tcPr>
+          <w:p>
+            <w:pPr>
+              <w:jc w:val="center"/>
+            </w:pPr>
+          </w:p>
+        </w:tc>
+        <w:tc>
+          <w:tcPr>
+            <w:tcW w:w="2480" w:type="dxa"/>
+          </w:tcPr>
+          <w:p>
+            <w:pPr>
+              <w:jc w:val="center"/>
+            </w:pPr>
+          </w:p>
+        </w:tc>
+        <w:tc>
+          <w:tcPr>
+            <w:tcW w:w="512" w:type="dxa"/>
           </w:tcPr>
           <w:p/>
         </w:tc>
@@ -1631,7 +2271,7 @@
       <w:tr>
         <w:tc>
           <w:tcPr>
-            <w:tcW w:w="753" w:type="dxa"/>
+            <w:tcW w:w="737" w:type="dxa"/>
             <w:vMerge w:val="restart"/>
             <w:vAlign w:val="center"/>
           </w:tcPr>
@@ -1651,7 +2291,7 @@
         </w:tc>
         <w:tc>
           <w:tcPr>
-            <w:tcW w:w="1707" w:type="dxa"/>
+            <w:tcW w:w="1362" w:type="dxa"/>
             <w:vMerge w:val="restart"/>
             <w:vAlign w:val="center"/>
           </w:tcPr>
@@ -1668,7 +2308,7 @@
         </w:tc>
         <w:tc>
           <w:tcPr>
-            <w:tcW w:w="2935" w:type="dxa"/>
+            <w:tcW w:w="2174" w:type="dxa"/>
           </w:tcPr>
           <w:p>
             <w:pPr>
@@ -1686,33 +2326,95 @@
         </w:tc>
         <w:tc>
           <w:tcPr>
-            <w:tcW w:w="1644" w:type="dxa"/>
-          </w:tcPr>
-          <w:p>
-            <w:pPr>
-              <w:jc w:val="center"/>
-              <w:rPr>
-                <w:lang w:val="id-ID"/>
-              </w:rPr>
-            </w:pPr>
-          </w:p>
-        </w:tc>
-        <w:tc>
-          <w:tcPr>
-            <w:tcW w:w="1716" w:type="dxa"/>
-          </w:tcPr>
-          <w:p>
-            <w:pPr>
-              <w:jc w:val="center"/>
-              <w:rPr>
-                <w:lang w:val="id-ID"/>
-              </w:rPr>
-            </w:pPr>
-          </w:p>
-        </w:tc>
-        <w:tc>
-          <w:tcPr>
-            <w:tcW w:w="880" w:type="dxa"/>
+            <w:tcW w:w="3031" w:type="dxa"/>
+          </w:tcPr>
+          <w:p>
+            <w:pPr>
+              <w:jc w:val="center"/>
+              <w:rPr>
+                <w:lang w:val="id-ID"/>
+              </w:rPr>
+            </w:pPr>
+            <w:r>
+              <w:rPr>
+                <w:lang w:val="id-ID"/>
+              </w:rPr>
+              <w:fldChar w:fldCharType="begin"/>
+            </w:r>
+            <w:r>
+              <w:rPr>
+                <w:lang w:val="id-ID"/>
+              </w:rPr>
+              <w:instrText xml:space="preserve"> MERGEFIELD persediaan_awal_pertamax </w:instrText>
+            </w:r>
+            <w:r>
+              <w:rPr>
+                <w:lang w:val="id-ID"/>
+              </w:rPr>
+              <w:fldChar w:fldCharType="separate"/>
+            </w:r>
+            <w:r>
+              <w:rPr>
+                <w:noProof/>
+                <w:lang w:val="id-ID"/>
+              </w:rPr>
+              <w:t>1,025</w:t>
+            </w:r>
+            <w:r>
+              <w:rPr>
+                <w:lang w:val="id-ID"/>
+              </w:rPr>
+              <w:fldChar w:fldCharType="end"/>
+            </w:r>
+          </w:p>
+        </w:tc>
+        <w:tc>
+          <w:tcPr>
+            <w:tcW w:w="2480" w:type="dxa"/>
+          </w:tcPr>
+          <w:p>
+            <w:pPr>
+              <w:jc w:val="center"/>
+              <w:rPr>
+                <w:lang w:val="id-ID"/>
+              </w:rPr>
+            </w:pPr>
+            <w:r>
+              <w:rPr>
+                <w:lang w:val="id-ID"/>
+              </w:rPr>
+              <w:fldChar w:fldCharType="begin"/>
+            </w:r>
+            <w:r>
+              <w:rPr>
+                <w:lang w:val="id-ID"/>
+              </w:rPr>
+              <w:instrText xml:space="preserve"> MERGEFIELD persediaan_awal_dex </w:instrText>
+            </w:r>
+            <w:r>
+              <w:rPr>
+                <w:lang w:val="id-ID"/>
+              </w:rPr>
+              <w:fldChar w:fldCharType="separate"/>
+            </w:r>
+            <w:r>
+              <w:rPr>
+                <w:noProof/>
+                <w:lang w:val="id-ID"/>
+              </w:rPr>
+              <w:t>522</w:t>
+            </w:r>
+            <w:r>
+              <w:rPr>
+                <w:lang w:val="id-ID"/>
+              </w:rPr>
+              <w:fldChar w:fldCharType="end"/>
+            </w:r>
+          </w:p>
+        </w:tc>
+        <w:tc>
+          <w:tcPr>
+            <w:tcW w:w="512" w:type="dxa"/>
           </w:tcPr>
           <w:p/>
         </w:tc>
@@ -1720,7 +2422,7 @@
       <w:tr>
         <w:tc>
           <w:tcPr>
-            <w:tcW w:w="753" w:type="dxa"/>
+            <w:tcW w:w="737" w:type="dxa"/>
             <w:vMerge/>
           </w:tcPr>
           <w:p>
@@ -1731,7 +2433,7 @@
         </w:tc>
         <w:tc>
           <w:tcPr>
-            <w:tcW w:w="1707" w:type="dxa"/>
+            <w:tcW w:w="1362" w:type="dxa"/>
             <w:vMerge/>
           </w:tcPr>
           <w:p>
@@ -1742,7 +2444,7 @@
         </w:tc>
         <w:tc>
           <w:tcPr>
-            <w:tcW w:w="2935" w:type="dxa"/>
+            <w:tcW w:w="2174" w:type="dxa"/>
           </w:tcPr>
           <w:p>
             <w:r>
@@ -1752,33 +2454,95 @@
         </w:tc>
         <w:tc>
           <w:tcPr>
-            <w:tcW w:w="1644" w:type="dxa"/>
-          </w:tcPr>
-          <w:p>
-            <w:pPr>
-              <w:jc w:val="center"/>
-              <w:rPr>
-                <w:lang w:val="id-ID"/>
-              </w:rPr>
-            </w:pPr>
-          </w:p>
-        </w:tc>
-        <w:tc>
-          <w:tcPr>
-            <w:tcW w:w="1716" w:type="dxa"/>
-          </w:tcPr>
-          <w:p>
-            <w:pPr>
-              <w:jc w:val="center"/>
-              <w:rPr>
-                <w:lang w:val="id-ID"/>
-              </w:rPr>
-            </w:pPr>
-          </w:p>
-        </w:tc>
-        <w:tc>
-          <w:tcPr>
-            <w:tcW w:w="880" w:type="dxa"/>
+            <w:tcW w:w="3031" w:type="dxa"/>
+          </w:tcPr>
+          <w:p>
+            <w:pPr>
+              <w:jc w:val="center"/>
+              <w:rPr>
+                <w:lang w:val="id-ID"/>
+              </w:rPr>
+            </w:pPr>
+            <w:r>
+              <w:rPr>
+                <w:lang w:val="id-ID"/>
+              </w:rPr>
+              <w:fldChar w:fldCharType="begin"/>
+            </w:r>
+            <w:r>
+              <w:rPr>
+                <w:lang w:val="id-ID"/>
+              </w:rPr>
+              <w:instrText xml:space="preserve"> MERGEFIELD penerimaan_pertamax </w:instrText>
+            </w:r>
+            <w:r>
+              <w:rPr>
+                <w:lang w:val="id-ID"/>
+              </w:rPr>
+              <w:fldChar w:fldCharType="separate"/>
+            </w:r>
+            <w:r>
+              <w:rPr>
+                <w:noProof/>
+                <w:lang w:val="id-ID"/>
+              </w:rPr>
+              <w:t>8,000</w:t>
+            </w:r>
+            <w:r>
+              <w:rPr>
+                <w:lang w:val="id-ID"/>
+              </w:rPr>
+              <w:fldChar w:fldCharType="end"/>
+            </w:r>
+          </w:p>
+        </w:tc>
+        <w:tc>
+          <w:tcPr>
+            <w:tcW w:w="2480" w:type="dxa"/>
+          </w:tcPr>
+          <w:p>
+            <w:pPr>
+              <w:jc w:val="center"/>
+              <w:rPr>
+                <w:lang w:val="id-ID"/>
+              </w:rPr>
+            </w:pPr>
+            <w:r>
+              <w:rPr>
+                <w:lang w:val="id-ID"/>
+              </w:rPr>
+              <w:fldChar w:fldCharType="begin"/>
+            </w:r>
+            <w:r>
+              <w:rPr>
+                <w:lang w:val="id-ID"/>
+              </w:rPr>
+              <w:instrText xml:space="preserve"> MERGEFIELD penerimaan_dex </w:instrText>
+            </w:r>
+            <w:r>
+              <w:rPr>
+                <w:lang w:val="id-ID"/>
+              </w:rPr>
+              <w:fldChar w:fldCharType="separate"/>
+            </w:r>
+            <w:r>
+              <w:rPr>
+                <w:noProof/>
+                <w:lang w:val="id-ID"/>
+              </w:rPr>
+              <w:t>8,000</w:t>
+            </w:r>
+            <w:r>
+              <w:rPr>
+                <w:lang w:val="id-ID"/>
+              </w:rPr>
+              <w:fldChar w:fldCharType="end"/>
+            </w:r>
+          </w:p>
+        </w:tc>
+        <w:tc>
+          <w:tcPr>
+            <w:tcW w:w="512" w:type="dxa"/>
           </w:tcPr>
           <w:p/>
         </w:tc>
@@ -1786,7 +2550,7 @@
       <w:tr>
         <w:tc>
           <w:tcPr>
-            <w:tcW w:w="753" w:type="dxa"/>
+            <w:tcW w:w="737" w:type="dxa"/>
             <w:vMerge/>
           </w:tcPr>
           <w:p>
@@ -1797,14 +2561,14 @@
         </w:tc>
         <w:tc>
           <w:tcPr>
-            <w:tcW w:w="1707" w:type="dxa"/>
+            <w:tcW w:w="1362" w:type="dxa"/>
             <w:vMerge/>
           </w:tcPr>
           <w:p/>
         </w:tc>
         <w:tc>
           <w:tcPr>
-            <w:tcW w:w="2935" w:type="dxa"/>
+            <w:tcW w:w="2174" w:type="dxa"/>
           </w:tcPr>
           <w:p>
             <w:r>
@@ -1814,33 +2578,95 @@
         </w:tc>
         <w:tc>
           <w:tcPr>
-            <w:tcW w:w="1644" w:type="dxa"/>
-          </w:tcPr>
-          <w:p>
-            <w:pPr>
-              <w:jc w:val="center"/>
-              <w:rPr>
-                <w:lang w:val="id-ID"/>
-              </w:rPr>
-            </w:pPr>
-          </w:p>
-        </w:tc>
-        <w:tc>
-          <w:tcPr>
-            <w:tcW w:w="1716" w:type="dxa"/>
-          </w:tcPr>
-          <w:p>
-            <w:pPr>
-              <w:jc w:val="center"/>
-              <w:rPr>
-                <w:lang w:val="id-ID"/>
-              </w:rPr>
-            </w:pPr>
-          </w:p>
-        </w:tc>
-        <w:tc>
-          <w:tcPr>
-            <w:tcW w:w="880" w:type="dxa"/>
+            <w:tcW w:w="3031" w:type="dxa"/>
+          </w:tcPr>
+          <w:p>
+            <w:pPr>
+              <w:jc w:val="center"/>
+              <w:rPr>
+                <w:lang w:val="id-ID"/>
+              </w:rPr>
+            </w:pPr>
+            <w:r>
+              <w:rPr>
+                <w:lang w:val="id-ID"/>
+              </w:rPr>
+              <w:fldChar w:fldCharType="begin"/>
+            </w:r>
+            <w:r>
+              <w:rPr>
+                <w:lang w:val="id-ID"/>
+              </w:rPr>
+              <w:instrText xml:space="preserve"> MERGEFIELD jumlah_pertamax </w:instrText>
+            </w:r>
+            <w:r>
+              <w:rPr>
+                <w:lang w:val="id-ID"/>
+              </w:rPr>
+              <w:fldChar w:fldCharType="separate"/>
+            </w:r>
+            <w:r>
+              <w:rPr>
+                <w:noProof/>
+                <w:lang w:val="id-ID"/>
+              </w:rPr>
+              <w:t>9,025</w:t>
+            </w:r>
+            <w:r>
+              <w:rPr>
+                <w:lang w:val="id-ID"/>
+              </w:rPr>
+              <w:fldChar w:fldCharType="end"/>
+            </w:r>
+          </w:p>
+        </w:tc>
+        <w:tc>
+          <w:tcPr>
+            <w:tcW w:w="2480" w:type="dxa"/>
+          </w:tcPr>
+          <w:p>
+            <w:pPr>
+              <w:jc w:val="center"/>
+              <w:rPr>
+                <w:lang w:val="id-ID"/>
+              </w:rPr>
+            </w:pPr>
+            <w:r>
+              <w:rPr>
+                <w:lang w:val="id-ID"/>
+              </w:rPr>
+              <w:fldChar w:fldCharType="begin"/>
+            </w:r>
+            <w:r>
+              <w:rPr>
+                <w:lang w:val="id-ID"/>
+              </w:rPr>
+              <w:instrText xml:space="preserve"> MERGEFIELD jumlah_dex </w:instrText>
+            </w:r>
+            <w:r>
+              <w:rPr>
+                <w:lang w:val="id-ID"/>
+              </w:rPr>
+              <w:fldChar w:fldCharType="separate"/>
+            </w:r>
+            <w:r>
+              <w:rPr>
+                <w:noProof/>
+                <w:lang w:val="id-ID"/>
+              </w:rPr>
+              <w:t>8,522</w:t>
+            </w:r>
+            <w:r>
+              <w:rPr>
+                <w:lang w:val="id-ID"/>
+              </w:rPr>
+              <w:fldChar w:fldCharType="end"/>
+            </w:r>
+          </w:p>
+        </w:tc>
+        <w:tc>
+          <w:tcPr>
+            <w:tcW w:w="512" w:type="dxa"/>
           </w:tcPr>
           <w:p/>
         </w:tc>
@@ -1848,7 +2674,7 @@
       <w:tr>
         <w:tc>
           <w:tcPr>
-            <w:tcW w:w="753" w:type="dxa"/>
+            <w:tcW w:w="737" w:type="dxa"/>
             <w:vMerge/>
           </w:tcPr>
           <w:p>
@@ -1859,14 +2685,14 @@
         </w:tc>
         <w:tc>
           <w:tcPr>
-            <w:tcW w:w="1707" w:type="dxa"/>
+            <w:tcW w:w="1362" w:type="dxa"/>
             <w:vMerge/>
           </w:tcPr>
           <w:p/>
         </w:tc>
         <w:tc>
           <w:tcPr>
-            <w:tcW w:w="2935" w:type="dxa"/>
+            <w:tcW w:w="2174" w:type="dxa"/>
           </w:tcPr>
           <w:p>
             <w:r>
@@ -1876,33 +2702,95 @@
         </w:tc>
         <w:tc>
           <w:tcPr>
-            <w:tcW w:w="1644" w:type="dxa"/>
-          </w:tcPr>
-          <w:p>
-            <w:pPr>
-              <w:jc w:val="center"/>
-              <w:rPr>
-                <w:lang w:val="id-ID"/>
-              </w:rPr>
-            </w:pPr>
-          </w:p>
-        </w:tc>
-        <w:tc>
-          <w:tcPr>
-            <w:tcW w:w="1716" w:type="dxa"/>
-          </w:tcPr>
-          <w:p>
-            <w:pPr>
-              <w:jc w:val="center"/>
-              <w:rPr>
-                <w:lang w:val="id-ID"/>
-              </w:rPr>
-            </w:pPr>
-          </w:p>
-        </w:tc>
-        <w:tc>
-          <w:tcPr>
-            <w:tcW w:w="880" w:type="dxa"/>
+            <w:tcW w:w="3031" w:type="dxa"/>
+          </w:tcPr>
+          <w:p>
+            <w:pPr>
+              <w:jc w:val="center"/>
+              <w:rPr>
+                <w:lang w:val="id-ID"/>
+              </w:rPr>
+            </w:pPr>
+            <w:r>
+              <w:rPr>
+                <w:lang w:val="id-ID"/>
+              </w:rPr>
+              <w:fldChar w:fldCharType="begin"/>
+            </w:r>
+            <w:r>
+              <w:rPr>
+                <w:lang w:val="id-ID"/>
+              </w:rPr>
+              <w:instrText xml:space="preserve"> MERGEFIELD pengeluaran_pertamax </w:instrText>
+            </w:r>
+            <w:r>
+              <w:rPr>
+                <w:lang w:val="id-ID"/>
+              </w:rPr>
+              <w:fldChar w:fldCharType="separate"/>
+            </w:r>
+            <w:r>
+              <w:rPr>
+                <w:noProof/>
+                <w:lang w:val="id-ID"/>
+              </w:rPr>
+              <w:t>3,060</w:t>
+            </w:r>
+            <w:r>
+              <w:rPr>
+                <w:lang w:val="id-ID"/>
+              </w:rPr>
+              <w:fldChar w:fldCharType="end"/>
+            </w:r>
+          </w:p>
+        </w:tc>
+        <w:tc>
+          <w:tcPr>
+            <w:tcW w:w="2480" w:type="dxa"/>
+          </w:tcPr>
+          <w:p>
+            <w:pPr>
+              <w:jc w:val="center"/>
+              <w:rPr>
+                <w:lang w:val="id-ID"/>
+              </w:rPr>
+            </w:pPr>
+            <w:r>
+              <w:rPr>
+                <w:lang w:val="id-ID"/>
+              </w:rPr>
+              <w:fldChar w:fldCharType="begin"/>
+            </w:r>
+            <w:r>
+              <w:rPr>
+                <w:lang w:val="id-ID"/>
+              </w:rPr>
+              <w:instrText xml:space="preserve"> MERGEFIELD pengeluaran_dex </w:instrText>
+            </w:r>
+            <w:r>
+              <w:rPr>
+                <w:lang w:val="id-ID"/>
+              </w:rPr>
+              <w:fldChar w:fldCharType="separate"/>
+            </w:r>
+            <w:r>
+              <w:rPr>
+                <w:noProof/>
+                <w:lang w:val="id-ID"/>
+              </w:rPr>
+              <w:t>2,587</w:t>
+            </w:r>
+            <w:r>
+              <w:rPr>
+                <w:lang w:val="id-ID"/>
+              </w:rPr>
+              <w:fldChar w:fldCharType="end"/>
+            </w:r>
+          </w:p>
+        </w:tc>
+        <w:tc>
+          <w:tcPr>
+            <w:tcW w:w="512" w:type="dxa"/>
           </w:tcPr>
           <w:p/>
         </w:tc>
@@ -1910,7 +2798,7 @@
       <w:tr>
         <w:tc>
           <w:tcPr>
-            <w:tcW w:w="753" w:type="dxa"/>
+            <w:tcW w:w="737" w:type="dxa"/>
             <w:vMerge/>
           </w:tcPr>
           <w:p>
@@ -1921,14 +2809,14 @@
         </w:tc>
         <w:tc>
           <w:tcPr>
-            <w:tcW w:w="1707" w:type="dxa"/>
+            <w:tcW w:w="1362" w:type="dxa"/>
             <w:vMerge/>
           </w:tcPr>
           <w:p/>
         </w:tc>
         <w:tc>
           <w:tcPr>
-            <w:tcW w:w="2935" w:type="dxa"/>
+            <w:tcW w:w="2174" w:type="dxa"/>
           </w:tcPr>
           <w:p>
             <w:r>
@@ -1938,35 +2826,107 @@
         </w:tc>
         <w:tc>
           <w:tcPr>
-            <w:tcW w:w="1644" w:type="dxa"/>
-          </w:tcPr>
-          <w:p>
-            <w:pPr>
-              <w:jc w:val="center"/>
-              <w:rPr>
-                <w:b/>
-                <w:lang w:val="id-ID"/>
-              </w:rPr>
-            </w:pPr>
-          </w:p>
-        </w:tc>
-        <w:tc>
-          <w:tcPr>
-            <w:tcW w:w="1716" w:type="dxa"/>
-          </w:tcPr>
-          <w:p>
-            <w:pPr>
-              <w:jc w:val="center"/>
-              <w:rPr>
-                <w:b/>
-                <w:lang w:val="id-ID"/>
-              </w:rPr>
-            </w:pPr>
-          </w:p>
-        </w:tc>
-        <w:tc>
-          <w:tcPr>
-            <w:tcW w:w="880" w:type="dxa"/>
+            <w:tcW w:w="3031" w:type="dxa"/>
+          </w:tcPr>
+          <w:p>
+            <w:pPr>
+              <w:jc w:val="center"/>
+              <w:rPr>
+                <w:b/>
+                <w:lang w:val="id-ID"/>
+              </w:rPr>
+            </w:pPr>
+            <w:r>
+              <w:rPr>
+                <w:b/>
+                <w:lang w:val="id-ID"/>
+              </w:rPr>
+              <w:fldChar w:fldCharType="begin"/>
+            </w:r>
+            <w:r>
+              <w:rPr>
+                <w:b/>
+                <w:lang w:val="id-ID"/>
+              </w:rPr>
+              <w:instrText xml:space="preserve"> MERGEFIELD persediaan_akhir_pertamax </w:instrText>
+            </w:r>
+            <w:r>
+              <w:rPr>
+                <w:b/>
+                <w:lang w:val="id-ID"/>
+              </w:rPr>
+              <w:fldChar w:fldCharType="separate"/>
+            </w:r>
+            <w:r>
+              <w:rPr>
+                <w:b/>
+                <w:noProof/>
+                <w:lang w:val="id-ID"/>
+              </w:rPr>
+              <w:t>5,965</w:t>
+            </w:r>
+            <w:r>
+              <w:rPr>
+                <w:b/>
+                <w:lang w:val="id-ID"/>
+              </w:rPr>
+              <w:fldChar w:fldCharType="end"/>
+            </w:r>
+          </w:p>
+        </w:tc>
+        <w:tc>
+          <w:tcPr>
+            <w:tcW w:w="2480" w:type="dxa"/>
+          </w:tcPr>
+          <w:p>
+            <w:pPr>
+              <w:jc w:val="center"/>
+              <w:rPr>
+                <w:b/>
+                <w:lang w:val="id-ID"/>
+              </w:rPr>
+            </w:pPr>
+            <w:r>
+              <w:rPr>
+                <w:b/>
+                <w:lang w:val="id-ID"/>
+              </w:rPr>
+              <w:fldChar w:fldCharType="begin"/>
+            </w:r>
+            <w:r>
+              <w:rPr>
+                <w:b/>
+                <w:lang w:val="id-ID"/>
+              </w:rPr>
+              <w:instrText xml:space="preserve"> MERGEFIELD persediaan_akhir_dex </w:instrText>
+            </w:r>
+            <w:r>
+              <w:rPr>
+                <w:b/>
+                <w:lang w:val="id-ID"/>
+              </w:rPr>
+              <w:fldChar w:fldCharType="separate"/>
+            </w:r>
+            <w:r>
+              <w:rPr>
+                <w:b/>
+                <w:noProof/>
+                <w:lang w:val="id-ID"/>
+              </w:rPr>
+              <w:t>5,935</w:t>
+            </w:r>
+            <w:r>
+              <w:rPr>
+                <w:b/>
+                <w:lang w:val="id-ID"/>
+              </w:rPr>
+              <w:fldChar w:fldCharType="end"/>
+            </w:r>
+          </w:p>
+        </w:tc>
+        <w:tc>
+          <w:tcPr>
+            <w:tcW w:w="512" w:type="dxa"/>
           </w:tcPr>
           <w:p/>
         </w:tc>
@@ -1974,49 +2934,49 @@
       <w:tr>
         <w:tc>
           <w:tcPr>
-            <w:tcW w:w="753" w:type="dxa"/>
-          </w:tcPr>
-          <w:p>
-            <w:pPr>
-              <w:jc w:val="center"/>
-            </w:pPr>
-          </w:p>
-        </w:tc>
-        <w:tc>
-          <w:tcPr>
-            <w:tcW w:w="1707" w:type="dxa"/>
-          </w:tcPr>
-          <w:p/>
-        </w:tc>
-        <w:tc>
-          <w:tcPr>
-            <w:tcW w:w="2935" w:type="dxa"/>
-          </w:tcPr>
-          <w:p/>
-        </w:tc>
-        <w:tc>
-          <w:tcPr>
-            <w:tcW w:w="1644" w:type="dxa"/>
-          </w:tcPr>
-          <w:p>
-            <w:pPr>
-              <w:jc w:val="center"/>
-            </w:pPr>
-          </w:p>
-        </w:tc>
-        <w:tc>
-          <w:tcPr>
-            <w:tcW w:w="1716" w:type="dxa"/>
-          </w:tcPr>
-          <w:p>
-            <w:pPr>
-              <w:jc w:val="center"/>
-            </w:pPr>
-          </w:p>
-        </w:tc>
-        <w:tc>
-          <w:tcPr>
-            <w:tcW w:w="880" w:type="dxa"/>
+            <w:tcW w:w="737" w:type="dxa"/>
+          </w:tcPr>
+          <w:p>
+            <w:pPr>
+              <w:jc w:val="center"/>
+            </w:pPr>
+          </w:p>
+        </w:tc>
+        <w:tc>
+          <w:tcPr>
+            <w:tcW w:w="1362" w:type="dxa"/>
+          </w:tcPr>
+          <w:p/>
+        </w:tc>
+        <w:tc>
+          <w:tcPr>
+            <w:tcW w:w="2174" w:type="dxa"/>
+          </w:tcPr>
+          <w:p/>
+        </w:tc>
+        <w:tc>
+          <w:tcPr>
+            <w:tcW w:w="3031" w:type="dxa"/>
+          </w:tcPr>
+          <w:p>
+            <w:pPr>
+              <w:jc w:val="center"/>
+            </w:pPr>
+          </w:p>
+        </w:tc>
+        <w:tc>
+          <w:tcPr>
+            <w:tcW w:w="2480" w:type="dxa"/>
+          </w:tcPr>
+          <w:p>
+            <w:pPr>
+              <w:jc w:val="center"/>
+            </w:pPr>
+          </w:p>
+        </w:tc>
+        <w:tc>
+          <w:tcPr>
+            <w:tcW w:w="512" w:type="dxa"/>
           </w:tcPr>
           <w:p/>
         </w:tc>
@@ -2024,7 +2984,7 @@
       <w:tr>
         <w:tc>
           <w:tcPr>
-            <w:tcW w:w="753" w:type="dxa"/>
+            <w:tcW w:w="737" w:type="dxa"/>
             <w:vMerge w:val="restart"/>
           </w:tcPr>
           <w:p>
@@ -2043,7 +3003,7 @@
         </w:tc>
         <w:tc>
           <w:tcPr>
-            <w:tcW w:w="1707" w:type="dxa"/>
+            <w:tcW w:w="1362" w:type="dxa"/>
             <w:vMerge w:val="restart"/>
           </w:tcPr>
           <w:p/>
@@ -2055,7 +3015,7 @@
         </w:tc>
         <w:tc>
           <w:tcPr>
-            <w:tcW w:w="2935" w:type="dxa"/>
+            <w:tcW w:w="2174" w:type="dxa"/>
           </w:tcPr>
           <w:p>
             <w:r>
@@ -2065,33 +3025,95 @@
         </w:tc>
         <w:tc>
           <w:tcPr>
-            <w:tcW w:w="1644" w:type="dxa"/>
-          </w:tcPr>
-          <w:p>
-            <w:pPr>
-              <w:jc w:val="center"/>
-              <w:rPr>
-                <w:lang w:val="id-ID"/>
-              </w:rPr>
-            </w:pPr>
-          </w:p>
-        </w:tc>
-        <w:tc>
-          <w:tcPr>
-            <w:tcW w:w="1716" w:type="dxa"/>
-          </w:tcPr>
-          <w:p>
-            <w:pPr>
-              <w:jc w:val="center"/>
-              <w:rPr>
-                <w:lang w:val="id-ID"/>
-              </w:rPr>
-            </w:pPr>
-          </w:p>
-        </w:tc>
-        <w:tc>
-          <w:tcPr>
-            <w:tcW w:w="880" w:type="dxa"/>
+            <w:tcW w:w="3031" w:type="dxa"/>
+          </w:tcPr>
+          <w:p>
+            <w:pPr>
+              <w:jc w:val="center"/>
+              <w:rPr>
+                <w:lang w:val="id-ID"/>
+              </w:rPr>
+            </w:pPr>
+            <w:r>
+              <w:rPr>
+                <w:lang w:val="id-ID"/>
+              </w:rPr>
+              <w:fldChar w:fldCharType="begin"/>
+            </w:r>
+            <w:r>
+              <w:rPr>
+                <w:lang w:val="id-ID"/>
+              </w:rPr>
+              <w:instrText xml:space="preserve"> MERGEFIELD jumlah_pertamax </w:instrText>
+            </w:r>
+            <w:r>
+              <w:rPr>
+                <w:lang w:val="id-ID"/>
+              </w:rPr>
+              <w:fldChar w:fldCharType="separate"/>
+            </w:r>
+            <w:r>
+              <w:rPr>
+                <w:noProof/>
+                <w:lang w:val="id-ID"/>
+              </w:rPr>
+              <w:t>9,025</w:t>
+            </w:r>
+            <w:r>
+              <w:rPr>
+                <w:lang w:val="id-ID"/>
+              </w:rPr>
+              <w:fldChar w:fldCharType="end"/>
+            </w:r>
+          </w:p>
+        </w:tc>
+        <w:tc>
+          <w:tcPr>
+            <w:tcW w:w="2480" w:type="dxa"/>
+          </w:tcPr>
+          <w:p>
+            <w:pPr>
+              <w:jc w:val="center"/>
+              <w:rPr>
+                <w:lang w:val="id-ID"/>
+              </w:rPr>
+            </w:pPr>
+            <w:r>
+              <w:rPr>
+                <w:lang w:val="id-ID"/>
+              </w:rPr>
+              <w:fldChar w:fldCharType="begin"/>
+            </w:r>
+            <w:r>
+              <w:rPr>
+                <w:lang w:val="id-ID"/>
+              </w:rPr>
+              <w:instrText xml:space="preserve"> MERGEFIELD jumlah_dex </w:instrText>
+            </w:r>
+            <w:r>
+              <w:rPr>
+                <w:lang w:val="id-ID"/>
+              </w:rPr>
+              <w:fldChar w:fldCharType="separate"/>
+            </w:r>
+            <w:r>
+              <w:rPr>
+                <w:noProof/>
+                <w:lang w:val="id-ID"/>
+              </w:rPr>
+              <w:t>8,522</w:t>
+            </w:r>
+            <w:r>
+              <w:rPr>
+                <w:lang w:val="id-ID"/>
+              </w:rPr>
+              <w:fldChar w:fldCharType="end"/>
+            </w:r>
+          </w:p>
+        </w:tc>
+        <w:tc>
+          <w:tcPr>
+            <w:tcW w:w="512" w:type="dxa"/>
           </w:tcPr>
           <w:p/>
         </w:tc>
@@ -2099,21 +3121,21 @@
       <w:tr>
         <w:tc>
           <w:tcPr>
-            <w:tcW w:w="753" w:type="dxa"/>
+            <w:tcW w:w="737" w:type="dxa"/>
             <w:vMerge/>
           </w:tcPr>
           <w:p/>
         </w:tc>
         <w:tc>
           <w:tcPr>
-            <w:tcW w:w="1707" w:type="dxa"/>
+            <w:tcW w:w="1362" w:type="dxa"/>
             <w:vMerge/>
           </w:tcPr>
           <w:p/>
         </w:tc>
         <w:tc>
           <w:tcPr>
-            <w:tcW w:w="2935" w:type="dxa"/>
+            <w:tcW w:w="2174" w:type="dxa"/>
           </w:tcPr>
           <w:p>
             <w:r>
@@ -2123,33 +3145,95 @@
         </w:tc>
         <w:tc>
           <w:tcPr>
-            <w:tcW w:w="1644" w:type="dxa"/>
-          </w:tcPr>
-          <w:p>
-            <w:pPr>
-              <w:jc w:val="center"/>
-              <w:rPr>
-                <w:lang w:val="id-ID"/>
-              </w:rPr>
-            </w:pPr>
-          </w:p>
-        </w:tc>
-        <w:tc>
-          <w:tcPr>
-            <w:tcW w:w="1716" w:type="dxa"/>
-          </w:tcPr>
-          <w:p>
-            <w:pPr>
-              <w:jc w:val="center"/>
-              <w:rPr>
-                <w:lang w:val="id-ID"/>
-              </w:rPr>
-            </w:pPr>
-          </w:p>
-        </w:tc>
-        <w:tc>
-          <w:tcPr>
-            <w:tcW w:w="880" w:type="dxa"/>
+            <w:tcW w:w="3031" w:type="dxa"/>
+          </w:tcPr>
+          <w:p>
+            <w:pPr>
+              <w:jc w:val="center"/>
+              <w:rPr>
+                <w:lang w:val="id-ID"/>
+              </w:rPr>
+            </w:pPr>
+            <w:r>
+              <w:rPr>
+                <w:lang w:val="id-ID"/>
+              </w:rPr>
+              <w:fldChar w:fldCharType="begin"/>
+            </w:r>
+            <w:r>
+              <w:rPr>
+                <w:lang w:val="id-ID"/>
+              </w:rPr>
+              <w:instrText xml:space="preserve"> MERGEFIELD pengeluaran_pertamax </w:instrText>
+            </w:r>
+            <w:r>
+              <w:rPr>
+                <w:lang w:val="id-ID"/>
+              </w:rPr>
+              <w:fldChar w:fldCharType="separate"/>
+            </w:r>
+            <w:r>
+              <w:rPr>
+                <w:noProof/>
+                <w:lang w:val="id-ID"/>
+              </w:rPr>
+              <w:t>3,060</w:t>
+            </w:r>
+            <w:r>
+              <w:rPr>
+                <w:lang w:val="id-ID"/>
+              </w:rPr>
+              <w:fldChar w:fldCharType="end"/>
+            </w:r>
+          </w:p>
+        </w:tc>
+        <w:tc>
+          <w:tcPr>
+            <w:tcW w:w="2480" w:type="dxa"/>
+          </w:tcPr>
+          <w:p>
+            <w:pPr>
+              <w:jc w:val="center"/>
+              <w:rPr>
+                <w:lang w:val="id-ID"/>
+              </w:rPr>
+            </w:pPr>
+            <w:r>
+              <w:rPr>
+                <w:lang w:val="id-ID"/>
+              </w:rPr>
+              <w:fldChar w:fldCharType="begin"/>
+            </w:r>
+            <w:r>
+              <w:rPr>
+                <w:lang w:val="id-ID"/>
+              </w:rPr>
+              <w:instrText xml:space="preserve"> MERGEFIELD pengeluaran_dex </w:instrText>
+            </w:r>
+            <w:r>
+              <w:rPr>
+                <w:lang w:val="id-ID"/>
+              </w:rPr>
+              <w:fldChar w:fldCharType="separate"/>
+            </w:r>
+            <w:r>
+              <w:rPr>
+                <w:noProof/>
+                <w:lang w:val="id-ID"/>
+              </w:rPr>
+              <w:t>2,587</w:t>
+            </w:r>
+            <w:r>
+              <w:rPr>
+                <w:lang w:val="id-ID"/>
+              </w:rPr>
+              <w:fldChar w:fldCharType="end"/>
+            </w:r>
+          </w:p>
+        </w:tc>
+        <w:tc>
+          <w:tcPr>
+            <w:tcW w:w="512" w:type="dxa"/>
           </w:tcPr>
           <w:p/>
         </w:tc>
@@ -2157,21 +3241,21 @@
       <w:tr>
         <w:tc>
           <w:tcPr>
-            <w:tcW w:w="753" w:type="dxa"/>
+            <w:tcW w:w="737" w:type="dxa"/>
             <w:vMerge/>
           </w:tcPr>
           <w:p/>
         </w:tc>
         <w:tc>
           <w:tcPr>
-            <w:tcW w:w="1707" w:type="dxa"/>
+            <w:tcW w:w="1362" w:type="dxa"/>
             <w:vMerge/>
           </w:tcPr>
           <w:p/>
         </w:tc>
         <w:tc>
           <w:tcPr>
-            <w:tcW w:w="2935" w:type="dxa"/>
+            <w:tcW w:w="2174" w:type="dxa"/>
           </w:tcPr>
           <w:p>
             <w:r>
@@ -2181,35 +3265,107 @@
         </w:tc>
         <w:tc>
           <w:tcPr>
-            <w:tcW w:w="1644" w:type="dxa"/>
-          </w:tcPr>
-          <w:p>
-            <w:pPr>
-              <w:jc w:val="center"/>
-              <w:rPr>
-                <w:b/>
-                <w:lang w:val="id-ID"/>
-              </w:rPr>
-            </w:pPr>
-          </w:p>
-        </w:tc>
-        <w:tc>
-          <w:tcPr>
-            <w:tcW w:w="1716" w:type="dxa"/>
-          </w:tcPr>
-          <w:p>
-            <w:pPr>
-              <w:jc w:val="center"/>
-              <w:rPr>
-                <w:b/>
-                <w:lang w:val="id-ID"/>
-              </w:rPr>
-            </w:pPr>
-          </w:p>
-        </w:tc>
-        <w:tc>
-          <w:tcPr>
-            <w:tcW w:w="880" w:type="dxa"/>
+            <w:tcW w:w="3031" w:type="dxa"/>
+          </w:tcPr>
+          <w:p>
+            <w:pPr>
+              <w:jc w:val="center"/>
+              <w:rPr>
+                <w:b/>
+                <w:lang w:val="id-ID"/>
+              </w:rPr>
+            </w:pPr>
+            <w:r>
+              <w:rPr>
+                <w:b/>
+                <w:lang w:val="id-ID"/>
+              </w:rPr>
+              <w:fldChar w:fldCharType="begin"/>
+            </w:r>
+            <w:r>
+              <w:rPr>
+                <w:b/>
+                <w:lang w:val="id-ID"/>
+              </w:rPr>
+              <w:instrText xml:space="preserve"> MERGEFIELD persediaan_akhir_pertamax </w:instrText>
+            </w:r>
+            <w:r>
+              <w:rPr>
+                <w:b/>
+                <w:lang w:val="id-ID"/>
+              </w:rPr>
+              <w:fldChar w:fldCharType="separate"/>
+            </w:r>
+            <w:r>
+              <w:rPr>
+                <w:b/>
+                <w:noProof/>
+                <w:lang w:val="id-ID"/>
+              </w:rPr>
+              <w:t>5,965</w:t>
+            </w:r>
+            <w:r>
+              <w:rPr>
+                <w:b/>
+                <w:lang w:val="id-ID"/>
+              </w:rPr>
+              <w:fldChar w:fldCharType="end"/>
+            </w:r>
+          </w:p>
+        </w:tc>
+        <w:tc>
+          <w:tcPr>
+            <w:tcW w:w="2480" w:type="dxa"/>
+          </w:tcPr>
+          <w:p>
+            <w:pPr>
+              <w:jc w:val="center"/>
+              <w:rPr>
+                <w:b/>
+                <w:lang w:val="id-ID"/>
+              </w:rPr>
+            </w:pPr>
+            <w:r>
+              <w:rPr>
+                <w:b/>
+                <w:lang w:val="id-ID"/>
+              </w:rPr>
+              <w:fldChar w:fldCharType="begin"/>
+            </w:r>
+            <w:r>
+              <w:rPr>
+                <w:b/>
+                <w:lang w:val="id-ID"/>
+              </w:rPr>
+              <w:instrText xml:space="preserve"> MERGEFIELD persediaan_akhir_dex </w:instrText>
+            </w:r>
+            <w:r>
+              <w:rPr>
+                <w:b/>
+                <w:lang w:val="id-ID"/>
+              </w:rPr>
+              <w:fldChar w:fldCharType="separate"/>
+            </w:r>
+            <w:r>
+              <w:rPr>
+                <w:b/>
+                <w:noProof/>
+                <w:lang w:val="id-ID"/>
+              </w:rPr>
+              <w:t>5,935</w:t>
+            </w:r>
+            <w:r>
+              <w:rPr>
+                <w:b/>
+                <w:lang w:val="id-ID"/>
+              </w:rPr>
+              <w:fldChar w:fldCharType="end"/>
+            </w:r>
+          </w:p>
+        </w:tc>
+        <w:tc>
+          <w:tcPr>
+            <w:tcW w:w="512" w:type="dxa"/>
           </w:tcPr>
           <w:p/>
         </w:tc>
@@ -2217,21 +3373,21 @@
       <w:tr>
         <w:tc>
           <w:tcPr>
-            <w:tcW w:w="753" w:type="dxa"/>
+            <w:tcW w:w="737" w:type="dxa"/>
             <w:vMerge/>
           </w:tcPr>
           <w:p/>
         </w:tc>
         <w:tc>
           <w:tcPr>
-            <w:tcW w:w="1707" w:type="dxa"/>
+            <w:tcW w:w="1362" w:type="dxa"/>
             <w:vMerge/>
           </w:tcPr>
           <w:p/>
         </w:tc>
         <w:tc>
           <w:tcPr>
-            <w:tcW w:w="2935" w:type="dxa"/>
+            <w:tcW w:w="2174" w:type="dxa"/>
           </w:tcPr>
           <w:p>
             <w:r>
@@ -2241,33 +3397,95 @@
         </w:tc>
         <w:tc>
           <w:tcPr>
-            <w:tcW w:w="1644" w:type="dxa"/>
-          </w:tcPr>
-          <w:p>
-            <w:pPr>
-              <w:jc w:val="center"/>
-              <w:rPr>
-                <w:lang w:val="id-ID"/>
-              </w:rPr>
-            </w:pPr>
-          </w:p>
-        </w:tc>
-        <w:tc>
-          <w:tcPr>
-            <w:tcW w:w="1716" w:type="dxa"/>
-          </w:tcPr>
-          <w:p>
-            <w:pPr>
-              <w:jc w:val="center"/>
-              <w:rPr>
-                <w:lang w:val="id-ID"/>
-              </w:rPr>
-            </w:pPr>
-          </w:p>
-        </w:tc>
-        <w:tc>
-          <w:tcPr>
-            <w:tcW w:w="880" w:type="dxa"/>
+            <w:tcW w:w="3031" w:type="dxa"/>
+          </w:tcPr>
+          <w:p>
+            <w:pPr>
+              <w:jc w:val="center"/>
+              <w:rPr>
+                <w:lang w:val="id-ID"/>
+              </w:rPr>
+            </w:pPr>
+            <w:r>
+              <w:rPr>
+                <w:lang w:val="id-ID"/>
+              </w:rPr>
+              <w:fldChar w:fldCharType="begin"/>
+            </w:r>
+            <w:r>
+              <w:rPr>
+                <w:lang w:val="id-ID"/>
+              </w:rPr>
+              <w:instrText xml:space="preserve"> MERGEFIELD penerimaan_pertamax </w:instrText>
+            </w:r>
+            <w:r>
+              <w:rPr>
+                <w:lang w:val="id-ID"/>
+              </w:rPr>
+              <w:fldChar w:fldCharType="separate"/>
+            </w:r>
+            <w:r>
+              <w:rPr>
+                <w:noProof/>
+                <w:lang w:val="id-ID"/>
+              </w:rPr>
+              <w:t>8,000</w:t>
+            </w:r>
+            <w:r>
+              <w:rPr>
+                <w:lang w:val="id-ID"/>
+              </w:rPr>
+              <w:fldChar w:fldCharType="end"/>
+            </w:r>
+          </w:p>
+        </w:tc>
+        <w:tc>
+          <w:tcPr>
+            <w:tcW w:w="2480" w:type="dxa"/>
+          </w:tcPr>
+          <w:p>
+            <w:pPr>
+              <w:jc w:val="center"/>
+              <w:rPr>
+                <w:lang w:val="id-ID"/>
+              </w:rPr>
+            </w:pPr>
+            <w:r>
+              <w:rPr>
+                <w:lang w:val="id-ID"/>
+              </w:rPr>
+              <w:fldChar w:fldCharType="begin"/>
+            </w:r>
+            <w:r>
+              <w:rPr>
+                <w:lang w:val="id-ID"/>
+              </w:rPr>
+              <w:instrText xml:space="preserve"> MERGEFIELD penerimaan_dex </w:instrText>
+            </w:r>
+            <w:r>
+              <w:rPr>
+                <w:lang w:val="id-ID"/>
+              </w:rPr>
+              <w:fldChar w:fldCharType="separate"/>
+            </w:r>
+            <w:r>
+              <w:rPr>
+                <w:noProof/>
+                <w:lang w:val="id-ID"/>
+              </w:rPr>
+              <w:t>8,000</w:t>
+            </w:r>
+            <w:r>
+              <w:rPr>
+                <w:lang w:val="id-ID"/>
+              </w:rPr>
+              <w:fldChar w:fldCharType="end"/>
+            </w:r>
+          </w:p>
+        </w:tc>
+        <w:tc>
+          <w:tcPr>
+            <w:tcW w:w="512" w:type="dxa"/>
           </w:tcPr>
           <w:p/>
         </w:tc>
@@ -2275,45 +3493,45 @@
       <w:tr>
         <w:tc>
           <w:tcPr>
-            <w:tcW w:w="753" w:type="dxa"/>
-          </w:tcPr>
-          <w:p/>
-        </w:tc>
-        <w:tc>
-          <w:tcPr>
-            <w:tcW w:w="1707" w:type="dxa"/>
-          </w:tcPr>
-          <w:p/>
-        </w:tc>
-        <w:tc>
-          <w:tcPr>
-            <w:tcW w:w="2935" w:type="dxa"/>
-          </w:tcPr>
-          <w:p/>
-        </w:tc>
-        <w:tc>
-          <w:tcPr>
-            <w:tcW w:w="1644" w:type="dxa"/>
-          </w:tcPr>
-          <w:p>
-            <w:pPr>
-              <w:jc w:val="center"/>
-            </w:pPr>
-          </w:p>
-        </w:tc>
-        <w:tc>
-          <w:tcPr>
-            <w:tcW w:w="1716" w:type="dxa"/>
-          </w:tcPr>
-          <w:p>
-            <w:pPr>
-              <w:jc w:val="center"/>
-            </w:pPr>
-          </w:p>
-        </w:tc>
-        <w:tc>
-          <w:tcPr>
-            <w:tcW w:w="880" w:type="dxa"/>
+            <w:tcW w:w="737" w:type="dxa"/>
+          </w:tcPr>
+          <w:p/>
+        </w:tc>
+        <w:tc>
+          <w:tcPr>
+            <w:tcW w:w="1362" w:type="dxa"/>
+          </w:tcPr>
+          <w:p/>
+        </w:tc>
+        <w:tc>
+          <w:tcPr>
+            <w:tcW w:w="2174" w:type="dxa"/>
+          </w:tcPr>
+          <w:p/>
+        </w:tc>
+        <w:tc>
+          <w:tcPr>
+            <w:tcW w:w="3031" w:type="dxa"/>
+          </w:tcPr>
+          <w:p>
+            <w:pPr>
+              <w:jc w:val="center"/>
+            </w:pPr>
+          </w:p>
+        </w:tc>
+        <w:tc>
+          <w:tcPr>
+            <w:tcW w:w="2480" w:type="dxa"/>
+          </w:tcPr>
+          <w:p>
+            <w:pPr>
+              <w:jc w:val="center"/>
+            </w:pPr>
+          </w:p>
+        </w:tc>
+        <w:tc>
+          <w:tcPr>
+            <w:tcW w:w="512" w:type="dxa"/>
           </w:tcPr>
           <w:p/>
         </w:tc>
@@ -2321,7 +3539,7 @@
       <w:tr>
         <w:tc>
           <w:tcPr>
-            <w:tcW w:w="753" w:type="dxa"/>
+            <w:tcW w:w="737" w:type="dxa"/>
             <w:vMerge w:val="restart"/>
           </w:tcPr>
           <w:p>
@@ -2340,7 +3558,7 @@
         </w:tc>
         <w:tc>
           <w:tcPr>
-            <w:tcW w:w="1707" w:type="dxa"/>
+            <w:tcW w:w="1362" w:type="dxa"/>
             <w:vMerge w:val="restart"/>
           </w:tcPr>
           <w:p/>
@@ -2352,7 +3570,7 @@
         </w:tc>
         <w:tc>
           <w:tcPr>
-            <w:tcW w:w="2935" w:type="dxa"/>
+            <w:tcW w:w="2174" w:type="dxa"/>
           </w:tcPr>
           <w:p>
             <w:r>
@@ -2362,33 +3580,95 @@
         </w:tc>
         <w:tc>
           <w:tcPr>
-            <w:tcW w:w="1644" w:type="dxa"/>
-          </w:tcPr>
-          <w:p>
-            <w:pPr>
-              <w:jc w:val="center"/>
-              <w:rPr>
-                <w:lang w:val="id-ID"/>
-              </w:rPr>
-            </w:pPr>
-          </w:p>
-        </w:tc>
-        <w:tc>
-          <w:tcPr>
-            <w:tcW w:w="1716" w:type="dxa"/>
-          </w:tcPr>
-          <w:p>
-            <w:pPr>
-              <w:jc w:val="center"/>
-              <w:rPr>
-                <w:lang w:val="id-ID"/>
-              </w:rPr>
-            </w:pPr>
-          </w:p>
-        </w:tc>
-        <w:tc>
-          <w:tcPr>
-            <w:tcW w:w="880" w:type="dxa"/>
+            <w:tcW w:w="3031" w:type="dxa"/>
+          </w:tcPr>
+          <w:p>
+            <w:pPr>
+              <w:jc w:val="center"/>
+              <w:rPr>
+                <w:lang w:val="id-ID"/>
+              </w:rPr>
+            </w:pPr>
+            <w:r>
+              <w:rPr>
+                <w:lang w:val="id-ID"/>
+              </w:rPr>
+              <w:fldChar w:fldCharType="begin"/>
+            </w:r>
+            <w:r>
+              <w:rPr>
+                <w:lang w:val="id-ID"/>
+              </w:rPr>
+              <w:instrText xml:space="preserve"> MERGEFIELD jumlah_pertamax </w:instrText>
+            </w:r>
+            <w:r>
+              <w:rPr>
+                <w:lang w:val="id-ID"/>
+              </w:rPr>
+              <w:fldChar w:fldCharType="separate"/>
+            </w:r>
+            <w:r>
+              <w:rPr>
+                <w:noProof/>
+                <w:lang w:val="id-ID"/>
+              </w:rPr>
+              <w:t>9,025</w:t>
+            </w:r>
+            <w:r>
+              <w:rPr>
+                <w:lang w:val="id-ID"/>
+              </w:rPr>
+              <w:fldChar w:fldCharType="end"/>
+            </w:r>
+          </w:p>
+        </w:tc>
+        <w:tc>
+          <w:tcPr>
+            <w:tcW w:w="2480" w:type="dxa"/>
+          </w:tcPr>
+          <w:p>
+            <w:pPr>
+              <w:jc w:val="center"/>
+              <w:rPr>
+                <w:lang w:val="id-ID"/>
+              </w:rPr>
+            </w:pPr>
+            <w:r>
+              <w:rPr>
+                <w:lang w:val="id-ID"/>
+              </w:rPr>
+              <w:fldChar w:fldCharType="begin"/>
+            </w:r>
+            <w:r>
+              <w:rPr>
+                <w:lang w:val="id-ID"/>
+              </w:rPr>
+              <w:instrText xml:space="preserve"> MERGEFIELD jumlah_dex </w:instrText>
+            </w:r>
+            <w:r>
+              <w:rPr>
+                <w:lang w:val="id-ID"/>
+              </w:rPr>
+              <w:fldChar w:fldCharType="separate"/>
+            </w:r>
+            <w:r>
+              <w:rPr>
+                <w:noProof/>
+                <w:lang w:val="id-ID"/>
+              </w:rPr>
+              <w:t>8,522</w:t>
+            </w:r>
+            <w:r>
+              <w:rPr>
+                <w:lang w:val="id-ID"/>
+              </w:rPr>
+              <w:fldChar w:fldCharType="end"/>
+            </w:r>
+          </w:p>
+        </w:tc>
+        <w:tc>
+          <w:tcPr>
+            <w:tcW w:w="512" w:type="dxa"/>
           </w:tcPr>
           <w:p/>
         </w:tc>
@@ -2396,21 +3676,21 @@
       <w:tr>
         <w:tc>
           <w:tcPr>
-            <w:tcW w:w="753" w:type="dxa"/>
+            <w:tcW w:w="737" w:type="dxa"/>
             <w:vMerge/>
           </w:tcPr>
           <w:p/>
         </w:tc>
         <w:tc>
           <w:tcPr>
-            <w:tcW w:w="1707" w:type="dxa"/>
+            <w:tcW w:w="1362" w:type="dxa"/>
             <w:vMerge/>
           </w:tcPr>
           <w:p/>
         </w:tc>
         <w:tc>
           <w:tcPr>
-            <w:tcW w:w="2935" w:type="dxa"/>
+            <w:tcW w:w="2174" w:type="dxa"/>
           </w:tcPr>
           <w:p>
             <w:r>
@@ -2420,33 +3700,95 @@
         </w:tc>
         <w:tc>
           <w:tcPr>
-            <w:tcW w:w="1644" w:type="dxa"/>
-          </w:tcPr>
-          <w:p>
-            <w:pPr>
-              <w:jc w:val="center"/>
-              <w:rPr>
-                <w:lang w:val="id-ID"/>
-              </w:rPr>
-            </w:pPr>
-          </w:p>
-        </w:tc>
-        <w:tc>
-          <w:tcPr>
-            <w:tcW w:w="1716" w:type="dxa"/>
-          </w:tcPr>
-          <w:p>
-            <w:pPr>
-              <w:jc w:val="center"/>
-              <w:rPr>
-                <w:lang w:val="id-ID"/>
-              </w:rPr>
-            </w:pPr>
-          </w:p>
-        </w:tc>
-        <w:tc>
-          <w:tcPr>
-            <w:tcW w:w="880" w:type="dxa"/>
+            <w:tcW w:w="3031" w:type="dxa"/>
+          </w:tcPr>
+          <w:p>
+            <w:pPr>
+              <w:jc w:val="center"/>
+              <w:rPr>
+                <w:lang w:val="id-ID"/>
+              </w:rPr>
+            </w:pPr>
+            <w:r>
+              <w:rPr>
+                <w:lang w:val="id-ID"/>
+              </w:rPr>
+              <w:fldChar w:fldCharType="begin"/>
+            </w:r>
+            <w:r>
+              <w:rPr>
+                <w:lang w:val="id-ID"/>
+              </w:rPr>
+              <w:instrText xml:space="preserve"> MERGEFIELD pengeluaran_pertamax </w:instrText>
+            </w:r>
+            <w:r>
+              <w:rPr>
+                <w:lang w:val="id-ID"/>
+              </w:rPr>
+              <w:fldChar w:fldCharType="separate"/>
+            </w:r>
+            <w:r>
+              <w:rPr>
+                <w:noProof/>
+                <w:lang w:val="id-ID"/>
+              </w:rPr>
+              <w:t>3,060</w:t>
+            </w:r>
+            <w:r>
+              <w:rPr>
+                <w:lang w:val="id-ID"/>
+              </w:rPr>
+              <w:fldChar w:fldCharType="end"/>
+            </w:r>
+          </w:p>
+        </w:tc>
+        <w:tc>
+          <w:tcPr>
+            <w:tcW w:w="2480" w:type="dxa"/>
+          </w:tcPr>
+          <w:p>
+            <w:pPr>
+              <w:jc w:val="center"/>
+              <w:rPr>
+                <w:lang w:val="id-ID"/>
+              </w:rPr>
+            </w:pPr>
+            <w:r>
+              <w:rPr>
+                <w:lang w:val="id-ID"/>
+              </w:rPr>
+              <w:fldChar w:fldCharType="begin"/>
+            </w:r>
+            <w:r>
+              <w:rPr>
+                <w:lang w:val="id-ID"/>
+              </w:rPr>
+              <w:instrText xml:space="preserve"> MERGEFIELD pengeluaran_dex </w:instrText>
+            </w:r>
+            <w:r>
+              <w:rPr>
+                <w:lang w:val="id-ID"/>
+              </w:rPr>
+              <w:fldChar w:fldCharType="separate"/>
+            </w:r>
+            <w:r>
+              <w:rPr>
+                <w:noProof/>
+                <w:lang w:val="id-ID"/>
+              </w:rPr>
+              <w:t>2,587</w:t>
+            </w:r>
+            <w:r>
+              <w:rPr>
+                <w:lang w:val="id-ID"/>
+              </w:rPr>
+              <w:fldChar w:fldCharType="end"/>
+            </w:r>
+          </w:p>
+        </w:tc>
+        <w:tc>
+          <w:tcPr>
+            <w:tcW w:w="512" w:type="dxa"/>
           </w:tcPr>
           <w:p/>
         </w:tc>
@@ -2454,21 +3796,21 @@
       <w:tr>
         <w:tc>
           <w:tcPr>
-            <w:tcW w:w="753" w:type="dxa"/>
+            <w:tcW w:w="737" w:type="dxa"/>
             <w:vMerge/>
           </w:tcPr>
           <w:p/>
         </w:tc>
         <w:tc>
           <w:tcPr>
-            <w:tcW w:w="1707" w:type="dxa"/>
+            <w:tcW w:w="1362" w:type="dxa"/>
             <w:vMerge/>
           </w:tcPr>
           <w:p/>
         </w:tc>
         <w:tc>
           <w:tcPr>
-            <w:tcW w:w="2935" w:type="dxa"/>
+            <w:tcW w:w="2174" w:type="dxa"/>
           </w:tcPr>
           <w:p>
             <w:r>
@@ -2478,35 +3820,107 @@
         </w:tc>
         <w:tc>
           <w:tcPr>
-            <w:tcW w:w="1644" w:type="dxa"/>
-          </w:tcPr>
-          <w:p>
-            <w:pPr>
-              <w:jc w:val="center"/>
-              <w:rPr>
-                <w:b/>
-                <w:lang w:val="id-ID"/>
-              </w:rPr>
-            </w:pPr>
-          </w:p>
-        </w:tc>
-        <w:tc>
-          <w:tcPr>
-            <w:tcW w:w="1716" w:type="dxa"/>
-          </w:tcPr>
-          <w:p>
-            <w:pPr>
-              <w:jc w:val="center"/>
-              <w:rPr>
-                <w:b/>
-                <w:lang w:val="id-ID"/>
-              </w:rPr>
-            </w:pPr>
-          </w:p>
-        </w:tc>
-        <w:tc>
-          <w:tcPr>
-            <w:tcW w:w="880" w:type="dxa"/>
+            <w:tcW w:w="3031" w:type="dxa"/>
+          </w:tcPr>
+          <w:p>
+            <w:pPr>
+              <w:jc w:val="center"/>
+              <w:rPr>
+                <w:b/>
+                <w:lang w:val="id-ID"/>
+              </w:rPr>
+            </w:pPr>
+            <w:r>
+              <w:rPr>
+                <w:b/>
+                <w:lang w:val="id-ID"/>
+              </w:rPr>
+              <w:fldChar w:fldCharType="begin"/>
+            </w:r>
+            <w:r>
+              <w:rPr>
+                <w:b/>
+                <w:lang w:val="id-ID"/>
+              </w:rPr>
+              <w:instrText xml:space="preserve"> MERGEFIELD persediaan_akhir_pertamax </w:instrText>
+            </w:r>
+            <w:r>
+              <w:rPr>
+                <w:b/>
+                <w:lang w:val="id-ID"/>
+              </w:rPr>
+              <w:fldChar w:fldCharType="separate"/>
+            </w:r>
+            <w:r>
+              <w:rPr>
+                <w:b/>
+                <w:noProof/>
+                <w:lang w:val="id-ID"/>
+              </w:rPr>
+              <w:t>5,965</w:t>
+            </w:r>
+            <w:r>
+              <w:rPr>
+                <w:b/>
+                <w:lang w:val="id-ID"/>
+              </w:rPr>
+              <w:fldChar w:fldCharType="end"/>
+            </w:r>
+          </w:p>
+        </w:tc>
+        <w:tc>
+          <w:tcPr>
+            <w:tcW w:w="2480" w:type="dxa"/>
+          </w:tcPr>
+          <w:p>
+            <w:pPr>
+              <w:jc w:val="center"/>
+              <w:rPr>
+                <w:b/>
+                <w:lang w:val="id-ID"/>
+              </w:rPr>
+            </w:pPr>
+            <w:r>
+              <w:rPr>
+                <w:b/>
+                <w:lang w:val="id-ID"/>
+              </w:rPr>
+              <w:fldChar w:fldCharType="begin"/>
+            </w:r>
+            <w:r>
+              <w:rPr>
+                <w:b/>
+                <w:lang w:val="id-ID"/>
+              </w:rPr>
+              <w:instrText xml:space="preserve"> MERGEFIELD persediaan_akhir_dex </w:instrText>
+            </w:r>
+            <w:r>
+              <w:rPr>
+                <w:b/>
+                <w:lang w:val="id-ID"/>
+              </w:rPr>
+              <w:fldChar w:fldCharType="separate"/>
+            </w:r>
+            <w:r>
+              <w:rPr>
+                <w:b/>
+                <w:noProof/>
+                <w:lang w:val="id-ID"/>
+              </w:rPr>
+              <w:t>5,935</w:t>
+            </w:r>
+            <w:r>
+              <w:rPr>
+                <w:b/>
+                <w:lang w:val="id-ID"/>
+              </w:rPr>
+              <w:fldChar w:fldCharType="end"/>
+            </w:r>
+          </w:p>
+        </w:tc>
+        <w:tc>
+          <w:tcPr>
+            <w:tcW w:w="512" w:type="dxa"/>
           </w:tcPr>
           <w:p/>
         </w:tc>
@@ -2514,21 +3928,21 @@
       <w:tr>
         <w:tc>
           <w:tcPr>
-            <w:tcW w:w="753" w:type="dxa"/>
+            <w:tcW w:w="737" w:type="dxa"/>
             <w:vMerge/>
           </w:tcPr>
           <w:p/>
         </w:tc>
         <w:tc>
           <w:tcPr>
-            <w:tcW w:w="1707" w:type="dxa"/>
+            <w:tcW w:w="1362" w:type="dxa"/>
             <w:vMerge/>
           </w:tcPr>
           <w:p/>
         </w:tc>
         <w:tc>
           <w:tcPr>
-            <w:tcW w:w="2935" w:type="dxa"/>
+            <w:tcW w:w="2174" w:type="dxa"/>
           </w:tcPr>
           <w:p>
             <w:r>
@@ -2538,33 +3952,95 @@
         </w:tc>
         <w:tc>
           <w:tcPr>
-            <w:tcW w:w="1644" w:type="dxa"/>
-          </w:tcPr>
-          <w:p>
-            <w:pPr>
-              <w:jc w:val="center"/>
-              <w:rPr>
-                <w:lang w:val="id-ID"/>
-              </w:rPr>
-            </w:pPr>
-          </w:p>
-        </w:tc>
-        <w:tc>
-          <w:tcPr>
-            <w:tcW w:w="1716" w:type="dxa"/>
-          </w:tcPr>
-          <w:p>
-            <w:pPr>
-              <w:jc w:val="center"/>
-              <w:rPr>
-                <w:lang w:val="id-ID"/>
-              </w:rPr>
-            </w:pPr>
-          </w:p>
-        </w:tc>
-        <w:tc>
-          <w:tcPr>
-            <w:tcW w:w="880" w:type="dxa"/>
+            <w:tcW w:w="3031" w:type="dxa"/>
+          </w:tcPr>
+          <w:p>
+            <w:pPr>
+              <w:jc w:val="center"/>
+              <w:rPr>
+                <w:lang w:val="id-ID"/>
+              </w:rPr>
+            </w:pPr>
+            <w:r>
+              <w:rPr>
+                <w:lang w:val="id-ID"/>
+              </w:rPr>
+              <w:fldChar w:fldCharType="begin"/>
+            </w:r>
+            <w:r>
+              <w:rPr>
+                <w:lang w:val="id-ID"/>
+              </w:rPr>
+              <w:instrText xml:space="preserve"> MERGEFIELD penerimaan_pertamax </w:instrText>
+            </w:r>
+            <w:r>
+              <w:rPr>
+                <w:lang w:val="id-ID"/>
+              </w:rPr>
+              <w:fldChar w:fldCharType="separate"/>
+            </w:r>
+            <w:r>
+              <w:rPr>
+                <w:noProof/>
+                <w:lang w:val="id-ID"/>
+              </w:rPr>
+              <w:t>8,000</w:t>
+            </w:r>
+            <w:r>
+              <w:rPr>
+                <w:lang w:val="id-ID"/>
+              </w:rPr>
+              <w:fldChar w:fldCharType="end"/>
+            </w:r>
+          </w:p>
+        </w:tc>
+        <w:tc>
+          <w:tcPr>
+            <w:tcW w:w="2480" w:type="dxa"/>
+          </w:tcPr>
+          <w:p>
+            <w:pPr>
+              <w:jc w:val="center"/>
+              <w:rPr>
+                <w:lang w:val="id-ID"/>
+              </w:rPr>
+            </w:pPr>
+            <w:r>
+              <w:rPr>
+                <w:lang w:val="id-ID"/>
+              </w:rPr>
+              <w:fldChar w:fldCharType="begin"/>
+            </w:r>
+            <w:r>
+              <w:rPr>
+                <w:lang w:val="id-ID"/>
+              </w:rPr>
+              <w:instrText xml:space="preserve"> MERGEFIELD penerimaan_dex </w:instrText>
+            </w:r>
+            <w:r>
+              <w:rPr>
+                <w:lang w:val="id-ID"/>
+              </w:rPr>
+              <w:fldChar w:fldCharType="separate"/>
+            </w:r>
+            <w:r>
+              <w:rPr>
+                <w:noProof/>
+                <w:lang w:val="id-ID"/>
+              </w:rPr>
+              <w:t>8,000</w:t>
+            </w:r>
+            <w:r>
+              <w:rPr>
+                <w:lang w:val="id-ID"/>
+              </w:rPr>
+              <w:fldChar w:fldCharType="end"/>
+            </w:r>
+          </w:p>
+        </w:tc>
+        <w:tc>
+          <w:tcPr>
+            <w:tcW w:w="512" w:type="dxa"/>
           </w:tcPr>
           <w:p/>
         </w:tc>
@@ -2572,45 +4048,45 @@
       <w:tr>
         <w:tc>
           <w:tcPr>
-            <w:tcW w:w="753" w:type="dxa"/>
-          </w:tcPr>
-          <w:p/>
-        </w:tc>
-        <w:tc>
-          <w:tcPr>
-            <w:tcW w:w="1707" w:type="dxa"/>
-          </w:tcPr>
-          <w:p/>
-        </w:tc>
-        <w:tc>
-          <w:tcPr>
-            <w:tcW w:w="2935" w:type="dxa"/>
-          </w:tcPr>
-          <w:p/>
-        </w:tc>
-        <w:tc>
-          <w:tcPr>
-            <w:tcW w:w="1644" w:type="dxa"/>
-          </w:tcPr>
-          <w:p>
-            <w:pPr>
-              <w:jc w:val="center"/>
-            </w:pPr>
-          </w:p>
-        </w:tc>
-        <w:tc>
-          <w:tcPr>
-            <w:tcW w:w="1716" w:type="dxa"/>
-          </w:tcPr>
-          <w:p>
-            <w:pPr>
-              <w:jc w:val="center"/>
-            </w:pPr>
-          </w:p>
-        </w:tc>
-        <w:tc>
-          <w:tcPr>
-            <w:tcW w:w="880" w:type="dxa"/>
+            <w:tcW w:w="737" w:type="dxa"/>
+          </w:tcPr>
+          <w:p/>
+        </w:tc>
+        <w:tc>
+          <w:tcPr>
+            <w:tcW w:w="1362" w:type="dxa"/>
+          </w:tcPr>
+          <w:p/>
+        </w:tc>
+        <w:tc>
+          <w:tcPr>
+            <w:tcW w:w="2174" w:type="dxa"/>
+          </w:tcPr>
+          <w:p/>
+        </w:tc>
+        <w:tc>
+          <w:tcPr>
+            <w:tcW w:w="3031" w:type="dxa"/>
+          </w:tcPr>
+          <w:p>
+            <w:pPr>
+              <w:jc w:val="center"/>
+            </w:pPr>
+          </w:p>
+        </w:tc>
+        <w:tc>
+          <w:tcPr>
+            <w:tcW w:w="2480" w:type="dxa"/>
+          </w:tcPr>
+          <w:p>
+            <w:pPr>
+              <w:jc w:val="center"/>
+            </w:pPr>
+          </w:p>
+        </w:tc>
+        <w:tc>
+          <w:tcPr>
+            <w:tcW w:w="512" w:type="dxa"/>
           </w:tcPr>
           <w:p/>
         </w:tc>
@@ -2618,7 +4094,7 @@
       <w:tr>
         <w:tc>
           <w:tcPr>
-            <w:tcW w:w="2460" w:type="dxa"/>
+            <w:tcW w:w="2099" w:type="dxa"/>
             <w:gridSpan w:val="2"/>
             <w:vMerge w:val="restart"/>
           </w:tcPr>
@@ -2632,7 +4108,7 @@
         </w:tc>
         <w:tc>
           <w:tcPr>
-            <w:tcW w:w="2935" w:type="dxa"/>
+            <w:tcW w:w="2174" w:type="dxa"/>
           </w:tcPr>
           <w:p>
             <w:r>
@@ -2642,33 +4118,95 @@
         </w:tc>
         <w:tc>
           <w:tcPr>
-            <w:tcW w:w="1644" w:type="dxa"/>
-          </w:tcPr>
-          <w:p>
-            <w:pPr>
-              <w:jc w:val="center"/>
-              <w:rPr>
-                <w:lang w:val="id-ID"/>
-              </w:rPr>
-            </w:pPr>
-          </w:p>
-        </w:tc>
-        <w:tc>
-          <w:tcPr>
-            <w:tcW w:w="1716" w:type="dxa"/>
-          </w:tcPr>
-          <w:p>
-            <w:pPr>
-              <w:jc w:val="center"/>
-              <w:rPr>
-                <w:lang w:val="id-ID"/>
-              </w:rPr>
-            </w:pPr>
-          </w:p>
-        </w:tc>
-        <w:tc>
-          <w:tcPr>
-            <w:tcW w:w="880" w:type="dxa"/>
+            <w:tcW w:w="3031" w:type="dxa"/>
+          </w:tcPr>
+          <w:p>
+            <w:pPr>
+              <w:jc w:val="center"/>
+              <w:rPr>
+                <w:lang w:val="id-ID"/>
+              </w:rPr>
+            </w:pPr>
+            <w:r>
+              <w:rPr>
+                <w:lang w:val="id-ID"/>
+              </w:rPr>
+              <w:fldChar w:fldCharType="begin"/>
+            </w:r>
+            <w:r>
+              <w:rPr>
+                <w:lang w:val="id-ID"/>
+              </w:rPr>
+              <w:instrText xml:space="preserve"> MERGEFIELD persediaan_awal_pertamax </w:instrText>
+            </w:r>
+            <w:r>
+              <w:rPr>
+                <w:lang w:val="id-ID"/>
+              </w:rPr>
+              <w:fldChar w:fldCharType="separate"/>
+            </w:r>
+            <w:r>
+              <w:rPr>
+                <w:noProof/>
+                <w:lang w:val="id-ID"/>
+              </w:rPr>
+              <w:t>1,025</w:t>
+            </w:r>
+            <w:r>
+              <w:rPr>
+                <w:lang w:val="id-ID"/>
+              </w:rPr>
+              <w:fldChar w:fldCharType="end"/>
+            </w:r>
+          </w:p>
+        </w:tc>
+        <w:tc>
+          <w:tcPr>
+            <w:tcW w:w="2480" w:type="dxa"/>
+          </w:tcPr>
+          <w:p>
+            <w:pPr>
+              <w:jc w:val="center"/>
+              <w:rPr>
+                <w:lang w:val="id-ID"/>
+              </w:rPr>
+            </w:pPr>
+            <w:r>
+              <w:rPr>
+                <w:lang w:val="id-ID"/>
+              </w:rPr>
+              <w:fldChar w:fldCharType="begin"/>
+            </w:r>
+            <w:r>
+              <w:rPr>
+                <w:lang w:val="id-ID"/>
+              </w:rPr>
+              <w:instrText xml:space="preserve"> MERGEFIELD persediaan_awal_dex </w:instrText>
+            </w:r>
+            <w:r>
+              <w:rPr>
+                <w:lang w:val="id-ID"/>
+              </w:rPr>
+              <w:fldChar w:fldCharType="separate"/>
+            </w:r>
+            <w:r>
+              <w:rPr>
+                <w:noProof/>
+                <w:lang w:val="id-ID"/>
+              </w:rPr>
+              <w:t>522</w:t>
+            </w:r>
+            <w:r>
+              <w:rPr>
+                <w:lang w:val="id-ID"/>
+              </w:rPr>
+              <w:fldChar w:fldCharType="end"/>
+            </w:r>
+          </w:p>
+        </w:tc>
+        <w:tc>
+          <w:tcPr>
+            <w:tcW w:w="512" w:type="dxa"/>
           </w:tcPr>
           <w:p/>
         </w:tc>
@@ -2676,7 +4214,7 @@
       <w:tr>
         <w:tc>
           <w:tcPr>
-            <w:tcW w:w="2460" w:type="dxa"/>
+            <w:tcW w:w="2099" w:type="dxa"/>
             <w:gridSpan w:val="2"/>
             <w:vMerge/>
           </w:tcPr>
@@ -2684,7 +4222,7 @@
         </w:tc>
         <w:tc>
           <w:tcPr>
-            <w:tcW w:w="2935" w:type="dxa"/>
+            <w:tcW w:w="2174" w:type="dxa"/>
           </w:tcPr>
           <w:p>
             <w:r>
@@ -2694,33 +4232,33 @@
         </w:tc>
         <w:tc>
           <w:tcPr>
-            <w:tcW w:w="1644" w:type="dxa"/>
-          </w:tcPr>
-          <w:p>
-            <w:pPr>
-              <w:jc w:val="center"/>
-              <w:rPr>
-                <w:lang w:val="id-ID"/>
-              </w:rPr>
-            </w:pPr>
-          </w:p>
-        </w:tc>
-        <w:tc>
-          <w:tcPr>
-            <w:tcW w:w="1716" w:type="dxa"/>
-          </w:tcPr>
-          <w:p>
-            <w:pPr>
-              <w:jc w:val="center"/>
-              <w:rPr>
-                <w:lang w:val="id-ID"/>
-              </w:rPr>
-            </w:pPr>
-          </w:p>
-        </w:tc>
-        <w:tc>
-          <w:tcPr>
-            <w:tcW w:w="880" w:type="dxa"/>
+            <w:tcW w:w="3031" w:type="dxa"/>
+          </w:tcPr>
+          <w:p>
+            <w:pPr>
+              <w:jc w:val="center"/>
+              <w:rPr>
+                <w:lang w:val="id-ID"/>
+              </w:rPr>
+            </w:pPr>
+          </w:p>
+        </w:tc>
+        <w:tc>
+          <w:tcPr>
+            <w:tcW w:w="2480" w:type="dxa"/>
+          </w:tcPr>
+          <w:p>
+            <w:pPr>
+              <w:jc w:val="center"/>
+              <w:rPr>
+                <w:lang w:val="id-ID"/>
+              </w:rPr>
+            </w:pPr>
+          </w:p>
+        </w:tc>
+        <w:tc>
+          <w:tcPr>
+            <w:tcW w:w="512" w:type="dxa"/>
           </w:tcPr>
           <w:p/>
         </w:tc>
@@ -2728,7 +4266,7 @@
       <w:tr>
         <w:tc>
           <w:tcPr>
-            <w:tcW w:w="2460" w:type="dxa"/>
+            <w:tcW w:w="2099" w:type="dxa"/>
             <w:gridSpan w:val="2"/>
             <w:vMerge/>
           </w:tcPr>
@@ -2736,7 +4274,7 @@
         </w:tc>
         <w:tc>
           <w:tcPr>
-            <w:tcW w:w="2935" w:type="dxa"/>
+            <w:tcW w:w="2174" w:type="dxa"/>
           </w:tcPr>
           <w:p>
             <w:r>
@@ -2746,33 +4284,33 @@
         </w:tc>
         <w:tc>
           <w:tcPr>
-            <w:tcW w:w="1644" w:type="dxa"/>
-          </w:tcPr>
-          <w:p>
-            <w:pPr>
-              <w:jc w:val="center"/>
-              <w:rPr>
-                <w:lang w:val="id-ID"/>
-              </w:rPr>
-            </w:pPr>
-          </w:p>
-        </w:tc>
-        <w:tc>
-          <w:tcPr>
-            <w:tcW w:w="1716" w:type="dxa"/>
-          </w:tcPr>
-          <w:p>
-            <w:pPr>
-              <w:jc w:val="center"/>
-              <w:rPr>
-                <w:lang w:val="id-ID"/>
-              </w:rPr>
-            </w:pPr>
-          </w:p>
-        </w:tc>
-        <w:tc>
-          <w:tcPr>
-            <w:tcW w:w="880" w:type="dxa"/>
+            <w:tcW w:w="3031" w:type="dxa"/>
+          </w:tcPr>
+          <w:p>
+            <w:pPr>
+              <w:jc w:val="center"/>
+              <w:rPr>
+                <w:lang w:val="id-ID"/>
+              </w:rPr>
+            </w:pPr>
+          </w:p>
+        </w:tc>
+        <w:tc>
+          <w:tcPr>
+            <w:tcW w:w="2480" w:type="dxa"/>
+          </w:tcPr>
+          <w:p>
+            <w:pPr>
+              <w:jc w:val="center"/>
+              <w:rPr>
+                <w:lang w:val="id-ID"/>
+              </w:rPr>
+            </w:pPr>
+          </w:p>
+        </w:tc>
+        <w:tc>
+          <w:tcPr>
+            <w:tcW w:w="512" w:type="dxa"/>
           </w:tcPr>
           <w:p/>
         </w:tc>
@@ -2780,7 +4318,7 @@
       <w:tr>
         <w:tc>
           <w:tcPr>
-            <w:tcW w:w="2460" w:type="dxa"/>
+            <w:tcW w:w="2099" w:type="dxa"/>
             <w:gridSpan w:val="2"/>
             <w:vMerge/>
           </w:tcPr>
@@ -2788,7 +4326,7 @@
         </w:tc>
         <w:tc>
           <w:tcPr>
-            <w:tcW w:w="2935" w:type="dxa"/>
+            <w:tcW w:w="2174" w:type="dxa"/>
           </w:tcPr>
           <w:p>
             <w:r>
@@ -2798,33 +4336,33 @@
         </w:tc>
         <w:tc>
           <w:tcPr>
-            <w:tcW w:w="1644" w:type="dxa"/>
-          </w:tcPr>
-          <w:p>
-            <w:pPr>
-              <w:jc w:val="center"/>
-              <w:rPr>
-                <w:lang w:val="id-ID"/>
-              </w:rPr>
-            </w:pPr>
-          </w:p>
-        </w:tc>
-        <w:tc>
-          <w:tcPr>
-            <w:tcW w:w="1716" w:type="dxa"/>
-          </w:tcPr>
-          <w:p>
-            <w:pPr>
-              <w:jc w:val="center"/>
-              <w:rPr>
-                <w:lang w:val="id-ID"/>
-              </w:rPr>
-            </w:pPr>
-          </w:p>
-        </w:tc>
-        <w:tc>
-          <w:tcPr>
-            <w:tcW w:w="880" w:type="dxa"/>
+            <w:tcW w:w="3031" w:type="dxa"/>
+          </w:tcPr>
+          <w:p>
+            <w:pPr>
+              <w:jc w:val="center"/>
+              <w:rPr>
+                <w:lang w:val="id-ID"/>
+              </w:rPr>
+            </w:pPr>
+          </w:p>
+        </w:tc>
+        <w:tc>
+          <w:tcPr>
+            <w:tcW w:w="2480" w:type="dxa"/>
+          </w:tcPr>
+          <w:p>
+            <w:pPr>
+              <w:jc w:val="center"/>
+              <w:rPr>
+                <w:lang w:val="id-ID"/>
+              </w:rPr>
+            </w:pPr>
+          </w:p>
+        </w:tc>
+        <w:tc>
+          <w:tcPr>
+            <w:tcW w:w="512" w:type="dxa"/>
           </w:tcPr>
           <w:p/>
         </w:tc>
@@ -2832,7 +4370,7 @@
       <w:tr>
         <w:tc>
           <w:tcPr>
-            <w:tcW w:w="2460" w:type="dxa"/>
+            <w:tcW w:w="2099" w:type="dxa"/>
             <w:gridSpan w:val="2"/>
             <w:vMerge/>
           </w:tcPr>
@@ -2840,7 +4378,7 @@
         </w:tc>
         <w:tc>
           <w:tcPr>
-            <w:tcW w:w="2935" w:type="dxa"/>
+            <w:tcW w:w="2174" w:type="dxa"/>
           </w:tcPr>
           <w:p>
             <w:pPr>
@@ -2858,35 +4396,35 @@
         </w:tc>
         <w:tc>
           <w:tcPr>
-            <w:tcW w:w="1644" w:type="dxa"/>
-          </w:tcPr>
-          <w:p>
-            <w:pPr>
-              <w:jc w:val="center"/>
-              <w:rPr>
-                <w:b/>
-                <w:lang w:val="id-ID"/>
-              </w:rPr>
-            </w:pPr>
-          </w:p>
-        </w:tc>
-        <w:tc>
-          <w:tcPr>
-            <w:tcW w:w="1716" w:type="dxa"/>
-          </w:tcPr>
-          <w:p>
-            <w:pPr>
-              <w:jc w:val="center"/>
-              <w:rPr>
-                <w:b/>
-                <w:lang w:val="id-ID"/>
-              </w:rPr>
-            </w:pPr>
-          </w:p>
-        </w:tc>
-        <w:tc>
-          <w:tcPr>
-            <w:tcW w:w="880" w:type="dxa"/>
+            <w:tcW w:w="3031" w:type="dxa"/>
+          </w:tcPr>
+          <w:p>
+            <w:pPr>
+              <w:jc w:val="center"/>
+              <w:rPr>
+                <w:b/>
+                <w:lang w:val="id-ID"/>
+              </w:rPr>
+            </w:pPr>
+          </w:p>
+        </w:tc>
+        <w:tc>
+          <w:tcPr>
+            <w:tcW w:w="2480" w:type="dxa"/>
+          </w:tcPr>
+          <w:p>
+            <w:pPr>
+              <w:jc w:val="center"/>
+              <w:rPr>
+                <w:b/>
+                <w:lang w:val="id-ID"/>
+              </w:rPr>
+            </w:pPr>
+          </w:p>
+        </w:tc>
+        <w:tc>
+          <w:tcPr>
+            <w:tcW w:w="512" w:type="dxa"/>
           </w:tcPr>
           <w:p/>
         </w:tc>

</xml_diff>

<commit_message>
Fix generate laporan dan input stok opname
</commit_message>
<xml_diff>
--- a/static/templates/laporan/BLANKO LAPORAN BULANAN.docx
+++ b/static/templates/laporan/BLANKO LAPORAN BULANAN.docx
@@ -11,7 +11,7 @@
         <w:rPr>
           <w:noProof/>
         </w:rPr>
-        <w:pict w14:anchorId="61502B9C">
+        <w:pict w14:anchorId="1882BAC5">
           <v:shapetype id="_x0000_t202" coordsize="21600,21600" o:spt="202" path="m,l,21600r21600,l21600,xe">
             <v:stroke joinstyle="miter"/>
             <v:path gradientshapeok="t" o:connecttype="rect"/>
@@ -74,7 +74,7 @@
           <w:lang w:val="id-ID" w:eastAsia="id-ID"/>
         </w:rPr>
         <w:drawing>
-          <wp:anchor distT="0" distB="0" distL="114300" distR="114300" simplePos="0" relativeHeight="251660288" behindDoc="0" locked="0" layoutInCell="1" allowOverlap="1" wp14:anchorId="5BA5FAA1" wp14:editId="098CCF1A">
+          <wp:anchor distT="0" distB="0" distL="114300" distR="114300" simplePos="0" relativeHeight="251660288" behindDoc="0" locked="0" layoutInCell="1" allowOverlap="1" wp14:anchorId="6A43D4B5" wp14:editId="474405FC">
             <wp:simplePos x="0" y="0"/>
             <wp:positionH relativeFrom="column">
               <wp:posOffset>2476500</wp:posOffset>
@@ -134,7 +134,7 @@
         <w:rPr>
           <w:noProof/>
         </w:rPr>
-        <w:pict w14:anchorId="79F1DF66">
+        <w:pict w14:anchorId="17A67369">
           <v:shape id="_x0000_s1027" type="#_x0000_t202" style="position:absolute;margin-left:605.25pt;margin-top:3.9pt;width:81pt;height:33pt;z-index:251663360;visibility:visible;mso-wrap-distance-top:3.6pt;mso-wrap-distance-bottom:3.6pt;mso-position-horizontal-relative:text;mso-position-vertical-relative:text;mso-width-relative:margin;mso-height-relative:margin" o:gfxdata="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" strokecolor="white [3212]">
             <v:textbox>
               <w:txbxContent>
@@ -211,7 +211,7 @@
         <w:rPr>
           <w:noProof/>
         </w:rPr>
-        <w:pict w14:anchorId="4F144CC8">
+        <w:pict w14:anchorId="67A634F8">
           <v:line id="Straight Connector 2" o:spid="_x0000_s1031" style="position:absolute;z-index:251661312;visibility:visible;mso-position-horizontal-relative:text;mso-position-vertical-relative:text" from="-.75pt,12.15pt" to="192pt,12.15pt" o:gfxdata="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" strokecolor="black [3200]" strokeweight=".5pt">
             <v:stroke joinstyle="miter"/>
           </v:line>
@@ -292,7 +292,16 @@
         <w:t>NOMOR …</w:t>
       </w:r>
       <w:r>
-        <w:t>1//</w:t>
+        <w:t>1/</w:t>
+      </w:r>
+      <w:r>
+        <w:rPr>
+          <w:lang w:val="id-ID"/>
+        </w:rPr>
+        <w:t xml:space="preserve"> </w:t>
+      </w:r>
+      <w:r>
+        <w:t>/</w:t>
       </w:r>
     </w:p>
     <w:p>
@@ -300,7 +309,7 @@
         <w:rPr>
           <w:noProof/>
         </w:rPr>
-        <w:pict w14:anchorId="58D270E4">
+        <w:pict w14:anchorId="6E4B0647">
           <v:shape id="_x0000_s1028" type="#_x0000_t202" style="position:absolute;margin-left:298.35pt;margin-top:22.2pt;width:184.5pt;height:59.25pt;z-index:251671552;visibility:visible;mso-wrap-distance-top:3.6pt;mso-wrap-distance-bottom:3.6pt;mso-width-relative:margin;mso-height-relative:margin" o:gfxdata="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" strokecolor="black [3213]">
             <v:textbox>
               <w:txbxContent>
@@ -482,7 +491,7 @@
         <w:rPr>
           <w:noProof/>
         </w:rPr>
-        <w:pict w14:anchorId="1C41CBAC">
+        <w:pict w14:anchorId="4F3CB91E">
           <v:shape id="_x0000_s1029" type="#_x0000_t202" style="position:absolute;margin-left:-.75pt;margin-top:22.2pt;width:184.5pt;height:59.25pt;z-index:251665408;visibility:visible;mso-wrap-distance-top:3.6pt;mso-wrap-distance-bottom:3.6pt;mso-width-relative:margin;mso-height-relative:margin" o:gfxdata="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" strokecolor="black [3213]">
             <v:textbox>
               <w:txbxContent>
@@ -655,17 +664,17 @@
         <w:tblLook w:val="04A0" w:firstRow="1" w:lastRow="0" w:firstColumn="1" w:lastColumn="0" w:noHBand="0" w:noVBand="1"/>
       </w:tblPr>
       <w:tblGrid>
-        <w:gridCol w:w="737"/>
-        <w:gridCol w:w="1362"/>
-        <w:gridCol w:w="2174"/>
-        <w:gridCol w:w="3031"/>
-        <w:gridCol w:w="2480"/>
-        <w:gridCol w:w="512"/>
+        <w:gridCol w:w="753"/>
+        <w:gridCol w:w="1687"/>
+        <w:gridCol w:w="2891"/>
+        <w:gridCol w:w="2104"/>
+        <w:gridCol w:w="2002"/>
+        <w:gridCol w:w="859"/>
       </w:tblGrid>
       <w:tr>
         <w:tc>
           <w:tcPr>
-            <w:tcW w:w="737" w:type="dxa"/>
+            <w:tcW w:w="753" w:type="dxa"/>
             <w:vMerge w:val="restart"/>
           </w:tcPr>
           <w:p>
@@ -687,7 +696,7 @@
         </w:tc>
         <w:tc>
           <w:tcPr>
-            <w:tcW w:w="1362" w:type="dxa"/>
+            <w:tcW w:w="1687" w:type="dxa"/>
             <w:vMerge w:val="restart"/>
           </w:tcPr>
           <w:p>
@@ -701,7 +710,7 @@
         </w:tc>
         <w:tc>
           <w:tcPr>
-            <w:tcW w:w="2174" w:type="dxa"/>
+            <w:tcW w:w="2891" w:type="dxa"/>
             <w:vMerge w:val="restart"/>
           </w:tcPr>
           <w:p>
@@ -715,7 +724,7 @@
         </w:tc>
         <w:tc>
           <w:tcPr>
-            <w:tcW w:w="6023" w:type="dxa"/>
+            <w:tcW w:w="4965" w:type="dxa"/>
             <w:gridSpan w:val="3"/>
           </w:tcPr>
           <w:p>
@@ -731,7 +740,7 @@
       <w:tr>
         <w:tc>
           <w:tcPr>
-            <w:tcW w:w="737" w:type="dxa"/>
+            <w:tcW w:w="753" w:type="dxa"/>
             <w:vMerge/>
           </w:tcPr>
           <w:p>
@@ -742,7 +751,7 @@
         </w:tc>
         <w:tc>
           <w:tcPr>
-            <w:tcW w:w="1362" w:type="dxa"/>
+            <w:tcW w:w="1687" w:type="dxa"/>
             <w:vMerge/>
           </w:tcPr>
           <w:p>
@@ -753,7 +762,7 @@
         </w:tc>
         <w:tc>
           <w:tcPr>
-            <w:tcW w:w="2174" w:type="dxa"/>
+            <w:tcW w:w="2891" w:type="dxa"/>
             <w:vMerge/>
           </w:tcPr>
           <w:p>
@@ -764,7 +773,7 @@
         </w:tc>
         <w:tc>
           <w:tcPr>
-            <w:tcW w:w="3031" w:type="dxa"/>
+            <w:tcW w:w="2104" w:type="dxa"/>
           </w:tcPr>
           <w:p>
             <w:pPr>
@@ -777,7 +786,7 @@
         </w:tc>
         <w:tc>
           <w:tcPr>
-            <w:tcW w:w="2480" w:type="dxa"/>
+            <w:tcW w:w="2002" w:type="dxa"/>
           </w:tcPr>
           <w:p>
             <w:pPr>
@@ -796,7 +805,7 @@
         </w:tc>
         <w:tc>
           <w:tcPr>
-            <w:tcW w:w="512" w:type="dxa"/>
+            <w:tcW w:w="859" w:type="dxa"/>
           </w:tcPr>
           <w:p>
             <w:pPr>
@@ -808,37 +817,37 @@
       <w:tr>
         <w:tc>
           <w:tcPr>
-            <w:tcW w:w="737" w:type="dxa"/>
-          </w:tcPr>
-          <w:p/>
-        </w:tc>
-        <w:tc>
-          <w:tcPr>
-            <w:tcW w:w="1362" w:type="dxa"/>
-          </w:tcPr>
-          <w:p/>
-        </w:tc>
-        <w:tc>
-          <w:tcPr>
-            <w:tcW w:w="2174" w:type="dxa"/>
-          </w:tcPr>
-          <w:p/>
-        </w:tc>
-        <w:tc>
-          <w:tcPr>
-            <w:tcW w:w="3031" w:type="dxa"/>
-          </w:tcPr>
-          <w:p/>
-        </w:tc>
-        <w:tc>
-          <w:tcPr>
-            <w:tcW w:w="2480" w:type="dxa"/>
-          </w:tcPr>
-          <w:p/>
-        </w:tc>
-        <w:tc>
-          <w:tcPr>
-            <w:tcW w:w="512" w:type="dxa"/>
+            <w:tcW w:w="753" w:type="dxa"/>
+          </w:tcPr>
+          <w:p/>
+        </w:tc>
+        <w:tc>
+          <w:tcPr>
+            <w:tcW w:w="1687" w:type="dxa"/>
+          </w:tcPr>
+          <w:p/>
+        </w:tc>
+        <w:tc>
+          <w:tcPr>
+            <w:tcW w:w="2891" w:type="dxa"/>
+          </w:tcPr>
+          <w:p/>
+        </w:tc>
+        <w:tc>
+          <w:tcPr>
+            <w:tcW w:w="2104" w:type="dxa"/>
+          </w:tcPr>
+          <w:p/>
+        </w:tc>
+        <w:tc>
+          <w:tcPr>
+            <w:tcW w:w="2002" w:type="dxa"/>
+          </w:tcPr>
+          <w:p/>
+        </w:tc>
+        <w:tc>
+          <w:tcPr>
+            <w:tcW w:w="859" w:type="dxa"/>
           </w:tcPr>
           <w:p/>
         </w:tc>
@@ -846,7 +855,7 @@
       <w:tr>
         <w:tc>
           <w:tcPr>
-            <w:tcW w:w="737" w:type="dxa"/>
+            <w:tcW w:w="753" w:type="dxa"/>
             <w:vMerge w:val="restart"/>
           </w:tcPr>
           <w:p>
@@ -870,7 +879,7 @@
         </w:tc>
         <w:tc>
           <w:tcPr>
-            <w:tcW w:w="1362" w:type="dxa"/>
+            <w:tcW w:w="1687" w:type="dxa"/>
             <w:vMerge w:val="restart"/>
           </w:tcPr>
           <w:p/>
@@ -883,7 +892,7 @@
         </w:tc>
         <w:tc>
           <w:tcPr>
-            <w:tcW w:w="2174" w:type="dxa"/>
+            <w:tcW w:w="2891" w:type="dxa"/>
           </w:tcPr>
           <w:p>
             <w:r>
@@ -893,7 +902,7 @@
         </w:tc>
         <w:tc>
           <w:tcPr>
-            <w:tcW w:w="3031" w:type="dxa"/>
+            <w:tcW w:w="2104" w:type="dxa"/>
           </w:tcPr>
           <w:p>
             <w:pPr>
@@ -912,7 +921,7 @@
               <w:rPr>
                 <w:lang w:val="id-ID"/>
               </w:rPr>
-              <w:instrText xml:space="preserve"> MERGEFIELD persediaan_awal_pertamax </w:instrText>
+              <w:instrText xml:space="preserve"> MERGEFIELD Awal_PX_T1 </w:instrText>
             </w:r>
             <w:r>
               <w:rPr>
@@ -925,7 +934,7 @@
                 <w:noProof/>
                 <w:lang w:val="id-ID"/>
               </w:rPr>
-              <w:t>1,025</w:t>
+              <w:t>1000</w:t>
             </w:r>
             <w:r>
               <w:rPr>
@@ -937,7 +946,7 @@
         </w:tc>
         <w:tc>
           <w:tcPr>
-            <w:tcW w:w="2480" w:type="dxa"/>
+            <w:tcW w:w="2002" w:type="dxa"/>
           </w:tcPr>
           <w:p>
             <w:pPr>
@@ -956,7 +965,7 @@
               <w:rPr>
                 <w:lang w:val="id-ID"/>
               </w:rPr>
-              <w:instrText xml:space="preserve"> MERGEFIELD persediaan_awal_dex </w:instrText>
+              <w:instrText xml:space="preserve"> MERGEFIELD Awal_PDX_T1 </w:instrText>
             </w:r>
             <w:r>
               <w:rPr>
@@ -969,7 +978,7 @@
                 <w:noProof/>
                 <w:lang w:val="id-ID"/>
               </w:rPr>
-              <w:t>522</w:t>
+              <w:t>1000</w:t>
             </w:r>
             <w:r>
               <w:rPr>
@@ -981,7 +990,7 @@
         </w:tc>
         <w:tc>
           <w:tcPr>
-            <w:tcW w:w="512" w:type="dxa"/>
+            <w:tcW w:w="859" w:type="dxa"/>
           </w:tcPr>
           <w:p/>
         </w:tc>
@@ -989,7 +998,7 @@
       <w:tr>
         <w:tc>
           <w:tcPr>
-            <w:tcW w:w="737" w:type="dxa"/>
+            <w:tcW w:w="753" w:type="dxa"/>
             <w:vMerge/>
           </w:tcPr>
           <w:p>
@@ -1000,14 +1009,14 @@
         </w:tc>
         <w:tc>
           <w:tcPr>
-            <w:tcW w:w="1362" w:type="dxa"/>
+            <w:tcW w:w="1687" w:type="dxa"/>
             <w:vMerge/>
           </w:tcPr>
           <w:p/>
         </w:tc>
         <w:tc>
           <w:tcPr>
-            <w:tcW w:w="2174" w:type="dxa"/>
+            <w:tcW w:w="2891" w:type="dxa"/>
           </w:tcPr>
           <w:p>
             <w:r>
@@ -1017,7 +1026,7 @@
         </w:tc>
         <w:tc>
           <w:tcPr>
-            <w:tcW w:w="3031" w:type="dxa"/>
+            <w:tcW w:w="2104" w:type="dxa"/>
           </w:tcPr>
           <w:p>
             <w:pPr>
@@ -1036,7 +1045,7 @@
               <w:rPr>
                 <w:lang w:val="id-ID"/>
               </w:rPr>
-              <w:instrText xml:space="preserve"> MERGEFIELD penerimaan_pertamax </w:instrText>
+              <w:instrText xml:space="preserve"> MERGEFIELD Terima_PX_T1 </w:instrText>
             </w:r>
             <w:r>
               <w:rPr>
@@ -1049,7 +1058,7 @@
                 <w:noProof/>
                 <w:lang w:val="id-ID"/>
               </w:rPr>
-              <w:t>8,000</w:t>
+              <w:t>5000</w:t>
             </w:r>
             <w:r>
               <w:rPr>
@@ -1061,7 +1070,7 @@
         </w:tc>
         <w:tc>
           <w:tcPr>
-            <w:tcW w:w="2480" w:type="dxa"/>
+            <w:tcW w:w="2002" w:type="dxa"/>
           </w:tcPr>
           <w:p>
             <w:pPr>
@@ -1080,7 +1089,7 @@
               <w:rPr>
                 <w:lang w:val="id-ID"/>
               </w:rPr>
-              <w:instrText xml:space="preserve"> MERGEFIELD penerimaan_dex </w:instrText>
+              <w:instrText xml:space="preserve"> MERGEFIELD Terima_PDX_T1 </w:instrText>
             </w:r>
             <w:r>
               <w:rPr>
@@ -1093,7 +1102,7 @@
                 <w:noProof/>
                 <w:lang w:val="id-ID"/>
               </w:rPr>
-              <w:t>8,000</w:t>
+              <w:t>5000</w:t>
             </w:r>
             <w:r>
               <w:rPr>
@@ -1105,7 +1114,7 @@
         </w:tc>
         <w:tc>
           <w:tcPr>
-            <w:tcW w:w="512" w:type="dxa"/>
+            <w:tcW w:w="859" w:type="dxa"/>
           </w:tcPr>
           <w:p/>
         </w:tc>
@@ -1113,7 +1122,7 @@
       <w:tr>
         <w:tc>
           <w:tcPr>
-            <w:tcW w:w="737" w:type="dxa"/>
+            <w:tcW w:w="753" w:type="dxa"/>
             <w:vMerge/>
           </w:tcPr>
           <w:p>
@@ -1124,14 +1133,14 @@
         </w:tc>
         <w:tc>
           <w:tcPr>
-            <w:tcW w:w="1362" w:type="dxa"/>
+            <w:tcW w:w="1687" w:type="dxa"/>
             <w:vMerge/>
           </w:tcPr>
           <w:p/>
         </w:tc>
         <w:tc>
           <w:tcPr>
-            <w:tcW w:w="2174" w:type="dxa"/>
+            <w:tcW w:w="2891" w:type="dxa"/>
           </w:tcPr>
           <w:p>
             <w:r>
@@ -1141,7 +1150,7 @@
         </w:tc>
         <w:tc>
           <w:tcPr>
-            <w:tcW w:w="3031" w:type="dxa"/>
+            <w:tcW w:w="2104" w:type="dxa"/>
           </w:tcPr>
           <w:p>
             <w:pPr>
@@ -1160,7 +1169,7 @@
               <w:rPr>
                 <w:lang w:val="id-ID"/>
               </w:rPr>
-              <w:instrText xml:space="preserve"> MERGEFIELD jumlah_pertamax </w:instrText>
+              <w:instrText xml:space="preserve"> MERGEFIELD Jumlah_PX_T1 </w:instrText>
             </w:r>
             <w:r>
               <w:rPr>
@@ -1173,7 +1182,7 @@
                 <w:noProof/>
                 <w:lang w:val="id-ID"/>
               </w:rPr>
-              <w:t>9,025</w:t>
+              <w:t>6000</w:t>
             </w:r>
             <w:r>
               <w:rPr>
@@ -1185,7 +1194,7 @@
         </w:tc>
         <w:tc>
           <w:tcPr>
-            <w:tcW w:w="2480" w:type="dxa"/>
+            <w:tcW w:w="2002" w:type="dxa"/>
           </w:tcPr>
           <w:p>
             <w:pPr>
@@ -1204,7 +1213,7 @@
               <w:rPr>
                 <w:lang w:val="id-ID"/>
               </w:rPr>
-              <w:instrText xml:space="preserve"> MERGEFIELD jumlah_dex </w:instrText>
+              <w:instrText xml:space="preserve"> MERGEFIELD Jumlah_PDX_T1 </w:instrText>
             </w:r>
             <w:r>
               <w:rPr>
@@ -1217,7 +1226,7 @@
                 <w:noProof/>
                 <w:lang w:val="id-ID"/>
               </w:rPr>
-              <w:t>8,522</w:t>
+              <w:t>6000</w:t>
             </w:r>
             <w:r>
               <w:rPr>
@@ -1229,7 +1238,7 @@
         </w:tc>
         <w:tc>
           <w:tcPr>
-            <w:tcW w:w="512" w:type="dxa"/>
+            <w:tcW w:w="859" w:type="dxa"/>
           </w:tcPr>
           <w:p/>
         </w:tc>
@@ -1237,7 +1246,7 @@
       <w:tr>
         <w:tc>
           <w:tcPr>
-            <w:tcW w:w="737" w:type="dxa"/>
+            <w:tcW w:w="753" w:type="dxa"/>
             <w:vMerge/>
           </w:tcPr>
           <w:p>
@@ -1248,14 +1257,14 @@
         </w:tc>
         <w:tc>
           <w:tcPr>
-            <w:tcW w:w="1362" w:type="dxa"/>
+            <w:tcW w:w="1687" w:type="dxa"/>
             <w:vMerge/>
           </w:tcPr>
           <w:p/>
         </w:tc>
         <w:tc>
           <w:tcPr>
-            <w:tcW w:w="2174" w:type="dxa"/>
+            <w:tcW w:w="2891" w:type="dxa"/>
           </w:tcPr>
           <w:p>
             <w:r>
@@ -1265,7 +1274,7 @@
         </w:tc>
         <w:tc>
           <w:tcPr>
-            <w:tcW w:w="3031" w:type="dxa"/>
+            <w:tcW w:w="2104" w:type="dxa"/>
           </w:tcPr>
           <w:p>
             <w:pPr>
@@ -1284,7 +1293,7 @@
               <w:rPr>
                 <w:lang w:val="id-ID"/>
               </w:rPr>
-              <w:instrText xml:space="preserve"> MERGEFIELD pengeluaran_pertamax </w:instrText>
+              <w:instrText xml:space="preserve"> MERGEFIELD Keluar_PX_T1 </w:instrText>
             </w:r>
             <w:r>
               <w:rPr>
@@ -1297,7 +1306,7 @@
                 <w:noProof/>
                 <w:lang w:val="id-ID"/>
               </w:rPr>
-              <w:t>3,060</w:t>
+              <w:t>1000</w:t>
             </w:r>
             <w:r>
               <w:rPr>
@@ -1309,7 +1318,7 @@
         </w:tc>
         <w:tc>
           <w:tcPr>
-            <w:tcW w:w="2480" w:type="dxa"/>
+            <w:tcW w:w="2002" w:type="dxa"/>
           </w:tcPr>
           <w:p>
             <w:pPr>
@@ -1328,7 +1337,7 @@
               <w:rPr>
                 <w:lang w:val="id-ID"/>
               </w:rPr>
-              <w:instrText xml:space="preserve"> MERGEFIELD pengeluaran_dex </w:instrText>
+              <w:instrText xml:space="preserve"> MERGEFIELD Keluar_PDX_T1 </w:instrText>
             </w:r>
             <w:r>
               <w:rPr>
@@ -1341,7 +1350,7 @@
                 <w:noProof/>
                 <w:lang w:val="id-ID"/>
               </w:rPr>
-              <w:t>2,587</w:t>
+              <w:t>1000</w:t>
             </w:r>
             <w:r>
               <w:rPr>
@@ -1353,7 +1362,7 @@
         </w:tc>
         <w:tc>
           <w:tcPr>
-            <w:tcW w:w="512" w:type="dxa"/>
+            <w:tcW w:w="859" w:type="dxa"/>
           </w:tcPr>
           <w:p/>
         </w:tc>
@@ -1361,7 +1370,7 @@
       <w:tr>
         <w:tc>
           <w:tcPr>
-            <w:tcW w:w="737" w:type="dxa"/>
+            <w:tcW w:w="753" w:type="dxa"/>
             <w:vMerge/>
           </w:tcPr>
           <w:p>
@@ -1372,14 +1381,14 @@
         </w:tc>
         <w:tc>
           <w:tcPr>
-            <w:tcW w:w="1362" w:type="dxa"/>
+            <w:tcW w:w="1687" w:type="dxa"/>
             <w:vMerge/>
           </w:tcPr>
           <w:p/>
         </w:tc>
         <w:tc>
           <w:tcPr>
-            <w:tcW w:w="2174" w:type="dxa"/>
+            <w:tcW w:w="2891" w:type="dxa"/>
           </w:tcPr>
           <w:p>
             <w:r>
@@ -1389,7 +1398,7 @@
         </w:tc>
         <w:tc>
           <w:tcPr>
-            <w:tcW w:w="3031" w:type="dxa"/>
+            <w:tcW w:w="2104" w:type="dxa"/>
           </w:tcPr>
           <w:p>
             <w:pPr>
@@ -1411,7 +1420,7 @@
                 <w:b/>
                 <w:lang w:val="id-ID"/>
               </w:rPr>
-              <w:instrText xml:space="preserve"> MERGEFIELD persediaan_akhir_pertamax </w:instrText>
+              <w:instrText xml:space="preserve"> MERGEFIELD Akhir_PX_T1 </w:instrText>
             </w:r>
             <w:r>
               <w:rPr>
@@ -1426,7 +1435,7 @@
                 <w:noProof/>
                 <w:lang w:val="id-ID"/>
               </w:rPr>
-              <w:t>5,965</w:t>
+              <w:t>5000</w:t>
             </w:r>
             <w:r>
               <w:rPr>
@@ -1439,7 +1448,7 @@
         </w:tc>
         <w:tc>
           <w:tcPr>
-            <w:tcW w:w="2480" w:type="dxa"/>
+            <w:tcW w:w="2002" w:type="dxa"/>
           </w:tcPr>
           <w:p>
             <w:pPr>
@@ -1461,7 +1470,7 @@
                 <w:b/>
                 <w:lang w:val="id-ID"/>
               </w:rPr>
-              <w:instrText xml:space="preserve"> MERGEFIELD persediaan_akhir_dex </w:instrText>
+              <w:instrText xml:space="preserve"> MERGEFIELD Akhir_PDX_T1 </w:instrText>
             </w:r>
             <w:r>
               <w:rPr>
@@ -1476,7 +1485,7 @@
                 <w:noProof/>
                 <w:lang w:val="id-ID"/>
               </w:rPr>
-              <w:t>5,935</w:t>
+              <w:t>5000</w:t>
             </w:r>
             <w:r>
               <w:rPr>
@@ -1489,7 +1498,7 @@
         </w:tc>
         <w:tc>
           <w:tcPr>
-            <w:tcW w:w="512" w:type="dxa"/>
+            <w:tcW w:w="859" w:type="dxa"/>
           </w:tcPr>
           <w:p/>
         </w:tc>
@@ -1497,49 +1506,49 @@
       <w:tr>
         <w:tc>
           <w:tcPr>
-            <w:tcW w:w="737" w:type="dxa"/>
-          </w:tcPr>
-          <w:p>
-            <w:pPr>
-              <w:jc w:val="center"/>
-            </w:pPr>
-          </w:p>
-        </w:tc>
-        <w:tc>
-          <w:tcPr>
-            <w:tcW w:w="1362" w:type="dxa"/>
-          </w:tcPr>
-          <w:p/>
-        </w:tc>
-        <w:tc>
-          <w:tcPr>
-            <w:tcW w:w="2174" w:type="dxa"/>
-          </w:tcPr>
-          <w:p/>
-        </w:tc>
-        <w:tc>
-          <w:tcPr>
-            <w:tcW w:w="3031" w:type="dxa"/>
-          </w:tcPr>
-          <w:p>
-            <w:pPr>
-              <w:jc w:val="center"/>
-            </w:pPr>
-          </w:p>
-        </w:tc>
-        <w:tc>
-          <w:tcPr>
-            <w:tcW w:w="2480" w:type="dxa"/>
-          </w:tcPr>
-          <w:p>
-            <w:pPr>
-              <w:jc w:val="center"/>
-            </w:pPr>
-          </w:p>
-        </w:tc>
-        <w:tc>
-          <w:tcPr>
-            <w:tcW w:w="512" w:type="dxa"/>
+            <w:tcW w:w="753" w:type="dxa"/>
+          </w:tcPr>
+          <w:p>
+            <w:pPr>
+              <w:jc w:val="center"/>
+            </w:pPr>
+          </w:p>
+        </w:tc>
+        <w:tc>
+          <w:tcPr>
+            <w:tcW w:w="1687" w:type="dxa"/>
+          </w:tcPr>
+          <w:p/>
+        </w:tc>
+        <w:tc>
+          <w:tcPr>
+            <w:tcW w:w="2891" w:type="dxa"/>
+          </w:tcPr>
+          <w:p/>
+        </w:tc>
+        <w:tc>
+          <w:tcPr>
+            <w:tcW w:w="2104" w:type="dxa"/>
+          </w:tcPr>
+          <w:p>
+            <w:pPr>
+              <w:jc w:val="center"/>
+            </w:pPr>
+          </w:p>
+        </w:tc>
+        <w:tc>
+          <w:tcPr>
+            <w:tcW w:w="2002" w:type="dxa"/>
+          </w:tcPr>
+          <w:p>
+            <w:pPr>
+              <w:jc w:val="center"/>
+            </w:pPr>
+          </w:p>
+        </w:tc>
+        <w:tc>
+          <w:tcPr>
+            <w:tcW w:w="859" w:type="dxa"/>
           </w:tcPr>
           <w:p/>
         </w:tc>
@@ -1547,7 +1556,7 @@
       <w:tr>
         <w:tc>
           <w:tcPr>
-            <w:tcW w:w="737" w:type="dxa"/>
+            <w:tcW w:w="753" w:type="dxa"/>
             <w:vMerge w:val="restart"/>
             <w:vAlign w:val="center"/>
           </w:tcPr>
@@ -1584,7 +1593,7 @@
         </w:tc>
         <w:tc>
           <w:tcPr>
-            <w:tcW w:w="1362" w:type="dxa"/>
+            <w:tcW w:w="1687" w:type="dxa"/>
             <w:vMerge w:val="restart"/>
             <w:vAlign w:val="center"/>
           </w:tcPr>
@@ -1599,7 +1608,7 @@
         </w:tc>
         <w:tc>
           <w:tcPr>
-            <w:tcW w:w="2174" w:type="dxa"/>
+            <w:tcW w:w="2891" w:type="dxa"/>
           </w:tcPr>
           <w:p>
             <w:r>
@@ -1609,7 +1618,7 @@
         </w:tc>
         <w:tc>
           <w:tcPr>
-            <w:tcW w:w="3031" w:type="dxa"/>
+            <w:tcW w:w="2104" w:type="dxa"/>
           </w:tcPr>
           <w:p>
             <w:pPr>
@@ -1628,7 +1637,7 @@
               <w:rPr>
                 <w:lang w:val="id-ID"/>
               </w:rPr>
-              <w:instrText xml:space="preserve"> MERGEFIELD persediaan_awal_pertamax </w:instrText>
+              <w:instrText xml:space="preserve"> MERGEFIELD Awal_PX_T2 </w:instrText>
             </w:r>
             <w:r>
               <w:rPr>
@@ -1641,7 +1650,7 @@
                 <w:noProof/>
                 <w:lang w:val="id-ID"/>
               </w:rPr>
-              <w:t>1,025</w:t>
+              <w:t>5000</w:t>
             </w:r>
             <w:r>
               <w:rPr>
@@ -1653,7 +1662,7 @@
         </w:tc>
         <w:tc>
           <w:tcPr>
-            <w:tcW w:w="2480" w:type="dxa"/>
+            <w:tcW w:w="2002" w:type="dxa"/>
           </w:tcPr>
           <w:p>
             <w:pPr>
@@ -1672,7 +1681,7 @@
               <w:rPr>
                 <w:lang w:val="id-ID"/>
               </w:rPr>
-              <w:instrText xml:space="preserve"> MERGEFIELD persediaan_awal_dex </w:instrText>
+              <w:instrText xml:space="preserve"> MERGEFIELD Awal_PDX_T2 </w:instrText>
             </w:r>
             <w:r>
               <w:rPr>
@@ -1685,7 +1694,7 @@
                 <w:noProof/>
                 <w:lang w:val="id-ID"/>
               </w:rPr>
-              <w:t>522</w:t>
+              <w:t>5000</w:t>
             </w:r>
             <w:r>
               <w:rPr>
@@ -1697,7 +1706,7 @@
         </w:tc>
         <w:tc>
           <w:tcPr>
-            <w:tcW w:w="512" w:type="dxa"/>
+            <w:tcW w:w="859" w:type="dxa"/>
           </w:tcPr>
           <w:p/>
         </w:tc>
@@ -1705,7 +1714,7 @@
       <w:tr>
         <w:tc>
           <w:tcPr>
-            <w:tcW w:w="737" w:type="dxa"/>
+            <w:tcW w:w="753" w:type="dxa"/>
             <w:vMerge/>
           </w:tcPr>
           <w:p>
@@ -1716,14 +1725,14 @@
         </w:tc>
         <w:tc>
           <w:tcPr>
-            <w:tcW w:w="1362" w:type="dxa"/>
+            <w:tcW w:w="1687" w:type="dxa"/>
             <w:vMerge/>
           </w:tcPr>
           <w:p/>
         </w:tc>
         <w:tc>
           <w:tcPr>
-            <w:tcW w:w="2174" w:type="dxa"/>
+            <w:tcW w:w="2891" w:type="dxa"/>
           </w:tcPr>
           <w:p>
             <w:r>
@@ -1736,7 +1745,7 @@
         </w:tc>
         <w:tc>
           <w:tcPr>
-            <w:tcW w:w="3031" w:type="dxa"/>
+            <w:tcW w:w="2104" w:type="dxa"/>
           </w:tcPr>
           <w:p>
             <w:pPr>
@@ -1755,7 +1764,7 @@
               <w:rPr>
                 <w:lang w:val="id-ID"/>
               </w:rPr>
-              <w:instrText xml:space="preserve"> MERGEFIELD penerimaan_pertamax </w:instrText>
+              <w:instrText xml:space="preserve"> MERGEFIELD Terima_PX_T2 </w:instrText>
             </w:r>
             <w:r>
               <w:rPr>
@@ -1768,7 +1777,7 @@
                 <w:noProof/>
                 <w:lang w:val="id-ID"/>
               </w:rPr>
-              <w:t>8,000</w:t>
+              <w:t>0</w:t>
             </w:r>
             <w:r>
               <w:rPr>
@@ -1780,7 +1789,7 @@
         </w:tc>
         <w:tc>
           <w:tcPr>
-            <w:tcW w:w="2480" w:type="dxa"/>
+            <w:tcW w:w="2002" w:type="dxa"/>
           </w:tcPr>
           <w:p>
             <w:pPr>
@@ -1799,7 +1808,7 @@
               <w:rPr>
                 <w:lang w:val="id-ID"/>
               </w:rPr>
-              <w:instrText xml:space="preserve"> MERGEFIELD penerimaan_dex </w:instrText>
+              <w:instrText xml:space="preserve"> MERGEFIELD Terima_PDX_T2 </w:instrText>
             </w:r>
             <w:r>
               <w:rPr>
@@ -1812,7 +1821,7 @@
                 <w:noProof/>
                 <w:lang w:val="id-ID"/>
               </w:rPr>
-              <w:t>8,000</w:t>
+              <w:t>0</w:t>
             </w:r>
             <w:r>
               <w:rPr>
@@ -1824,7 +1833,7 @@
         </w:tc>
         <w:tc>
           <w:tcPr>
-            <w:tcW w:w="512" w:type="dxa"/>
+            <w:tcW w:w="859" w:type="dxa"/>
           </w:tcPr>
           <w:p/>
         </w:tc>
@@ -1832,7 +1841,7 @@
       <w:tr>
         <w:tc>
           <w:tcPr>
-            <w:tcW w:w="737" w:type="dxa"/>
+            <w:tcW w:w="753" w:type="dxa"/>
             <w:vMerge/>
           </w:tcPr>
           <w:p>
@@ -1843,14 +1852,14 @@
         </w:tc>
         <w:tc>
           <w:tcPr>
-            <w:tcW w:w="1362" w:type="dxa"/>
+            <w:tcW w:w="1687" w:type="dxa"/>
             <w:vMerge/>
           </w:tcPr>
           <w:p/>
         </w:tc>
         <w:tc>
           <w:tcPr>
-            <w:tcW w:w="2174" w:type="dxa"/>
+            <w:tcW w:w="2891" w:type="dxa"/>
           </w:tcPr>
           <w:p>
             <w:r>
@@ -1860,7 +1869,7 @@
         </w:tc>
         <w:tc>
           <w:tcPr>
-            <w:tcW w:w="3031" w:type="dxa"/>
+            <w:tcW w:w="2104" w:type="dxa"/>
           </w:tcPr>
           <w:p>
             <w:pPr>
@@ -1879,7 +1888,7 @@
               <w:rPr>
                 <w:lang w:val="id-ID"/>
               </w:rPr>
-              <w:instrText xml:space="preserve"> MERGEFIELD jumlah_pertamax </w:instrText>
+              <w:instrText xml:space="preserve"> MERGEFIELD Jumlah_PX_T2 </w:instrText>
             </w:r>
             <w:r>
               <w:rPr>
@@ -1892,7 +1901,7 @@
                 <w:noProof/>
                 <w:lang w:val="id-ID"/>
               </w:rPr>
-              <w:t>9,025</w:t>
+              <w:t>5000</w:t>
             </w:r>
             <w:r>
               <w:rPr>
@@ -1904,7 +1913,7 @@
         </w:tc>
         <w:tc>
           <w:tcPr>
-            <w:tcW w:w="2480" w:type="dxa"/>
+            <w:tcW w:w="2002" w:type="dxa"/>
           </w:tcPr>
           <w:p>
             <w:pPr>
@@ -1923,7 +1932,7 @@
               <w:rPr>
                 <w:lang w:val="id-ID"/>
               </w:rPr>
-              <w:instrText xml:space="preserve"> MERGEFIELD jumlah_dex </w:instrText>
+              <w:instrText xml:space="preserve"> MERGEFIELD Jumlah_PDX_T2 </w:instrText>
             </w:r>
             <w:r>
               <w:rPr>
@@ -1936,7 +1945,7 @@
                 <w:noProof/>
                 <w:lang w:val="id-ID"/>
               </w:rPr>
-              <w:t>8,522</w:t>
+              <w:t>5000</w:t>
             </w:r>
             <w:r>
               <w:rPr>
@@ -1948,7 +1957,7 @@
         </w:tc>
         <w:tc>
           <w:tcPr>
-            <w:tcW w:w="512" w:type="dxa"/>
+            <w:tcW w:w="859" w:type="dxa"/>
           </w:tcPr>
           <w:p/>
         </w:tc>
@@ -1956,7 +1965,7 @@
       <w:tr>
         <w:tc>
           <w:tcPr>
-            <w:tcW w:w="737" w:type="dxa"/>
+            <w:tcW w:w="753" w:type="dxa"/>
             <w:vMerge/>
           </w:tcPr>
           <w:p>
@@ -1967,14 +1976,14 @@
         </w:tc>
         <w:tc>
           <w:tcPr>
-            <w:tcW w:w="1362" w:type="dxa"/>
+            <w:tcW w:w="1687" w:type="dxa"/>
             <w:vMerge/>
           </w:tcPr>
           <w:p/>
         </w:tc>
         <w:tc>
           <w:tcPr>
-            <w:tcW w:w="2174" w:type="dxa"/>
+            <w:tcW w:w="2891" w:type="dxa"/>
           </w:tcPr>
           <w:p>
             <w:pPr>
@@ -1989,7 +1998,7 @@
         </w:tc>
         <w:tc>
           <w:tcPr>
-            <w:tcW w:w="3031" w:type="dxa"/>
+            <w:tcW w:w="2104" w:type="dxa"/>
           </w:tcPr>
           <w:p>
             <w:pPr>
@@ -2008,7 +2017,7 @@
               <w:rPr>
                 <w:lang w:val="id-ID"/>
               </w:rPr>
-              <w:instrText xml:space="preserve"> MERGEFIELD pengeluaran_pertamax </w:instrText>
+              <w:instrText xml:space="preserve"> MERGEFIELD Keluar_PX_T2 </w:instrText>
             </w:r>
             <w:r>
               <w:rPr>
@@ -2021,7 +2030,7 @@
                 <w:noProof/>
                 <w:lang w:val="id-ID"/>
               </w:rPr>
-              <w:t>3,060</w:t>
+              <w:t>1000</w:t>
             </w:r>
             <w:r>
               <w:rPr>
@@ -2033,7 +2042,7 @@
         </w:tc>
         <w:tc>
           <w:tcPr>
-            <w:tcW w:w="2480" w:type="dxa"/>
+            <w:tcW w:w="2002" w:type="dxa"/>
           </w:tcPr>
           <w:p>
             <w:pPr>
@@ -2052,7 +2061,7 @@
               <w:rPr>
                 <w:lang w:val="id-ID"/>
               </w:rPr>
-              <w:instrText xml:space="preserve"> MERGEFIELD pengeluaran_dex </w:instrText>
+              <w:instrText xml:space="preserve"> MERGEFIELD Keluar_PDX_T2 </w:instrText>
             </w:r>
             <w:r>
               <w:rPr>
@@ -2065,7 +2074,7 @@
                 <w:noProof/>
                 <w:lang w:val="id-ID"/>
               </w:rPr>
-              <w:t>2,587</w:t>
+              <w:t>1000</w:t>
             </w:r>
             <w:r>
               <w:rPr>
@@ -2077,7 +2086,7 @@
         </w:tc>
         <w:tc>
           <w:tcPr>
-            <w:tcW w:w="512" w:type="dxa"/>
+            <w:tcW w:w="859" w:type="dxa"/>
           </w:tcPr>
           <w:p/>
         </w:tc>
@@ -2085,7 +2094,7 @@
       <w:tr>
         <w:tc>
           <w:tcPr>
-            <w:tcW w:w="737" w:type="dxa"/>
+            <w:tcW w:w="753" w:type="dxa"/>
             <w:vMerge/>
           </w:tcPr>
           <w:p>
@@ -2096,14 +2105,14 @@
         </w:tc>
         <w:tc>
           <w:tcPr>
-            <w:tcW w:w="1362" w:type="dxa"/>
+            <w:tcW w:w="1687" w:type="dxa"/>
             <w:vMerge/>
           </w:tcPr>
           <w:p/>
         </w:tc>
         <w:tc>
           <w:tcPr>
-            <w:tcW w:w="2174" w:type="dxa"/>
+            <w:tcW w:w="2891" w:type="dxa"/>
           </w:tcPr>
           <w:p>
             <w:r>
@@ -2113,7 +2122,7 @@
         </w:tc>
         <w:tc>
           <w:tcPr>
-            <w:tcW w:w="3031" w:type="dxa"/>
+            <w:tcW w:w="2104" w:type="dxa"/>
           </w:tcPr>
           <w:p>
             <w:pPr>
@@ -2135,7 +2144,7 @@
                 <w:b/>
                 <w:lang w:val="id-ID"/>
               </w:rPr>
-              <w:instrText xml:space="preserve"> MERGEFIELD persediaan_akhir_pertamax </w:instrText>
+              <w:instrText xml:space="preserve"> MERGEFIELD Akhir_PX_T2 </w:instrText>
             </w:r>
             <w:r>
               <w:rPr>
@@ -2150,7 +2159,7 @@
                 <w:noProof/>
                 <w:lang w:val="id-ID"/>
               </w:rPr>
-              <w:t>5,965</w:t>
+              <w:t>4000</w:t>
             </w:r>
             <w:r>
               <w:rPr>
@@ -2163,7 +2172,7 @@
         </w:tc>
         <w:tc>
           <w:tcPr>
-            <w:tcW w:w="2480" w:type="dxa"/>
+            <w:tcW w:w="2002" w:type="dxa"/>
           </w:tcPr>
           <w:p>
             <w:pPr>
@@ -2185,7 +2194,7 @@
                 <w:b/>
                 <w:lang w:val="id-ID"/>
               </w:rPr>
-              <w:instrText xml:space="preserve"> MERGEFIELD persediaan_akhir_dex </w:instrText>
+              <w:instrText xml:space="preserve"> MERGEFIELD Akhir_PDX_T2 </w:instrText>
             </w:r>
             <w:r>
               <w:rPr>
@@ -2200,7 +2209,7 @@
                 <w:noProof/>
                 <w:lang w:val="id-ID"/>
               </w:rPr>
-              <w:t>5,935</w:t>
+              <w:t>4000</w:t>
             </w:r>
             <w:r>
               <w:rPr>
@@ -2213,7 +2222,7 @@
         </w:tc>
         <w:tc>
           <w:tcPr>
-            <w:tcW w:w="512" w:type="dxa"/>
+            <w:tcW w:w="859" w:type="dxa"/>
           </w:tcPr>
           <w:p/>
         </w:tc>
@@ -2221,49 +2230,49 @@
       <w:tr>
         <w:tc>
           <w:tcPr>
-            <w:tcW w:w="737" w:type="dxa"/>
-          </w:tcPr>
-          <w:p>
-            <w:pPr>
-              <w:jc w:val="center"/>
-            </w:pPr>
-          </w:p>
-        </w:tc>
-        <w:tc>
-          <w:tcPr>
-            <w:tcW w:w="1362" w:type="dxa"/>
-          </w:tcPr>
-          <w:p/>
-        </w:tc>
-        <w:tc>
-          <w:tcPr>
-            <w:tcW w:w="2174" w:type="dxa"/>
-          </w:tcPr>
-          <w:p/>
-        </w:tc>
-        <w:tc>
-          <w:tcPr>
-            <w:tcW w:w="3031" w:type="dxa"/>
-          </w:tcPr>
-          <w:p>
-            <w:pPr>
-              <w:jc w:val="center"/>
-            </w:pPr>
-          </w:p>
-        </w:tc>
-        <w:tc>
-          <w:tcPr>
-            <w:tcW w:w="2480" w:type="dxa"/>
-          </w:tcPr>
-          <w:p>
-            <w:pPr>
-              <w:jc w:val="center"/>
-            </w:pPr>
-          </w:p>
-        </w:tc>
-        <w:tc>
-          <w:tcPr>
-            <w:tcW w:w="512" w:type="dxa"/>
+            <w:tcW w:w="753" w:type="dxa"/>
+          </w:tcPr>
+          <w:p>
+            <w:pPr>
+              <w:jc w:val="center"/>
+            </w:pPr>
+          </w:p>
+        </w:tc>
+        <w:tc>
+          <w:tcPr>
+            <w:tcW w:w="1687" w:type="dxa"/>
+          </w:tcPr>
+          <w:p/>
+        </w:tc>
+        <w:tc>
+          <w:tcPr>
+            <w:tcW w:w="2891" w:type="dxa"/>
+          </w:tcPr>
+          <w:p/>
+        </w:tc>
+        <w:tc>
+          <w:tcPr>
+            <w:tcW w:w="2104" w:type="dxa"/>
+          </w:tcPr>
+          <w:p>
+            <w:pPr>
+              <w:jc w:val="center"/>
+            </w:pPr>
+          </w:p>
+        </w:tc>
+        <w:tc>
+          <w:tcPr>
+            <w:tcW w:w="2002" w:type="dxa"/>
+          </w:tcPr>
+          <w:p>
+            <w:pPr>
+              <w:jc w:val="center"/>
+            </w:pPr>
+          </w:p>
+        </w:tc>
+        <w:tc>
+          <w:tcPr>
+            <w:tcW w:w="859" w:type="dxa"/>
           </w:tcPr>
           <w:p/>
         </w:tc>
@@ -2271,7 +2280,7 @@
       <w:tr>
         <w:tc>
           <w:tcPr>
-            <w:tcW w:w="737" w:type="dxa"/>
+            <w:tcW w:w="753" w:type="dxa"/>
             <w:vMerge w:val="restart"/>
             <w:vAlign w:val="center"/>
           </w:tcPr>
@@ -2279,11 +2288,6 @@
             <w:pPr>
               <w:jc w:val="center"/>
             </w:pPr>
-          </w:p>
-          <w:p>
-            <w:pPr>
-              <w:jc w:val="center"/>
-            </w:pPr>
             <w:r>
               <w:t>3</w:t>
             </w:r>
@@ -2291,7 +2295,7 @@
         </w:tc>
         <w:tc>
           <w:tcPr>
-            <w:tcW w:w="1362" w:type="dxa"/>
+            <w:tcW w:w="1687" w:type="dxa"/>
             <w:vMerge w:val="restart"/>
             <w:vAlign w:val="center"/>
           </w:tcPr>
@@ -2300,15 +2304,10 @@
               <w:jc w:val="center"/>
             </w:pPr>
           </w:p>
-          <w:p>
-            <w:pPr>
-              <w:jc w:val="center"/>
-            </w:pPr>
-          </w:p>
-        </w:tc>
-        <w:tc>
-          <w:tcPr>
-            <w:tcW w:w="2174" w:type="dxa"/>
+        </w:tc>
+        <w:tc>
+          <w:tcPr>
+            <w:tcW w:w="2891" w:type="dxa"/>
           </w:tcPr>
           <w:p>
             <w:pPr>
@@ -2326,7 +2325,7 @@
         </w:tc>
         <w:tc>
           <w:tcPr>
-            <w:tcW w:w="3031" w:type="dxa"/>
+            <w:tcW w:w="2104" w:type="dxa"/>
           </w:tcPr>
           <w:p>
             <w:pPr>
@@ -2345,7 +2344,19 @@
               <w:rPr>
                 <w:lang w:val="id-ID"/>
               </w:rPr>
-              <w:instrText xml:space="preserve"> MERGEFIELD persediaan_awal_pertamax </w:instrText>
+              <w:instrText xml:space="preserve"> MERGEFIELD Awal_PX_T</w:instrText>
+            </w:r>
+            <w:r>
+              <w:rPr>
+                <w:lang w:val="id-ID"/>
+              </w:rPr>
+              <w:instrText>3</w:instrText>
+            </w:r>
+            <w:r>
+              <w:rPr>
+                <w:lang w:val="id-ID"/>
+              </w:rPr>
+              <w:instrText xml:space="preserve"> </w:instrText>
             </w:r>
             <w:r>
               <w:rPr>
@@ -2358,7 +2369,7 @@
                 <w:noProof/>
                 <w:lang w:val="id-ID"/>
               </w:rPr>
-              <w:t>1,025</w:t>
+              <w:t>4000</w:t>
             </w:r>
             <w:r>
               <w:rPr>
@@ -2370,7 +2381,7 @@
         </w:tc>
         <w:tc>
           <w:tcPr>
-            <w:tcW w:w="2480" w:type="dxa"/>
+            <w:tcW w:w="2002" w:type="dxa"/>
           </w:tcPr>
           <w:p>
             <w:pPr>
@@ -2389,7 +2400,19 @@
               <w:rPr>
                 <w:lang w:val="id-ID"/>
               </w:rPr>
-              <w:instrText xml:space="preserve"> MERGEFIELD persediaan_awal_dex </w:instrText>
+              <w:instrText xml:space="preserve"> MERGEFIELD Awal_PDX_T</w:instrText>
+            </w:r>
+            <w:r>
+              <w:rPr>
+                <w:lang w:val="id-ID"/>
+              </w:rPr>
+              <w:instrText>3</w:instrText>
+            </w:r>
+            <w:r>
+              <w:rPr>
+                <w:lang w:val="id-ID"/>
+              </w:rPr>
+              <w:instrText xml:space="preserve"> </w:instrText>
             </w:r>
             <w:r>
               <w:rPr>
@@ -2402,7 +2425,7 @@
                 <w:noProof/>
                 <w:lang w:val="id-ID"/>
               </w:rPr>
-              <w:t>522</w:t>
+              <w:t>4000</w:t>
             </w:r>
             <w:r>
               <w:rPr>
@@ -2414,7 +2437,7 @@
         </w:tc>
         <w:tc>
           <w:tcPr>
-            <w:tcW w:w="512" w:type="dxa"/>
+            <w:tcW w:w="859" w:type="dxa"/>
           </w:tcPr>
           <w:p/>
         </w:tc>
@@ -2422,7 +2445,7 @@
       <w:tr>
         <w:tc>
           <w:tcPr>
-            <w:tcW w:w="737" w:type="dxa"/>
+            <w:tcW w:w="753" w:type="dxa"/>
             <w:vMerge/>
           </w:tcPr>
           <w:p>
@@ -2433,7 +2456,7 @@
         </w:tc>
         <w:tc>
           <w:tcPr>
-            <w:tcW w:w="1362" w:type="dxa"/>
+            <w:tcW w:w="1687" w:type="dxa"/>
             <w:vMerge/>
           </w:tcPr>
           <w:p>
@@ -2444,7 +2467,7 @@
         </w:tc>
         <w:tc>
           <w:tcPr>
-            <w:tcW w:w="2174" w:type="dxa"/>
+            <w:tcW w:w="2891" w:type="dxa"/>
           </w:tcPr>
           <w:p>
             <w:r>
@@ -2454,7 +2477,7 @@
         </w:tc>
         <w:tc>
           <w:tcPr>
-            <w:tcW w:w="3031" w:type="dxa"/>
+            <w:tcW w:w="2104" w:type="dxa"/>
           </w:tcPr>
           <w:p>
             <w:pPr>
@@ -2473,7 +2496,19 @@
               <w:rPr>
                 <w:lang w:val="id-ID"/>
               </w:rPr>
-              <w:instrText xml:space="preserve"> MERGEFIELD penerimaan_pertamax </w:instrText>
+              <w:instrText xml:space="preserve"> MERGEFIELD Terima_PX_T</w:instrText>
+            </w:r>
+            <w:r>
+              <w:rPr>
+                <w:lang w:val="id-ID"/>
+              </w:rPr>
+              <w:instrText>3</w:instrText>
+            </w:r>
+            <w:r>
+              <w:rPr>
+                <w:lang w:val="id-ID"/>
+              </w:rPr>
+              <w:instrText xml:space="preserve"> </w:instrText>
             </w:r>
             <w:r>
               <w:rPr>
@@ -2486,7 +2521,7 @@
                 <w:noProof/>
                 <w:lang w:val="id-ID"/>
               </w:rPr>
-              <w:t>8,000</w:t>
+              <w:t>0</w:t>
             </w:r>
             <w:r>
               <w:rPr>
@@ -2498,7 +2533,7 @@
         </w:tc>
         <w:tc>
           <w:tcPr>
-            <w:tcW w:w="2480" w:type="dxa"/>
+            <w:tcW w:w="2002" w:type="dxa"/>
           </w:tcPr>
           <w:p>
             <w:pPr>
@@ -2517,7 +2552,19 @@
               <w:rPr>
                 <w:lang w:val="id-ID"/>
               </w:rPr>
-              <w:instrText xml:space="preserve"> MERGEFIELD penerimaan_dex </w:instrText>
+              <w:instrText xml:space="preserve"> MERGEFIELD Terima_PDX_T</w:instrText>
+            </w:r>
+            <w:r>
+              <w:rPr>
+                <w:lang w:val="id-ID"/>
+              </w:rPr>
+              <w:instrText>3</w:instrText>
+            </w:r>
+            <w:r>
+              <w:rPr>
+                <w:lang w:val="id-ID"/>
+              </w:rPr>
+              <w:instrText xml:space="preserve"> </w:instrText>
             </w:r>
             <w:r>
               <w:rPr>
@@ -2530,7 +2577,7 @@
                 <w:noProof/>
                 <w:lang w:val="id-ID"/>
               </w:rPr>
-              <w:t>8,000</w:t>
+              <w:t>0</w:t>
             </w:r>
             <w:r>
               <w:rPr>
@@ -2542,7 +2589,7 @@
         </w:tc>
         <w:tc>
           <w:tcPr>
-            <w:tcW w:w="512" w:type="dxa"/>
+            <w:tcW w:w="859" w:type="dxa"/>
           </w:tcPr>
           <w:p/>
         </w:tc>
@@ -2550,7 +2597,7 @@
       <w:tr>
         <w:tc>
           <w:tcPr>
-            <w:tcW w:w="737" w:type="dxa"/>
+            <w:tcW w:w="753" w:type="dxa"/>
             <w:vMerge/>
           </w:tcPr>
           <w:p>
@@ -2561,14 +2608,14 @@
         </w:tc>
         <w:tc>
           <w:tcPr>
-            <w:tcW w:w="1362" w:type="dxa"/>
+            <w:tcW w:w="1687" w:type="dxa"/>
             <w:vMerge/>
           </w:tcPr>
           <w:p/>
         </w:tc>
         <w:tc>
           <w:tcPr>
-            <w:tcW w:w="2174" w:type="dxa"/>
+            <w:tcW w:w="2891" w:type="dxa"/>
           </w:tcPr>
           <w:p>
             <w:r>
@@ -2578,7 +2625,7 @@
         </w:tc>
         <w:tc>
           <w:tcPr>
-            <w:tcW w:w="3031" w:type="dxa"/>
+            <w:tcW w:w="2104" w:type="dxa"/>
           </w:tcPr>
           <w:p>
             <w:pPr>
@@ -2597,7 +2644,19 @@
               <w:rPr>
                 <w:lang w:val="id-ID"/>
               </w:rPr>
-              <w:instrText xml:space="preserve"> MERGEFIELD jumlah_pertamax </w:instrText>
+              <w:instrText xml:space="preserve"> MERGEFIELD Jumlah_PX_T</w:instrText>
+            </w:r>
+            <w:r>
+              <w:rPr>
+                <w:lang w:val="id-ID"/>
+              </w:rPr>
+              <w:instrText>3</w:instrText>
+            </w:r>
+            <w:r>
+              <w:rPr>
+                <w:lang w:val="id-ID"/>
+              </w:rPr>
+              <w:instrText xml:space="preserve"> </w:instrText>
             </w:r>
             <w:r>
               <w:rPr>
@@ -2610,7 +2669,7 @@
                 <w:noProof/>
                 <w:lang w:val="id-ID"/>
               </w:rPr>
-              <w:t>9,025</w:t>
+              <w:t>4000</w:t>
             </w:r>
             <w:r>
               <w:rPr>
@@ -2622,7 +2681,7 @@
         </w:tc>
         <w:tc>
           <w:tcPr>
-            <w:tcW w:w="2480" w:type="dxa"/>
+            <w:tcW w:w="2002" w:type="dxa"/>
           </w:tcPr>
           <w:p>
             <w:pPr>
@@ -2641,7 +2700,19 @@
               <w:rPr>
                 <w:lang w:val="id-ID"/>
               </w:rPr>
-              <w:instrText xml:space="preserve"> MERGEFIELD jumlah_dex </w:instrText>
+              <w:instrText xml:space="preserve"> MERGEFIELD Jumlah_PDX_T</w:instrText>
+            </w:r>
+            <w:r>
+              <w:rPr>
+                <w:lang w:val="id-ID"/>
+              </w:rPr>
+              <w:instrText>3</w:instrText>
+            </w:r>
+            <w:r>
+              <w:rPr>
+                <w:lang w:val="id-ID"/>
+              </w:rPr>
+              <w:instrText xml:space="preserve"> </w:instrText>
             </w:r>
             <w:r>
               <w:rPr>
@@ -2654,7 +2725,7 @@
                 <w:noProof/>
                 <w:lang w:val="id-ID"/>
               </w:rPr>
-              <w:t>8,522</w:t>
+              <w:t>4000</w:t>
             </w:r>
             <w:r>
               <w:rPr>
@@ -2666,7 +2737,7 @@
         </w:tc>
         <w:tc>
           <w:tcPr>
-            <w:tcW w:w="512" w:type="dxa"/>
+            <w:tcW w:w="859" w:type="dxa"/>
           </w:tcPr>
           <w:p/>
         </w:tc>
@@ -2674,7 +2745,7 @@
       <w:tr>
         <w:tc>
           <w:tcPr>
-            <w:tcW w:w="737" w:type="dxa"/>
+            <w:tcW w:w="753" w:type="dxa"/>
             <w:vMerge/>
           </w:tcPr>
           <w:p>
@@ -2685,14 +2756,14 @@
         </w:tc>
         <w:tc>
           <w:tcPr>
-            <w:tcW w:w="1362" w:type="dxa"/>
+            <w:tcW w:w="1687" w:type="dxa"/>
             <w:vMerge/>
           </w:tcPr>
           <w:p/>
         </w:tc>
         <w:tc>
           <w:tcPr>
-            <w:tcW w:w="2174" w:type="dxa"/>
+            <w:tcW w:w="2891" w:type="dxa"/>
           </w:tcPr>
           <w:p>
             <w:r>
@@ -2702,7 +2773,7 @@
         </w:tc>
         <w:tc>
           <w:tcPr>
-            <w:tcW w:w="3031" w:type="dxa"/>
+            <w:tcW w:w="2104" w:type="dxa"/>
           </w:tcPr>
           <w:p>
             <w:pPr>
@@ -2721,7 +2792,19 @@
               <w:rPr>
                 <w:lang w:val="id-ID"/>
               </w:rPr>
-              <w:instrText xml:space="preserve"> MERGEFIELD pengeluaran_pertamax </w:instrText>
+              <w:instrText xml:space="preserve"> MERGEFIELD Keluar_PX_T</w:instrText>
+            </w:r>
+            <w:r>
+              <w:rPr>
+                <w:lang w:val="id-ID"/>
+              </w:rPr>
+              <w:instrText>3</w:instrText>
+            </w:r>
+            <w:r>
+              <w:rPr>
+                <w:lang w:val="id-ID"/>
+              </w:rPr>
+              <w:instrText xml:space="preserve"> </w:instrText>
             </w:r>
             <w:r>
               <w:rPr>
@@ -2734,7 +2817,7 @@
                 <w:noProof/>
                 <w:lang w:val="id-ID"/>
               </w:rPr>
-              <w:t>3,060</w:t>
+              <w:t>1000</w:t>
             </w:r>
             <w:r>
               <w:rPr>
@@ -2746,7 +2829,7 @@
         </w:tc>
         <w:tc>
           <w:tcPr>
-            <w:tcW w:w="2480" w:type="dxa"/>
+            <w:tcW w:w="2002" w:type="dxa"/>
           </w:tcPr>
           <w:p>
             <w:pPr>
@@ -2765,7 +2848,19 @@
               <w:rPr>
                 <w:lang w:val="id-ID"/>
               </w:rPr>
-              <w:instrText xml:space="preserve"> MERGEFIELD pengeluaran_dex </w:instrText>
+              <w:instrText xml:space="preserve"> MERGEFIELD Keluar_PDX_T</w:instrText>
+            </w:r>
+            <w:r>
+              <w:rPr>
+                <w:lang w:val="id-ID"/>
+              </w:rPr>
+              <w:instrText>3</w:instrText>
+            </w:r>
+            <w:r>
+              <w:rPr>
+                <w:lang w:val="id-ID"/>
+              </w:rPr>
+              <w:instrText xml:space="preserve"> </w:instrText>
             </w:r>
             <w:r>
               <w:rPr>
@@ -2778,7 +2873,7 @@
                 <w:noProof/>
                 <w:lang w:val="id-ID"/>
               </w:rPr>
-              <w:t>2,587</w:t>
+              <w:t>1000</w:t>
             </w:r>
             <w:r>
               <w:rPr>
@@ -2790,7 +2885,7 @@
         </w:tc>
         <w:tc>
           <w:tcPr>
-            <w:tcW w:w="512" w:type="dxa"/>
+            <w:tcW w:w="859" w:type="dxa"/>
           </w:tcPr>
           <w:p/>
         </w:tc>
@@ -2798,7 +2893,7 @@
       <w:tr>
         <w:tc>
           <w:tcPr>
-            <w:tcW w:w="737" w:type="dxa"/>
+            <w:tcW w:w="753" w:type="dxa"/>
             <w:vMerge/>
           </w:tcPr>
           <w:p>
@@ -2809,14 +2904,14 @@
         </w:tc>
         <w:tc>
           <w:tcPr>
-            <w:tcW w:w="1362" w:type="dxa"/>
+            <w:tcW w:w="1687" w:type="dxa"/>
             <w:vMerge/>
           </w:tcPr>
           <w:p/>
         </w:tc>
         <w:tc>
           <w:tcPr>
-            <w:tcW w:w="2174" w:type="dxa"/>
+            <w:tcW w:w="2891" w:type="dxa"/>
           </w:tcPr>
           <w:p>
             <w:r>
@@ -2826,7 +2921,7 @@
         </w:tc>
         <w:tc>
           <w:tcPr>
-            <w:tcW w:w="3031" w:type="dxa"/>
+            <w:tcW w:w="2104" w:type="dxa"/>
           </w:tcPr>
           <w:p>
             <w:pPr>
@@ -2848,7 +2943,21 @@
                 <w:b/>
                 <w:lang w:val="id-ID"/>
               </w:rPr>
-              <w:instrText xml:space="preserve"> MERGEFIELD persediaan_akhir_pertamax </w:instrText>
+              <w:instrText xml:space="preserve"> MERGEFIELD Akhir_PX_T</w:instrText>
+            </w:r>
+            <w:r>
+              <w:rPr>
+                <w:b/>
+                <w:lang w:val="id-ID"/>
+              </w:rPr>
+              <w:instrText>3</w:instrText>
+            </w:r>
+            <w:r>
+              <w:rPr>
+                <w:b/>
+                <w:lang w:val="id-ID"/>
+              </w:rPr>
+              <w:instrText xml:space="preserve"> </w:instrText>
             </w:r>
             <w:r>
               <w:rPr>
@@ -2863,7 +2972,7 @@
                 <w:noProof/>
                 <w:lang w:val="id-ID"/>
               </w:rPr>
-              <w:t>5,965</w:t>
+              <w:t>3000</w:t>
             </w:r>
             <w:r>
               <w:rPr>
@@ -2876,7 +2985,7 @@
         </w:tc>
         <w:tc>
           <w:tcPr>
-            <w:tcW w:w="2480" w:type="dxa"/>
+            <w:tcW w:w="2002" w:type="dxa"/>
           </w:tcPr>
           <w:p>
             <w:pPr>
@@ -2898,7 +3007,21 @@
                 <w:b/>
                 <w:lang w:val="id-ID"/>
               </w:rPr>
-              <w:instrText xml:space="preserve"> MERGEFIELD persediaan_akhir_dex </w:instrText>
+              <w:instrText xml:space="preserve"> MERGEFIELD Akhir_PDX_T</w:instrText>
+            </w:r>
+            <w:r>
+              <w:rPr>
+                <w:b/>
+                <w:lang w:val="id-ID"/>
+              </w:rPr>
+              <w:instrText>3</w:instrText>
+            </w:r>
+            <w:r>
+              <w:rPr>
+                <w:b/>
+                <w:lang w:val="id-ID"/>
+              </w:rPr>
+              <w:instrText xml:space="preserve"> </w:instrText>
             </w:r>
             <w:r>
               <w:rPr>
@@ -2913,7 +3036,7 @@
                 <w:noProof/>
                 <w:lang w:val="id-ID"/>
               </w:rPr>
-              <w:t>5,935</w:t>
+              <w:t>3000</w:t>
             </w:r>
             <w:r>
               <w:rPr>
@@ -2926,7 +3049,7 @@
         </w:tc>
         <w:tc>
           <w:tcPr>
-            <w:tcW w:w="512" w:type="dxa"/>
+            <w:tcW w:w="859" w:type="dxa"/>
           </w:tcPr>
           <w:p/>
         </w:tc>
@@ -2934,49 +3057,49 @@
       <w:tr>
         <w:tc>
           <w:tcPr>
-            <w:tcW w:w="737" w:type="dxa"/>
-          </w:tcPr>
-          <w:p>
-            <w:pPr>
-              <w:jc w:val="center"/>
-            </w:pPr>
-          </w:p>
-        </w:tc>
-        <w:tc>
-          <w:tcPr>
-            <w:tcW w:w="1362" w:type="dxa"/>
-          </w:tcPr>
-          <w:p/>
-        </w:tc>
-        <w:tc>
-          <w:tcPr>
-            <w:tcW w:w="2174" w:type="dxa"/>
-          </w:tcPr>
-          <w:p/>
-        </w:tc>
-        <w:tc>
-          <w:tcPr>
-            <w:tcW w:w="3031" w:type="dxa"/>
-          </w:tcPr>
-          <w:p>
-            <w:pPr>
-              <w:jc w:val="center"/>
-            </w:pPr>
-          </w:p>
-        </w:tc>
-        <w:tc>
-          <w:tcPr>
-            <w:tcW w:w="2480" w:type="dxa"/>
-          </w:tcPr>
-          <w:p>
-            <w:pPr>
-              <w:jc w:val="center"/>
-            </w:pPr>
-          </w:p>
-        </w:tc>
-        <w:tc>
-          <w:tcPr>
-            <w:tcW w:w="512" w:type="dxa"/>
+            <w:tcW w:w="753" w:type="dxa"/>
+          </w:tcPr>
+          <w:p>
+            <w:pPr>
+              <w:jc w:val="center"/>
+            </w:pPr>
+          </w:p>
+        </w:tc>
+        <w:tc>
+          <w:tcPr>
+            <w:tcW w:w="1687" w:type="dxa"/>
+          </w:tcPr>
+          <w:p/>
+        </w:tc>
+        <w:tc>
+          <w:tcPr>
+            <w:tcW w:w="2891" w:type="dxa"/>
+          </w:tcPr>
+          <w:p/>
+        </w:tc>
+        <w:tc>
+          <w:tcPr>
+            <w:tcW w:w="2104" w:type="dxa"/>
+          </w:tcPr>
+          <w:p>
+            <w:pPr>
+              <w:jc w:val="center"/>
+            </w:pPr>
+          </w:p>
+        </w:tc>
+        <w:tc>
+          <w:tcPr>
+            <w:tcW w:w="2002" w:type="dxa"/>
+          </w:tcPr>
+          <w:p>
+            <w:pPr>
+              <w:jc w:val="center"/>
+            </w:pPr>
+          </w:p>
+        </w:tc>
+        <w:tc>
+          <w:tcPr>
+            <w:tcW w:w="859" w:type="dxa"/>
           </w:tcPr>
           <w:p/>
         </w:tc>
@@ -2984,14 +3107,10 @@
       <w:tr>
         <w:tc>
           <w:tcPr>
-            <w:tcW w:w="737" w:type="dxa"/>
+            <w:tcW w:w="753" w:type="dxa"/>
             <w:vMerge w:val="restart"/>
-          </w:tcPr>
-          <w:p>
-            <w:pPr>
-              <w:jc w:val="center"/>
-            </w:pPr>
-          </w:p>
+            <w:vAlign w:val="center"/>
+          </w:tcPr>
           <w:p>
             <w:pPr>
               <w:jc w:val="center"/>
@@ -3003,19 +3122,19 @@
         </w:tc>
         <w:tc>
           <w:tcPr>
-            <w:tcW w:w="1362" w:type="dxa"/>
+            <w:tcW w:w="1687" w:type="dxa"/>
             <w:vMerge w:val="restart"/>
-          </w:tcPr>
-          <w:p/>
-          <w:p>
-            <w:pPr>
-              <w:jc w:val="center"/>
-            </w:pPr>
-          </w:p>
-        </w:tc>
-        <w:tc>
-          <w:tcPr>
-            <w:tcW w:w="2174" w:type="dxa"/>
+            <w:vAlign w:val="center"/>
+          </w:tcPr>
+          <w:p>
+            <w:pPr>
+              <w:jc w:val="center"/>
+            </w:pPr>
+          </w:p>
+        </w:tc>
+        <w:tc>
+          <w:tcPr>
+            <w:tcW w:w="2891" w:type="dxa"/>
           </w:tcPr>
           <w:p>
             <w:r>
@@ -3025,7 +3144,7 @@
         </w:tc>
         <w:tc>
           <w:tcPr>
-            <w:tcW w:w="3031" w:type="dxa"/>
+            <w:tcW w:w="2104" w:type="dxa"/>
           </w:tcPr>
           <w:p>
             <w:pPr>
@@ -3044,7 +3163,7 @@
               <w:rPr>
                 <w:lang w:val="id-ID"/>
               </w:rPr>
-              <w:instrText xml:space="preserve"> MERGEFIELD jumlah_pertamax </w:instrText>
+              <w:instrText xml:space="preserve"> MERGEFIELD Awal_PX_T4 </w:instrText>
             </w:r>
             <w:r>
               <w:rPr>
@@ -3057,7 +3176,7 @@
                 <w:noProof/>
                 <w:lang w:val="id-ID"/>
               </w:rPr>
-              <w:t>9,025</w:t>
+              <w:t>3000</w:t>
             </w:r>
             <w:r>
               <w:rPr>
@@ -3069,7 +3188,7 @@
         </w:tc>
         <w:tc>
           <w:tcPr>
-            <w:tcW w:w="2480" w:type="dxa"/>
+            <w:tcW w:w="2002" w:type="dxa"/>
           </w:tcPr>
           <w:p>
             <w:pPr>
@@ -3088,7 +3207,19 @@
               <w:rPr>
                 <w:lang w:val="id-ID"/>
               </w:rPr>
-              <w:instrText xml:space="preserve"> MERGEFIELD jumlah_dex </w:instrText>
+              <w:instrText xml:space="preserve"> MERGEFIELD Awal_P</w:instrText>
+            </w:r>
+            <w:r>
+              <w:rPr>
+                <w:lang w:val="id-ID"/>
+              </w:rPr>
+              <w:instrText>D</w:instrText>
+            </w:r>
+            <w:r>
+              <w:rPr>
+                <w:lang w:val="id-ID"/>
+              </w:rPr>
+              <w:instrText xml:space="preserve">X_T4 </w:instrText>
             </w:r>
             <w:r>
               <w:rPr>
@@ -3101,7 +3232,7 @@
                 <w:noProof/>
                 <w:lang w:val="id-ID"/>
               </w:rPr>
-              <w:t>8,522</w:t>
+              <w:t>3000</w:t>
             </w:r>
             <w:r>
               <w:rPr>
@@ -3113,7 +3244,7 @@
         </w:tc>
         <w:tc>
           <w:tcPr>
-            <w:tcW w:w="512" w:type="dxa"/>
+            <w:tcW w:w="859" w:type="dxa"/>
           </w:tcPr>
           <w:p/>
         </w:tc>
@@ -3121,21 +3252,21 @@
       <w:tr>
         <w:tc>
           <w:tcPr>
-            <w:tcW w:w="737" w:type="dxa"/>
+            <w:tcW w:w="753" w:type="dxa"/>
             <w:vMerge/>
           </w:tcPr>
           <w:p/>
         </w:tc>
         <w:tc>
           <w:tcPr>
-            <w:tcW w:w="1362" w:type="dxa"/>
+            <w:tcW w:w="1687" w:type="dxa"/>
             <w:vMerge/>
           </w:tcPr>
           <w:p/>
         </w:tc>
         <w:tc>
           <w:tcPr>
-            <w:tcW w:w="2174" w:type="dxa"/>
+            <w:tcW w:w="2891" w:type="dxa"/>
           </w:tcPr>
           <w:p>
             <w:r>
@@ -3145,7 +3276,7 @@
         </w:tc>
         <w:tc>
           <w:tcPr>
-            <w:tcW w:w="3031" w:type="dxa"/>
+            <w:tcW w:w="2104" w:type="dxa"/>
           </w:tcPr>
           <w:p>
             <w:pPr>
@@ -3164,7 +3295,7 @@
               <w:rPr>
                 <w:lang w:val="id-ID"/>
               </w:rPr>
-              <w:instrText xml:space="preserve"> MERGEFIELD pengeluaran_pertamax </w:instrText>
+              <w:instrText xml:space="preserve"> MERGEFIELD Keluar_PX_T4 </w:instrText>
             </w:r>
             <w:r>
               <w:rPr>
@@ -3177,7 +3308,7 @@
                 <w:noProof/>
                 <w:lang w:val="id-ID"/>
               </w:rPr>
-              <w:t>3,060</w:t>
+              <w:t>1000</w:t>
             </w:r>
             <w:r>
               <w:rPr>
@@ -3189,7 +3320,7 @@
         </w:tc>
         <w:tc>
           <w:tcPr>
-            <w:tcW w:w="2480" w:type="dxa"/>
+            <w:tcW w:w="2002" w:type="dxa"/>
           </w:tcPr>
           <w:p>
             <w:pPr>
@@ -3208,7 +3339,19 @@
               <w:rPr>
                 <w:lang w:val="id-ID"/>
               </w:rPr>
-              <w:instrText xml:space="preserve"> MERGEFIELD pengeluaran_dex </w:instrText>
+              <w:instrText xml:space="preserve"> MERGEFIELD Keluar_P</w:instrText>
+            </w:r>
+            <w:r>
+              <w:rPr>
+                <w:lang w:val="id-ID"/>
+              </w:rPr>
+              <w:instrText>D</w:instrText>
+            </w:r>
+            <w:r>
+              <w:rPr>
+                <w:lang w:val="id-ID"/>
+              </w:rPr>
+              <w:instrText xml:space="preserve">X_T4 </w:instrText>
             </w:r>
             <w:r>
               <w:rPr>
@@ -3221,7 +3364,7 @@
                 <w:noProof/>
                 <w:lang w:val="id-ID"/>
               </w:rPr>
-              <w:t>2,587</w:t>
+              <w:t>1000</w:t>
             </w:r>
             <w:r>
               <w:rPr>
@@ -3233,7 +3376,7 @@
         </w:tc>
         <w:tc>
           <w:tcPr>
-            <w:tcW w:w="512" w:type="dxa"/>
+            <w:tcW w:w="859" w:type="dxa"/>
           </w:tcPr>
           <w:p/>
         </w:tc>
@@ -3241,21 +3384,21 @@
       <w:tr>
         <w:tc>
           <w:tcPr>
-            <w:tcW w:w="737" w:type="dxa"/>
+            <w:tcW w:w="753" w:type="dxa"/>
             <w:vMerge/>
           </w:tcPr>
           <w:p/>
         </w:tc>
         <w:tc>
           <w:tcPr>
-            <w:tcW w:w="1362" w:type="dxa"/>
+            <w:tcW w:w="1687" w:type="dxa"/>
             <w:vMerge/>
           </w:tcPr>
           <w:p/>
         </w:tc>
         <w:tc>
           <w:tcPr>
-            <w:tcW w:w="2174" w:type="dxa"/>
+            <w:tcW w:w="2891" w:type="dxa"/>
           </w:tcPr>
           <w:p>
             <w:r>
@@ -3265,7 +3408,7 @@
         </w:tc>
         <w:tc>
           <w:tcPr>
-            <w:tcW w:w="3031" w:type="dxa"/>
+            <w:tcW w:w="2104" w:type="dxa"/>
           </w:tcPr>
           <w:p>
             <w:pPr>
@@ -3287,7 +3430,7 @@
                 <w:b/>
                 <w:lang w:val="id-ID"/>
               </w:rPr>
-              <w:instrText xml:space="preserve"> MERGEFIELD persediaan_akhir_pertamax </w:instrText>
+              <w:instrText xml:space="preserve"> MERGEFIELD Akhir_PX_T4 </w:instrText>
             </w:r>
             <w:r>
               <w:rPr>
@@ -3302,7 +3445,7 @@
                 <w:noProof/>
                 <w:lang w:val="id-ID"/>
               </w:rPr>
-              <w:t>5,965</w:t>
+              <w:t>2000</w:t>
             </w:r>
             <w:r>
               <w:rPr>
@@ -3315,7 +3458,7 @@
         </w:tc>
         <w:tc>
           <w:tcPr>
-            <w:tcW w:w="2480" w:type="dxa"/>
+            <w:tcW w:w="2002" w:type="dxa"/>
           </w:tcPr>
           <w:p>
             <w:pPr>
@@ -3337,7 +3480,21 @@
                 <w:b/>
                 <w:lang w:val="id-ID"/>
               </w:rPr>
-              <w:instrText xml:space="preserve"> MERGEFIELD persediaan_akhir_dex </w:instrText>
+              <w:instrText xml:space="preserve"> MERGEFIELD Akhir_P</w:instrText>
+            </w:r>
+            <w:r>
+              <w:rPr>
+                <w:b/>
+                <w:lang w:val="id-ID"/>
+              </w:rPr>
+              <w:instrText>D</w:instrText>
+            </w:r>
+            <w:r>
+              <w:rPr>
+                <w:b/>
+                <w:lang w:val="id-ID"/>
+              </w:rPr>
+              <w:instrText xml:space="preserve">X_T4 </w:instrText>
             </w:r>
             <w:r>
               <w:rPr>
@@ -3352,7 +3509,7 @@
                 <w:noProof/>
                 <w:lang w:val="id-ID"/>
               </w:rPr>
-              <w:t>5,935</w:t>
+              <w:t>2000</w:t>
             </w:r>
             <w:r>
               <w:rPr>
@@ -3365,7 +3522,7 @@
         </w:tc>
         <w:tc>
           <w:tcPr>
-            <w:tcW w:w="512" w:type="dxa"/>
+            <w:tcW w:w="859" w:type="dxa"/>
           </w:tcPr>
           <w:p/>
         </w:tc>
@@ -3373,21 +3530,21 @@
       <w:tr>
         <w:tc>
           <w:tcPr>
-            <w:tcW w:w="737" w:type="dxa"/>
+            <w:tcW w:w="753" w:type="dxa"/>
             <w:vMerge/>
           </w:tcPr>
           <w:p/>
         </w:tc>
         <w:tc>
           <w:tcPr>
-            <w:tcW w:w="1362" w:type="dxa"/>
+            <w:tcW w:w="1687" w:type="dxa"/>
             <w:vMerge/>
           </w:tcPr>
           <w:p/>
         </w:tc>
         <w:tc>
           <w:tcPr>
-            <w:tcW w:w="2174" w:type="dxa"/>
+            <w:tcW w:w="2891" w:type="dxa"/>
           </w:tcPr>
           <w:p>
             <w:r>
@@ -3397,7 +3554,7 @@
         </w:tc>
         <w:tc>
           <w:tcPr>
-            <w:tcW w:w="3031" w:type="dxa"/>
+            <w:tcW w:w="2104" w:type="dxa"/>
           </w:tcPr>
           <w:p>
             <w:pPr>
@@ -3416,7 +3573,7 @@
               <w:rPr>
                 <w:lang w:val="id-ID"/>
               </w:rPr>
-              <w:instrText xml:space="preserve"> MERGEFIELD penerimaan_pertamax </w:instrText>
+              <w:instrText xml:space="preserve"> MERGEFIELD Terima_PX_T4 </w:instrText>
             </w:r>
             <w:r>
               <w:rPr>
@@ -3429,7 +3586,7 @@
                 <w:noProof/>
                 <w:lang w:val="id-ID"/>
               </w:rPr>
-              <w:t>8,000</w:t>
+              <w:t>0</w:t>
             </w:r>
             <w:r>
               <w:rPr>
@@ -3441,7 +3598,7 @@
         </w:tc>
         <w:tc>
           <w:tcPr>
-            <w:tcW w:w="2480" w:type="dxa"/>
+            <w:tcW w:w="2002" w:type="dxa"/>
           </w:tcPr>
           <w:p>
             <w:pPr>
@@ -3460,7 +3617,19 @@
               <w:rPr>
                 <w:lang w:val="id-ID"/>
               </w:rPr>
-              <w:instrText xml:space="preserve"> MERGEFIELD penerimaan_dex </w:instrText>
+              <w:instrText xml:space="preserve"> MERGEFIELD Terima_P</w:instrText>
+            </w:r>
+            <w:r>
+              <w:rPr>
+                <w:lang w:val="id-ID"/>
+              </w:rPr>
+              <w:instrText>D</w:instrText>
+            </w:r>
+            <w:r>
+              <w:rPr>
+                <w:lang w:val="id-ID"/>
+              </w:rPr>
+              <w:instrText xml:space="preserve">X_T4 </w:instrText>
             </w:r>
             <w:r>
               <w:rPr>
@@ -3473,7 +3642,7 @@
                 <w:noProof/>
                 <w:lang w:val="id-ID"/>
               </w:rPr>
-              <w:t>8,000</w:t>
+              <w:t>0</w:t>
             </w:r>
             <w:r>
               <w:rPr>
@@ -3485,7 +3654,7 @@
         </w:tc>
         <w:tc>
           <w:tcPr>
-            <w:tcW w:w="512" w:type="dxa"/>
+            <w:tcW w:w="859" w:type="dxa"/>
           </w:tcPr>
           <w:p/>
         </w:tc>
@@ -3493,45 +3662,45 @@
       <w:tr>
         <w:tc>
           <w:tcPr>
-            <w:tcW w:w="737" w:type="dxa"/>
-          </w:tcPr>
-          <w:p/>
-        </w:tc>
-        <w:tc>
-          <w:tcPr>
-            <w:tcW w:w="1362" w:type="dxa"/>
-          </w:tcPr>
-          <w:p/>
-        </w:tc>
-        <w:tc>
-          <w:tcPr>
-            <w:tcW w:w="2174" w:type="dxa"/>
-          </w:tcPr>
-          <w:p/>
-        </w:tc>
-        <w:tc>
-          <w:tcPr>
-            <w:tcW w:w="3031" w:type="dxa"/>
-          </w:tcPr>
-          <w:p>
-            <w:pPr>
-              <w:jc w:val="center"/>
-            </w:pPr>
-          </w:p>
-        </w:tc>
-        <w:tc>
-          <w:tcPr>
-            <w:tcW w:w="2480" w:type="dxa"/>
-          </w:tcPr>
-          <w:p>
-            <w:pPr>
-              <w:jc w:val="center"/>
-            </w:pPr>
-          </w:p>
-        </w:tc>
-        <w:tc>
-          <w:tcPr>
-            <w:tcW w:w="512" w:type="dxa"/>
+            <w:tcW w:w="753" w:type="dxa"/>
+          </w:tcPr>
+          <w:p/>
+        </w:tc>
+        <w:tc>
+          <w:tcPr>
+            <w:tcW w:w="1687" w:type="dxa"/>
+          </w:tcPr>
+          <w:p/>
+        </w:tc>
+        <w:tc>
+          <w:tcPr>
+            <w:tcW w:w="2891" w:type="dxa"/>
+          </w:tcPr>
+          <w:p/>
+        </w:tc>
+        <w:tc>
+          <w:tcPr>
+            <w:tcW w:w="2104" w:type="dxa"/>
+          </w:tcPr>
+          <w:p>
+            <w:pPr>
+              <w:jc w:val="center"/>
+            </w:pPr>
+          </w:p>
+        </w:tc>
+        <w:tc>
+          <w:tcPr>
+            <w:tcW w:w="2002" w:type="dxa"/>
+          </w:tcPr>
+          <w:p>
+            <w:pPr>
+              <w:jc w:val="center"/>
+            </w:pPr>
+          </w:p>
+        </w:tc>
+        <w:tc>
+          <w:tcPr>
+            <w:tcW w:w="859" w:type="dxa"/>
           </w:tcPr>
           <w:p/>
         </w:tc>
@@ -3539,14 +3708,10 @@
       <w:tr>
         <w:tc>
           <w:tcPr>
-            <w:tcW w:w="737" w:type="dxa"/>
+            <w:tcW w:w="753" w:type="dxa"/>
             <w:vMerge w:val="restart"/>
-          </w:tcPr>
-          <w:p>
-            <w:pPr>
-              <w:jc w:val="center"/>
-            </w:pPr>
-          </w:p>
+            <w:vAlign w:val="center"/>
+          </w:tcPr>
           <w:p>
             <w:pPr>
               <w:jc w:val="center"/>
@@ -3558,19 +3723,19 @@
         </w:tc>
         <w:tc>
           <w:tcPr>
-            <w:tcW w:w="1362" w:type="dxa"/>
+            <w:tcW w:w="1687" w:type="dxa"/>
             <w:vMerge w:val="restart"/>
-          </w:tcPr>
-          <w:p/>
-          <w:p>
-            <w:pPr>
-              <w:jc w:val="center"/>
-            </w:pPr>
-          </w:p>
-        </w:tc>
-        <w:tc>
-          <w:tcPr>
-            <w:tcW w:w="2174" w:type="dxa"/>
+            <w:vAlign w:val="center"/>
+          </w:tcPr>
+          <w:p>
+            <w:pPr>
+              <w:jc w:val="center"/>
+            </w:pPr>
+          </w:p>
+        </w:tc>
+        <w:tc>
+          <w:tcPr>
+            <w:tcW w:w="2891" w:type="dxa"/>
           </w:tcPr>
           <w:p>
             <w:r>
@@ -3580,7 +3745,7 @@
         </w:tc>
         <w:tc>
           <w:tcPr>
-            <w:tcW w:w="3031" w:type="dxa"/>
+            <w:tcW w:w="2104" w:type="dxa"/>
           </w:tcPr>
           <w:p>
             <w:pPr>
@@ -3599,7 +3764,7 @@
               <w:rPr>
                 <w:lang w:val="id-ID"/>
               </w:rPr>
-              <w:instrText xml:space="preserve"> MERGEFIELD jumlah_pertamax </w:instrText>
+              <w:instrText xml:space="preserve"> MERGEFIELD Awal_PX_T5 </w:instrText>
             </w:r>
             <w:r>
               <w:rPr>
@@ -3612,7 +3777,7 @@
                 <w:noProof/>
                 <w:lang w:val="id-ID"/>
               </w:rPr>
-              <w:t>9,025</w:t>
+              <w:t>2000</w:t>
             </w:r>
             <w:r>
               <w:rPr>
@@ -3624,7 +3789,7 @@
         </w:tc>
         <w:tc>
           <w:tcPr>
-            <w:tcW w:w="2480" w:type="dxa"/>
+            <w:tcW w:w="2002" w:type="dxa"/>
           </w:tcPr>
           <w:p>
             <w:pPr>
@@ -3643,7 +3808,7 @@
               <w:rPr>
                 <w:lang w:val="id-ID"/>
               </w:rPr>
-              <w:instrText xml:space="preserve"> MERGEFIELD jumlah_dex </w:instrText>
+              <w:instrText xml:space="preserve"> MERGEFIELD Awal_PDX_T5 </w:instrText>
             </w:r>
             <w:r>
               <w:rPr>
@@ -3656,7 +3821,7 @@
                 <w:noProof/>
                 <w:lang w:val="id-ID"/>
               </w:rPr>
-              <w:t>8,522</w:t>
+              <w:t>2000</w:t>
             </w:r>
             <w:r>
               <w:rPr>
@@ -3668,7 +3833,7 @@
         </w:tc>
         <w:tc>
           <w:tcPr>
-            <w:tcW w:w="512" w:type="dxa"/>
+            <w:tcW w:w="859" w:type="dxa"/>
           </w:tcPr>
           <w:p/>
         </w:tc>
@@ -3676,21 +3841,21 @@
       <w:tr>
         <w:tc>
           <w:tcPr>
-            <w:tcW w:w="737" w:type="dxa"/>
+            <w:tcW w:w="753" w:type="dxa"/>
             <w:vMerge/>
           </w:tcPr>
           <w:p/>
         </w:tc>
         <w:tc>
           <w:tcPr>
-            <w:tcW w:w="1362" w:type="dxa"/>
+            <w:tcW w:w="1687" w:type="dxa"/>
             <w:vMerge/>
           </w:tcPr>
           <w:p/>
         </w:tc>
         <w:tc>
           <w:tcPr>
-            <w:tcW w:w="2174" w:type="dxa"/>
+            <w:tcW w:w="2891" w:type="dxa"/>
           </w:tcPr>
           <w:p>
             <w:r>
@@ -3700,7 +3865,7 @@
         </w:tc>
         <w:tc>
           <w:tcPr>
-            <w:tcW w:w="3031" w:type="dxa"/>
+            <w:tcW w:w="2104" w:type="dxa"/>
           </w:tcPr>
           <w:p>
             <w:pPr>
@@ -3719,7 +3884,7 @@
               <w:rPr>
                 <w:lang w:val="id-ID"/>
               </w:rPr>
-              <w:instrText xml:space="preserve"> MERGEFIELD pengeluaran_pertamax </w:instrText>
+              <w:instrText xml:space="preserve"> MERGEFIELD Keluar_PX_T5 </w:instrText>
             </w:r>
             <w:r>
               <w:rPr>
@@ -3732,7 +3897,7 @@
                 <w:noProof/>
                 <w:lang w:val="id-ID"/>
               </w:rPr>
-              <w:t>3,060</w:t>
+              <w:t>1000</w:t>
             </w:r>
             <w:r>
               <w:rPr>
@@ -3744,7 +3909,7 @@
         </w:tc>
         <w:tc>
           <w:tcPr>
-            <w:tcW w:w="2480" w:type="dxa"/>
+            <w:tcW w:w="2002" w:type="dxa"/>
           </w:tcPr>
           <w:p>
             <w:pPr>
@@ -3763,7 +3928,7 @@
               <w:rPr>
                 <w:lang w:val="id-ID"/>
               </w:rPr>
-              <w:instrText xml:space="preserve"> MERGEFIELD pengeluaran_dex </w:instrText>
+              <w:instrText xml:space="preserve"> MERGEFIELD Keluar_PDX_T5 </w:instrText>
             </w:r>
             <w:r>
               <w:rPr>
@@ -3776,7 +3941,7 @@
                 <w:noProof/>
                 <w:lang w:val="id-ID"/>
               </w:rPr>
-              <w:t>2,587</w:t>
+              <w:t>1000</w:t>
             </w:r>
             <w:r>
               <w:rPr>
@@ -3788,7 +3953,7 @@
         </w:tc>
         <w:tc>
           <w:tcPr>
-            <w:tcW w:w="512" w:type="dxa"/>
+            <w:tcW w:w="859" w:type="dxa"/>
           </w:tcPr>
           <w:p/>
         </w:tc>
@@ -3796,21 +3961,21 @@
       <w:tr>
         <w:tc>
           <w:tcPr>
-            <w:tcW w:w="737" w:type="dxa"/>
+            <w:tcW w:w="753" w:type="dxa"/>
             <w:vMerge/>
           </w:tcPr>
           <w:p/>
         </w:tc>
         <w:tc>
           <w:tcPr>
-            <w:tcW w:w="1362" w:type="dxa"/>
+            <w:tcW w:w="1687" w:type="dxa"/>
             <w:vMerge/>
           </w:tcPr>
           <w:p/>
         </w:tc>
         <w:tc>
           <w:tcPr>
-            <w:tcW w:w="2174" w:type="dxa"/>
+            <w:tcW w:w="2891" w:type="dxa"/>
           </w:tcPr>
           <w:p>
             <w:r>
@@ -3820,7 +3985,7 @@
         </w:tc>
         <w:tc>
           <w:tcPr>
-            <w:tcW w:w="3031" w:type="dxa"/>
+            <w:tcW w:w="2104" w:type="dxa"/>
           </w:tcPr>
           <w:p>
             <w:pPr>
@@ -3842,7 +4007,7 @@
                 <w:b/>
                 <w:lang w:val="id-ID"/>
               </w:rPr>
-              <w:instrText xml:space="preserve"> MERGEFIELD persediaan_akhir_pertamax </w:instrText>
+              <w:instrText xml:space="preserve"> MERGEFIELD Akhir_PX_T5 </w:instrText>
             </w:r>
             <w:r>
               <w:rPr>
@@ -3857,7 +4022,7 @@
                 <w:noProof/>
                 <w:lang w:val="id-ID"/>
               </w:rPr>
-              <w:t>5,965</w:t>
+              <w:t>1000</w:t>
             </w:r>
             <w:r>
               <w:rPr>
@@ -3870,7 +4035,7 @@
         </w:tc>
         <w:tc>
           <w:tcPr>
-            <w:tcW w:w="2480" w:type="dxa"/>
+            <w:tcW w:w="2002" w:type="dxa"/>
           </w:tcPr>
           <w:p>
             <w:pPr>
@@ -3892,7 +4057,7 @@
                 <w:b/>
                 <w:lang w:val="id-ID"/>
               </w:rPr>
-              <w:instrText xml:space="preserve"> MERGEFIELD persediaan_akhir_dex </w:instrText>
+              <w:instrText xml:space="preserve"> MERGEFIELD Akhir_PDX_T5 </w:instrText>
             </w:r>
             <w:r>
               <w:rPr>
@@ -3907,7 +4072,7 @@
                 <w:noProof/>
                 <w:lang w:val="id-ID"/>
               </w:rPr>
-              <w:t>5,935</w:t>
+              <w:t>1000</w:t>
             </w:r>
             <w:r>
               <w:rPr>
@@ -3920,7 +4085,7 @@
         </w:tc>
         <w:tc>
           <w:tcPr>
-            <w:tcW w:w="512" w:type="dxa"/>
+            <w:tcW w:w="859" w:type="dxa"/>
           </w:tcPr>
           <w:p/>
         </w:tc>
@@ -3928,21 +4093,21 @@
       <w:tr>
         <w:tc>
           <w:tcPr>
-            <w:tcW w:w="737" w:type="dxa"/>
+            <w:tcW w:w="753" w:type="dxa"/>
             <w:vMerge/>
           </w:tcPr>
           <w:p/>
         </w:tc>
         <w:tc>
           <w:tcPr>
-            <w:tcW w:w="1362" w:type="dxa"/>
+            <w:tcW w:w="1687" w:type="dxa"/>
             <w:vMerge/>
           </w:tcPr>
           <w:p/>
         </w:tc>
         <w:tc>
           <w:tcPr>
-            <w:tcW w:w="2174" w:type="dxa"/>
+            <w:tcW w:w="2891" w:type="dxa"/>
           </w:tcPr>
           <w:p>
             <w:r>
@@ -3952,7 +4117,7 @@
         </w:tc>
         <w:tc>
           <w:tcPr>
-            <w:tcW w:w="3031" w:type="dxa"/>
+            <w:tcW w:w="2104" w:type="dxa"/>
           </w:tcPr>
           <w:p>
             <w:pPr>
@@ -3971,7 +4136,7 @@
               <w:rPr>
                 <w:lang w:val="id-ID"/>
               </w:rPr>
-              <w:instrText xml:space="preserve"> MERGEFIELD penerimaan_pertamax </w:instrText>
+              <w:instrText xml:space="preserve"> MERGEFIELD Terima_PX_T5 </w:instrText>
             </w:r>
             <w:r>
               <w:rPr>
@@ -3984,7 +4149,7 @@
                 <w:noProof/>
                 <w:lang w:val="id-ID"/>
               </w:rPr>
-              <w:t>8,000</w:t>
+              <w:t>0</w:t>
             </w:r>
             <w:r>
               <w:rPr>
@@ -3996,7 +4161,7 @@
         </w:tc>
         <w:tc>
           <w:tcPr>
-            <w:tcW w:w="2480" w:type="dxa"/>
+            <w:tcW w:w="2002" w:type="dxa"/>
           </w:tcPr>
           <w:p>
             <w:pPr>
@@ -4015,7 +4180,7 @@
               <w:rPr>
                 <w:lang w:val="id-ID"/>
               </w:rPr>
-              <w:instrText xml:space="preserve"> MERGEFIELD penerimaan_dex </w:instrText>
+              <w:instrText xml:space="preserve"> MERGEFIELD Terima_PDX_T5 </w:instrText>
             </w:r>
             <w:r>
               <w:rPr>
@@ -4028,7 +4193,7 @@
                 <w:noProof/>
                 <w:lang w:val="id-ID"/>
               </w:rPr>
-              <w:t>8,000</w:t>
+              <w:t>0</w:t>
             </w:r>
             <w:r>
               <w:rPr>
@@ -4040,7 +4205,7 @@
         </w:tc>
         <w:tc>
           <w:tcPr>
-            <w:tcW w:w="512" w:type="dxa"/>
+            <w:tcW w:w="859" w:type="dxa"/>
           </w:tcPr>
           <w:p/>
         </w:tc>
@@ -4048,45 +4213,45 @@
       <w:tr>
         <w:tc>
           <w:tcPr>
-            <w:tcW w:w="737" w:type="dxa"/>
-          </w:tcPr>
-          <w:p/>
-        </w:tc>
-        <w:tc>
-          <w:tcPr>
-            <w:tcW w:w="1362" w:type="dxa"/>
-          </w:tcPr>
-          <w:p/>
-        </w:tc>
-        <w:tc>
-          <w:tcPr>
-            <w:tcW w:w="2174" w:type="dxa"/>
-          </w:tcPr>
-          <w:p/>
-        </w:tc>
-        <w:tc>
-          <w:tcPr>
-            <w:tcW w:w="3031" w:type="dxa"/>
-          </w:tcPr>
-          <w:p>
-            <w:pPr>
-              <w:jc w:val="center"/>
-            </w:pPr>
-          </w:p>
-        </w:tc>
-        <w:tc>
-          <w:tcPr>
-            <w:tcW w:w="2480" w:type="dxa"/>
-          </w:tcPr>
-          <w:p>
-            <w:pPr>
-              <w:jc w:val="center"/>
-            </w:pPr>
-          </w:p>
-        </w:tc>
-        <w:tc>
-          <w:tcPr>
-            <w:tcW w:w="512" w:type="dxa"/>
+            <w:tcW w:w="753" w:type="dxa"/>
+          </w:tcPr>
+          <w:p/>
+        </w:tc>
+        <w:tc>
+          <w:tcPr>
+            <w:tcW w:w="1687" w:type="dxa"/>
+          </w:tcPr>
+          <w:p/>
+        </w:tc>
+        <w:tc>
+          <w:tcPr>
+            <w:tcW w:w="2891" w:type="dxa"/>
+          </w:tcPr>
+          <w:p/>
+        </w:tc>
+        <w:tc>
+          <w:tcPr>
+            <w:tcW w:w="2104" w:type="dxa"/>
+          </w:tcPr>
+          <w:p>
+            <w:pPr>
+              <w:jc w:val="center"/>
+            </w:pPr>
+          </w:p>
+        </w:tc>
+        <w:tc>
+          <w:tcPr>
+            <w:tcW w:w="2002" w:type="dxa"/>
+          </w:tcPr>
+          <w:p>
+            <w:pPr>
+              <w:jc w:val="center"/>
+            </w:pPr>
+          </w:p>
+        </w:tc>
+        <w:tc>
+          <w:tcPr>
+            <w:tcW w:w="859" w:type="dxa"/>
           </w:tcPr>
           <w:p/>
         </w:tc>
@@ -4094,7 +4259,7 @@
       <w:tr>
         <w:tc>
           <w:tcPr>
-            <w:tcW w:w="2099" w:type="dxa"/>
+            <w:tcW w:w="2440" w:type="dxa"/>
             <w:gridSpan w:val="2"/>
             <w:vMerge w:val="restart"/>
           </w:tcPr>
@@ -4108,7 +4273,7 @@
         </w:tc>
         <w:tc>
           <w:tcPr>
-            <w:tcW w:w="2174" w:type="dxa"/>
+            <w:tcW w:w="2891" w:type="dxa"/>
           </w:tcPr>
           <w:p>
             <w:r>
@@ -4118,7 +4283,7 @@
         </w:tc>
         <w:tc>
           <w:tcPr>
-            <w:tcW w:w="3031" w:type="dxa"/>
+            <w:tcW w:w="2104" w:type="dxa"/>
           </w:tcPr>
           <w:p>
             <w:pPr>
@@ -4137,7 +4302,7 @@
               <w:rPr>
                 <w:lang w:val="id-ID"/>
               </w:rPr>
-              <w:instrText xml:space="preserve"> MERGEFIELD persediaan_awal_pertamax </w:instrText>
+              <w:instrText xml:space="preserve"> MERGEFIELD REKAP_Awal_PX </w:instrText>
             </w:r>
             <w:r>
               <w:rPr>
@@ -4150,7 +4315,7 @@
                 <w:noProof/>
                 <w:lang w:val="id-ID"/>
               </w:rPr>
-              <w:t>1,025</w:t>
+              <w:t>1000</w:t>
             </w:r>
             <w:r>
               <w:rPr>
@@ -4162,7 +4327,7 @@
         </w:tc>
         <w:tc>
           <w:tcPr>
-            <w:tcW w:w="2480" w:type="dxa"/>
+            <w:tcW w:w="2002" w:type="dxa"/>
           </w:tcPr>
           <w:p>
             <w:pPr>
@@ -4181,7 +4346,7 @@
               <w:rPr>
                 <w:lang w:val="id-ID"/>
               </w:rPr>
-              <w:instrText xml:space="preserve"> MERGEFIELD persediaan_awal_dex </w:instrText>
+              <w:instrText xml:space="preserve"> MERGEFIELD REKAP_Awal_PDX </w:instrText>
             </w:r>
             <w:r>
               <w:rPr>
@@ -4194,7 +4359,7 @@
                 <w:noProof/>
                 <w:lang w:val="id-ID"/>
               </w:rPr>
-              <w:t>522</w:t>
+              <w:t>1000</w:t>
             </w:r>
             <w:r>
               <w:rPr>
@@ -4206,7 +4371,7 @@
         </w:tc>
         <w:tc>
           <w:tcPr>
-            <w:tcW w:w="512" w:type="dxa"/>
+            <w:tcW w:w="859" w:type="dxa"/>
           </w:tcPr>
           <w:p/>
         </w:tc>
@@ -4214,7 +4379,7 @@
       <w:tr>
         <w:tc>
           <w:tcPr>
-            <w:tcW w:w="2099" w:type="dxa"/>
+            <w:tcW w:w="2440" w:type="dxa"/>
             <w:gridSpan w:val="2"/>
             <w:vMerge/>
           </w:tcPr>
@@ -4222,7 +4387,7 @@
         </w:tc>
         <w:tc>
           <w:tcPr>
-            <w:tcW w:w="2174" w:type="dxa"/>
+            <w:tcW w:w="2891" w:type="dxa"/>
           </w:tcPr>
           <w:p>
             <w:r>
@@ -4232,33 +4397,95 @@
         </w:tc>
         <w:tc>
           <w:tcPr>
-            <w:tcW w:w="3031" w:type="dxa"/>
-          </w:tcPr>
-          <w:p>
-            <w:pPr>
-              <w:jc w:val="center"/>
-              <w:rPr>
-                <w:lang w:val="id-ID"/>
-              </w:rPr>
-            </w:pPr>
-          </w:p>
-        </w:tc>
-        <w:tc>
-          <w:tcPr>
-            <w:tcW w:w="2480" w:type="dxa"/>
-          </w:tcPr>
-          <w:p>
-            <w:pPr>
-              <w:jc w:val="center"/>
-              <w:rPr>
-                <w:lang w:val="id-ID"/>
-              </w:rPr>
-            </w:pPr>
-          </w:p>
-        </w:tc>
-        <w:tc>
-          <w:tcPr>
-            <w:tcW w:w="512" w:type="dxa"/>
+            <w:tcW w:w="2104" w:type="dxa"/>
+          </w:tcPr>
+          <w:p>
+            <w:pPr>
+              <w:jc w:val="center"/>
+              <w:rPr>
+                <w:lang w:val="id-ID"/>
+              </w:rPr>
+            </w:pPr>
+            <w:r>
+              <w:rPr>
+                <w:lang w:val="id-ID"/>
+              </w:rPr>
+              <w:fldChar w:fldCharType="begin"/>
+            </w:r>
+            <w:r>
+              <w:rPr>
+                <w:lang w:val="id-ID"/>
+              </w:rPr>
+              <w:instrText xml:space="preserve"> MERGEFIELD REKAP_Terima_PX </w:instrText>
+            </w:r>
+            <w:r>
+              <w:rPr>
+                <w:lang w:val="id-ID"/>
+              </w:rPr>
+              <w:fldChar w:fldCharType="separate"/>
+            </w:r>
+            <w:r>
+              <w:rPr>
+                <w:noProof/>
+                <w:lang w:val="id-ID"/>
+              </w:rPr>
+              <w:t>5000</w:t>
+            </w:r>
+            <w:r>
+              <w:rPr>
+                <w:lang w:val="id-ID"/>
+              </w:rPr>
+              <w:fldChar w:fldCharType="end"/>
+            </w:r>
+          </w:p>
+        </w:tc>
+        <w:tc>
+          <w:tcPr>
+            <w:tcW w:w="2002" w:type="dxa"/>
+          </w:tcPr>
+          <w:p>
+            <w:pPr>
+              <w:jc w:val="center"/>
+              <w:rPr>
+                <w:lang w:val="id-ID"/>
+              </w:rPr>
+            </w:pPr>
+            <w:r>
+              <w:rPr>
+                <w:lang w:val="id-ID"/>
+              </w:rPr>
+              <w:fldChar w:fldCharType="begin"/>
+            </w:r>
+            <w:r>
+              <w:rPr>
+                <w:lang w:val="id-ID"/>
+              </w:rPr>
+              <w:instrText xml:space="preserve"> MERGEFIELD REKAP_Terima_PDX </w:instrText>
+            </w:r>
+            <w:r>
+              <w:rPr>
+                <w:lang w:val="id-ID"/>
+              </w:rPr>
+              <w:fldChar w:fldCharType="separate"/>
+            </w:r>
+            <w:r>
+              <w:rPr>
+                <w:noProof/>
+                <w:lang w:val="id-ID"/>
+              </w:rPr>
+              <w:t>5000</w:t>
+            </w:r>
+            <w:r>
+              <w:rPr>
+                <w:lang w:val="id-ID"/>
+              </w:rPr>
+              <w:fldChar w:fldCharType="end"/>
+            </w:r>
+          </w:p>
+        </w:tc>
+        <w:tc>
+          <w:tcPr>
+            <w:tcW w:w="859" w:type="dxa"/>
           </w:tcPr>
           <w:p/>
         </w:tc>
@@ -4266,7 +4493,7 @@
       <w:tr>
         <w:tc>
           <w:tcPr>
-            <w:tcW w:w="2099" w:type="dxa"/>
+            <w:tcW w:w="2440" w:type="dxa"/>
             <w:gridSpan w:val="2"/>
             <w:vMerge/>
           </w:tcPr>
@@ -4274,7 +4501,7 @@
         </w:tc>
         <w:tc>
           <w:tcPr>
-            <w:tcW w:w="2174" w:type="dxa"/>
+            <w:tcW w:w="2891" w:type="dxa"/>
           </w:tcPr>
           <w:p>
             <w:r>
@@ -4284,33 +4511,95 @@
         </w:tc>
         <w:tc>
           <w:tcPr>
-            <w:tcW w:w="3031" w:type="dxa"/>
-          </w:tcPr>
-          <w:p>
-            <w:pPr>
-              <w:jc w:val="center"/>
-              <w:rPr>
-                <w:lang w:val="id-ID"/>
-              </w:rPr>
-            </w:pPr>
-          </w:p>
-        </w:tc>
-        <w:tc>
-          <w:tcPr>
-            <w:tcW w:w="2480" w:type="dxa"/>
-          </w:tcPr>
-          <w:p>
-            <w:pPr>
-              <w:jc w:val="center"/>
-              <w:rPr>
-                <w:lang w:val="id-ID"/>
-              </w:rPr>
-            </w:pPr>
-          </w:p>
-        </w:tc>
-        <w:tc>
-          <w:tcPr>
-            <w:tcW w:w="512" w:type="dxa"/>
+            <w:tcW w:w="2104" w:type="dxa"/>
+          </w:tcPr>
+          <w:p>
+            <w:pPr>
+              <w:jc w:val="center"/>
+              <w:rPr>
+                <w:lang w:val="id-ID"/>
+              </w:rPr>
+            </w:pPr>
+            <w:r>
+              <w:rPr>
+                <w:lang w:val="id-ID"/>
+              </w:rPr>
+              <w:fldChar w:fldCharType="begin"/>
+            </w:r>
+            <w:r>
+              <w:rPr>
+                <w:lang w:val="id-ID"/>
+              </w:rPr>
+              <w:instrText xml:space="preserve"> MERGEFIELD REKAP_Jumlah_PX </w:instrText>
+            </w:r>
+            <w:r>
+              <w:rPr>
+                <w:lang w:val="id-ID"/>
+              </w:rPr>
+              <w:fldChar w:fldCharType="separate"/>
+            </w:r>
+            <w:r>
+              <w:rPr>
+                <w:noProof/>
+                <w:lang w:val="id-ID"/>
+              </w:rPr>
+              <w:t>6000</w:t>
+            </w:r>
+            <w:r>
+              <w:rPr>
+                <w:lang w:val="id-ID"/>
+              </w:rPr>
+              <w:fldChar w:fldCharType="end"/>
+            </w:r>
+          </w:p>
+        </w:tc>
+        <w:tc>
+          <w:tcPr>
+            <w:tcW w:w="2002" w:type="dxa"/>
+          </w:tcPr>
+          <w:p>
+            <w:pPr>
+              <w:jc w:val="center"/>
+              <w:rPr>
+                <w:lang w:val="id-ID"/>
+              </w:rPr>
+            </w:pPr>
+            <w:r>
+              <w:rPr>
+                <w:lang w:val="id-ID"/>
+              </w:rPr>
+              <w:fldChar w:fldCharType="begin"/>
+            </w:r>
+            <w:r>
+              <w:rPr>
+                <w:lang w:val="id-ID"/>
+              </w:rPr>
+              <w:instrText xml:space="preserve"> MERGEFIELD REKAP_Jumlah_PDX </w:instrText>
+            </w:r>
+            <w:r>
+              <w:rPr>
+                <w:lang w:val="id-ID"/>
+              </w:rPr>
+              <w:fldChar w:fldCharType="separate"/>
+            </w:r>
+            <w:r>
+              <w:rPr>
+                <w:noProof/>
+                <w:lang w:val="id-ID"/>
+              </w:rPr>
+              <w:t>6000</w:t>
+            </w:r>
+            <w:r>
+              <w:rPr>
+                <w:lang w:val="id-ID"/>
+              </w:rPr>
+              <w:fldChar w:fldCharType="end"/>
+            </w:r>
+          </w:p>
+        </w:tc>
+        <w:tc>
+          <w:tcPr>
+            <w:tcW w:w="859" w:type="dxa"/>
           </w:tcPr>
           <w:p/>
         </w:tc>
@@ -4318,7 +4607,7 @@
       <w:tr>
         <w:tc>
           <w:tcPr>
-            <w:tcW w:w="2099" w:type="dxa"/>
+            <w:tcW w:w="2440" w:type="dxa"/>
             <w:gridSpan w:val="2"/>
             <w:vMerge/>
           </w:tcPr>
@@ -4326,7 +4615,7 @@
         </w:tc>
         <w:tc>
           <w:tcPr>
-            <w:tcW w:w="2174" w:type="dxa"/>
+            <w:tcW w:w="2891" w:type="dxa"/>
           </w:tcPr>
           <w:p>
             <w:r>
@@ -4336,33 +4625,95 @@
         </w:tc>
         <w:tc>
           <w:tcPr>
-            <w:tcW w:w="3031" w:type="dxa"/>
-          </w:tcPr>
-          <w:p>
-            <w:pPr>
-              <w:jc w:val="center"/>
-              <w:rPr>
-                <w:lang w:val="id-ID"/>
-              </w:rPr>
-            </w:pPr>
-          </w:p>
-        </w:tc>
-        <w:tc>
-          <w:tcPr>
-            <w:tcW w:w="2480" w:type="dxa"/>
-          </w:tcPr>
-          <w:p>
-            <w:pPr>
-              <w:jc w:val="center"/>
-              <w:rPr>
-                <w:lang w:val="id-ID"/>
-              </w:rPr>
-            </w:pPr>
-          </w:p>
-        </w:tc>
-        <w:tc>
-          <w:tcPr>
-            <w:tcW w:w="512" w:type="dxa"/>
+            <w:tcW w:w="2104" w:type="dxa"/>
+          </w:tcPr>
+          <w:p>
+            <w:pPr>
+              <w:jc w:val="center"/>
+              <w:rPr>
+                <w:lang w:val="id-ID"/>
+              </w:rPr>
+            </w:pPr>
+            <w:r>
+              <w:rPr>
+                <w:lang w:val="id-ID"/>
+              </w:rPr>
+              <w:fldChar w:fldCharType="begin"/>
+            </w:r>
+            <w:r>
+              <w:rPr>
+                <w:lang w:val="id-ID"/>
+              </w:rPr>
+              <w:instrText xml:space="preserve"> MERGEFIELD REKAP_Keluar_PX </w:instrText>
+            </w:r>
+            <w:r>
+              <w:rPr>
+                <w:lang w:val="id-ID"/>
+              </w:rPr>
+              <w:fldChar w:fldCharType="separate"/>
+            </w:r>
+            <w:r>
+              <w:rPr>
+                <w:noProof/>
+                <w:lang w:val="id-ID"/>
+              </w:rPr>
+              <w:t>5000</w:t>
+            </w:r>
+            <w:r>
+              <w:rPr>
+                <w:lang w:val="id-ID"/>
+              </w:rPr>
+              <w:fldChar w:fldCharType="end"/>
+            </w:r>
+          </w:p>
+        </w:tc>
+        <w:tc>
+          <w:tcPr>
+            <w:tcW w:w="2002" w:type="dxa"/>
+          </w:tcPr>
+          <w:p>
+            <w:pPr>
+              <w:jc w:val="center"/>
+              <w:rPr>
+                <w:lang w:val="id-ID"/>
+              </w:rPr>
+            </w:pPr>
+            <w:r>
+              <w:rPr>
+                <w:lang w:val="id-ID"/>
+              </w:rPr>
+              <w:fldChar w:fldCharType="begin"/>
+            </w:r>
+            <w:r>
+              <w:rPr>
+                <w:lang w:val="id-ID"/>
+              </w:rPr>
+              <w:instrText xml:space="preserve"> MERGEFIELD REKAP_Keluar_PDX </w:instrText>
+            </w:r>
+            <w:r>
+              <w:rPr>
+                <w:lang w:val="id-ID"/>
+              </w:rPr>
+              <w:fldChar w:fldCharType="separate"/>
+            </w:r>
+            <w:r>
+              <w:rPr>
+                <w:noProof/>
+                <w:lang w:val="id-ID"/>
+              </w:rPr>
+              <w:t>5000</w:t>
+            </w:r>
+            <w:r>
+              <w:rPr>
+                <w:lang w:val="id-ID"/>
+              </w:rPr>
+              <w:fldChar w:fldCharType="end"/>
+            </w:r>
+          </w:p>
+        </w:tc>
+        <w:tc>
+          <w:tcPr>
+            <w:tcW w:w="859" w:type="dxa"/>
           </w:tcPr>
           <w:p/>
         </w:tc>
@@ -4370,7 +4721,7 @@
       <w:tr>
         <w:tc>
           <w:tcPr>
-            <w:tcW w:w="2099" w:type="dxa"/>
+            <w:tcW w:w="2440" w:type="dxa"/>
             <w:gridSpan w:val="2"/>
             <w:vMerge/>
           </w:tcPr>
@@ -4378,7 +4729,7 @@
         </w:tc>
         <w:tc>
           <w:tcPr>
-            <w:tcW w:w="2174" w:type="dxa"/>
+            <w:tcW w:w="2891" w:type="dxa"/>
           </w:tcPr>
           <w:p>
             <w:pPr>
@@ -4396,35 +4747,107 @@
         </w:tc>
         <w:tc>
           <w:tcPr>
-            <w:tcW w:w="3031" w:type="dxa"/>
-          </w:tcPr>
-          <w:p>
-            <w:pPr>
-              <w:jc w:val="center"/>
-              <w:rPr>
-                <w:b/>
-                <w:lang w:val="id-ID"/>
-              </w:rPr>
-            </w:pPr>
-          </w:p>
-        </w:tc>
-        <w:tc>
-          <w:tcPr>
-            <w:tcW w:w="2480" w:type="dxa"/>
-          </w:tcPr>
-          <w:p>
-            <w:pPr>
-              <w:jc w:val="center"/>
-              <w:rPr>
-                <w:b/>
-                <w:lang w:val="id-ID"/>
-              </w:rPr>
-            </w:pPr>
-          </w:p>
-        </w:tc>
-        <w:tc>
-          <w:tcPr>
-            <w:tcW w:w="512" w:type="dxa"/>
+            <w:tcW w:w="2104" w:type="dxa"/>
+          </w:tcPr>
+          <w:p>
+            <w:pPr>
+              <w:jc w:val="center"/>
+              <w:rPr>
+                <w:b/>
+                <w:lang w:val="id-ID"/>
+              </w:rPr>
+            </w:pPr>
+            <w:r>
+              <w:rPr>
+                <w:b/>
+                <w:lang w:val="id-ID"/>
+              </w:rPr>
+              <w:fldChar w:fldCharType="begin"/>
+            </w:r>
+            <w:r>
+              <w:rPr>
+                <w:b/>
+                <w:lang w:val="id-ID"/>
+              </w:rPr>
+              <w:instrText xml:space="preserve"> MERGEFIELD REKAP_Akhir_PX </w:instrText>
+            </w:r>
+            <w:r>
+              <w:rPr>
+                <w:b/>
+                <w:lang w:val="id-ID"/>
+              </w:rPr>
+              <w:fldChar w:fldCharType="separate"/>
+            </w:r>
+            <w:r>
+              <w:rPr>
+                <w:b/>
+                <w:noProof/>
+                <w:lang w:val="id-ID"/>
+              </w:rPr>
+              <w:t>1000</w:t>
+            </w:r>
+            <w:r>
+              <w:rPr>
+                <w:b/>
+                <w:lang w:val="id-ID"/>
+              </w:rPr>
+              <w:fldChar w:fldCharType="end"/>
+            </w:r>
+          </w:p>
+        </w:tc>
+        <w:tc>
+          <w:tcPr>
+            <w:tcW w:w="2002" w:type="dxa"/>
+          </w:tcPr>
+          <w:p>
+            <w:pPr>
+              <w:jc w:val="center"/>
+              <w:rPr>
+                <w:b/>
+                <w:lang w:val="id-ID"/>
+              </w:rPr>
+            </w:pPr>
+            <w:r>
+              <w:rPr>
+                <w:b/>
+                <w:lang w:val="id-ID"/>
+              </w:rPr>
+              <w:fldChar w:fldCharType="begin"/>
+            </w:r>
+            <w:r>
+              <w:rPr>
+                <w:b/>
+                <w:lang w:val="id-ID"/>
+              </w:rPr>
+              <w:instrText xml:space="preserve"> MERGEFIELD REKAP_Akhir_PDX </w:instrText>
+            </w:r>
+            <w:r>
+              <w:rPr>
+                <w:b/>
+                <w:lang w:val="id-ID"/>
+              </w:rPr>
+              <w:fldChar w:fldCharType="separate"/>
+            </w:r>
+            <w:r>
+              <w:rPr>
+                <w:b/>
+                <w:noProof/>
+                <w:lang w:val="id-ID"/>
+              </w:rPr>
+              <w:t>1000</w:t>
+            </w:r>
+            <w:r>
+              <w:rPr>
+                <w:b/>
+                <w:lang w:val="id-ID"/>
+              </w:rPr>
+              <w:fldChar w:fldCharType="end"/>
+            </w:r>
+          </w:p>
+        </w:tc>
+        <w:tc>
+          <w:tcPr>
+            <w:tcW w:w="859" w:type="dxa"/>
           </w:tcPr>
           <w:p/>
         </w:tc>
@@ -4436,7 +4859,7 @@
         <w:rPr>
           <w:noProof/>
         </w:rPr>
-        <w:pict w14:anchorId="232F4E18">
+        <w:pict w14:anchorId="6796A051">
           <v:shape id="_x0000_s1030" type="#_x0000_t202" style="position:absolute;margin-left:231.75pt;margin-top:.95pt;width:247.5pt;height:119.25pt;z-index:251669504;visibility:visible;mso-wrap-distance-top:3.6pt;mso-wrap-distance-bottom:3.6pt;mso-width-relative:margin;mso-height-relative:margin" o:gfxdata="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" strokecolor="white [3212]">
             <v:textbox>
               <w:txbxContent>
@@ -4772,10 +5195,10 @@
       </w:pPr>
     </w:lvl>
   </w:abstractNum>
-  <w:num w:numId="1" w16cid:durableId="630943506">
+  <w:num w:numId="1" w16cid:durableId="2076656630">
     <w:abstractNumId w:val="0"/>
   </w:num>
-  <w:num w:numId="2" w16cid:durableId="300770815">
+  <w:num w:numId="2" w16cid:durableId="1691296237">
     <w:abstractNumId w:val="1"/>
   </w:num>
 </w:numbering>

</xml_diff>

<commit_message>
Refactor, Fix bug generate laporan dan input stok opname
</commit_message>
<xml_diff>
--- a/static/templates/laporan/BLANKO LAPORAN BULANAN.docx
+++ b/static/templates/laporan/BLANKO LAPORAN BULANAN.docx
@@ -378,6 +378,42 @@
                     </w:rPr>
                     <w:t xml:space="preserve"> </w:t>
                   </w:r>
+                  <w:r>
+                    <w:rPr>
+                      <w:sz w:val="20"/>
+                      <w:szCs w:val="20"/>
+                    </w:rPr>
+                    <w:fldChar w:fldCharType="begin"/>
+                  </w:r>
+                  <w:r>
+                    <w:rPr>
+                      <w:sz w:val="20"/>
+                      <w:szCs w:val="20"/>
+                    </w:rPr>
+                    <w:instrText xml:space="preserve"> MERGEFIELD Bulan </w:instrText>
+                  </w:r>
+                  <w:r>
+                    <w:rPr>
+                      <w:sz w:val="20"/>
+                      <w:szCs w:val="20"/>
+                    </w:rPr>
+                    <w:fldChar w:fldCharType="separate"/>
+                  </w:r>
+                  <w:r>
+                    <w:rPr>
+                      <w:noProof/>
+                      <w:sz w:val="20"/>
+                      <w:szCs w:val="20"/>
+                    </w:rPr>
+                    <w:t>Mei</w:t>
+                  </w:r>
+                  <w:r>
+                    <w:rPr>
+                      <w:sz w:val="20"/>
+                      <w:szCs w:val="20"/>
+                    </w:rPr>
+                    <w:fldChar w:fldCharType="end"/>
+                  </w:r>
                 </w:p>
                 <w:p>
                   <w:pPr>
@@ -435,6 +471,42 @@
                     </w:rPr>
                     <w:t xml:space="preserve"> </w:t>
                   </w:r>
+                  <w:r>
+                    <w:rPr>
+                      <w:sz w:val="20"/>
+                      <w:szCs w:val="20"/>
+                    </w:rPr>
+                    <w:fldChar w:fldCharType="begin"/>
+                  </w:r>
+                  <w:r>
+                    <w:rPr>
+                      <w:sz w:val="20"/>
+                      <w:szCs w:val="20"/>
+                    </w:rPr>
+                    <w:instrText xml:space="preserve"> MERGEFIELD Triwulan </w:instrText>
+                  </w:r>
+                  <w:r>
+                    <w:rPr>
+                      <w:sz w:val="20"/>
+                      <w:szCs w:val="20"/>
+                    </w:rPr>
+                    <w:fldChar w:fldCharType="separate"/>
+                  </w:r>
+                  <w:r>
+                    <w:rPr>
+                      <w:noProof/>
+                      <w:sz w:val="20"/>
+                      <w:szCs w:val="20"/>
+                    </w:rPr>
+                    <w:t>II (DUA)</w:t>
+                  </w:r>
+                  <w:r>
+                    <w:rPr>
+                      <w:sz w:val="20"/>
+                      <w:szCs w:val="20"/>
+                    </w:rPr>
+                    <w:fldChar w:fldCharType="end"/>
+                  </w:r>
                 </w:p>
                 <w:p>
                   <w:pPr>
@@ -468,6 +540,42 @@
                       <w:szCs w:val="20"/>
                     </w:rPr>
                     <w:t xml:space="preserve"> </w:t>
+                  </w:r>
+                  <w:r>
+                    <w:rPr>
+                      <w:sz w:val="20"/>
+                      <w:szCs w:val="20"/>
+                    </w:rPr>
+                    <w:fldChar w:fldCharType="begin"/>
+                  </w:r>
+                  <w:r>
+                    <w:rPr>
+                      <w:sz w:val="20"/>
+                      <w:szCs w:val="20"/>
+                    </w:rPr>
+                    <w:instrText xml:space="preserve"> MERGEFIELD Tahun </w:instrText>
+                  </w:r>
+                  <w:r>
+                    <w:rPr>
+                      <w:sz w:val="20"/>
+                      <w:szCs w:val="20"/>
+                    </w:rPr>
+                    <w:fldChar w:fldCharType="separate"/>
+                  </w:r>
+                  <w:r>
+                    <w:rPr>
+                      <w:noProof/>
+                      <w:sz w:val="20"/>
+                      <w:szCs w:val="20"/>
+                    </w:rPr>
+                    <w:t>2026</w:t>
+                  </w:r>
+                  <w:r>
+                    <w:rPr>
+                      <w:sz w:val="20"/>
+                      <w:szCs w:val="20"/>
+                    </w:rPr>
+                    <w:fldChar w:fldCharType="end"/>
                   </w:r>
                 </w:p>
                 <w:p>
@@ -888,6 +996,14 @@
             <w:pPr>
               <w:jc w:val="center"/>
             </w:pPr>
+            <w:fldSimple w:instr=" MERGEFIELD FullDate_T1 ">
+              <w:r>
+                <w:rPr>
+                  <w:noProof/>
+                </w:rPr>
+                <w:t>01-05-2026</w:t>
+              </w:r>
+            </w:fldSimple>
           </w:p>
         </w:tc>
         <w:tc>
@@ -934,7 +1050,7 @@
                 <w:noProof/>
                 <w:lang w:val="id-ID"/>
               </w:rPr>
-              <w:t>1000</w:t>
+              <w:t>10000</w:t>
             </w:r>
             <w:r>
               <w:rPr>
@@ -978,7 +1094,7 @@
                 <w:noProof/>
                 <w:lang w:val="id-ID"/>
               </w:rPr>
-              <w:t>1000</w:t>
+              <w:t>10000</w:t>
             </w:r>
             <w:r>
               <w:rPr>
@@ -1058,7 +1174,7 @@
                 <w:noProof/>
                 <w:lang w:val="id-ID"/>
               </w:rPr>
-              <w:t>5000</w:t>
+              <w:t>0</w:t>
             </w:r>
             <w:r>
               <w:rPr>
@@ -1102,7 +1218,7 @@
                 <w:noProof/>
                 <w:lang w:val="id-ID"/>
               </w:rPr>
-              <w:t>5000</w:t>
+              <w:t>0</w:t>
             </w:r>
             <w:r>
               <w:rPr>
@@ -1182,7 +1298,7 @@
                 <w:noProof/>
                 <w:lang w:val="id-ID"/>
               </w:rPr>
-              <w:t>6000</w:t>
+              <w:t>10000</w:t>
             </w:r>
             <w:r>
               <w:rPr>
@@ -1226,7 +1342,7 @@
                 <w:noProof/>
                 <w:lang w:val="id-ID"/>
               </w:rPr>
-              <w:t>6000</w:t>
+              <w:t>10000</w:t>
             </w:r>
             <w:r>
               <w:rPr>
@@ -1306,7 +1422,7 @@
                 <w:noProof/>
                 <w:lang w:val="id-ID"/>
               </w:rPr>
-              <w:t>1000</w:t>
+              <w:t>0</w:t>
             </w:r>
             <w:r>
               <w:rPr>
@@ -1350,7 +1466,7 @@
                 <w:noProof/>
                 <w:lang w:val="id-ID"/>
               </w:rPr>
-              <w:t>1000</w:t>
+              <w:t>0</w:t>
             </w:r>
             <w:r>
               <w:rPr>
@@ -1435,7 +1551,7 @@
                 <w:noProof/>
                 <w:lang w:val="id-ID"/>
               </w:rPr>
-              <w:t>5000</w:t>
+              <w:t>10000</w:t>
             </w:r>
             <w:r>
               <w:rPr>
@@ -1485,7 +1601,7 @@
                 <w:noProof/>
                 <w:lang w:val="id-ID"/>
               </w:rPr>
-              <w:t>5000</w:t>
+              <w:t>10000</w:t>
             </w:r>
             <w:r>
               <w:rPr>
@@ -1604,6 +1720,37 @@
                 <w:lang w:val="id-ID"/>
               </w:rPr>
             </w:pPr>
+            <w:r>
+              <w:rPr>
+                <w:lang w:val="id-ID"/>
+              </w:rPr>
+              <w:fldChar w:fldCharType="begin"/>
+            </w:r>
+            <w:r>
+              <w:rPr>
+                <w:lang w:val="id-ID"/>
+              </w:rPr>
+              <w:instrText xml:space="preserve"> MERGEFIELD FullDate_T2 </w:instrText>
+            </w:r>
+            <w:r>
+              <w:rPr>
+                <w:lang w:val="id-ID"/>
+              </w:rPr>
+              <w:fldChar w:fldCharType="separate"/>
+            </w:r>
+            <w:r>
+              <w:rPr>
+                <w:noProof/>
+                <w:lang w:val="id-ID"/>
+              </w:rPr>
+              <w:t>04-05-2026</w:t>
+            </w:r>
+            <w:r>
+              <w:rPr>
+                <w:lang w:val="id-ID"/>
+              </w:rPr>
+              <w:fldChar w:fldCharType="end"/>
+            </w:r>
           </w:p>
         </w:tc>
         <w:tc>
@@ -1650,7 +1797,7 @@
                 <w:noProof/>
                 <w:lang w:val="id-ID"/>
               </w:rPr>
-              <w:t>5000</w:t>
+              <w:t>10000</w:t>
             </w:r>
             <w:r>
               <w:rPr>
@@ -1694,7 +1841,7 @@
                 <w:noProof/>
                 <w:lang w:val="id-ID"/>
               </w:rPr>
-              <w:t>5000</w:t>
+              <w:t>10000</w:t>
             </w:r>
             <w:r>
               <w:rPr>
@@ -1901,7 +2048,7 @@
                 <w:noProof/>
                 <w:lang w:val="id-ID"/>
               </w:rPr>
-              <w:t>5000</w:t>
+              <w:t>10000</w:t>
             </w:r>
             <w:r>
               <w:rPr>
@@ -1945,7 +2092,7 @@
                 <w:noProof/>
                 <w:lang w:val="id-ID"/>
               </w:rPr>
-              <w:t>5000</w:t>
+              <w:t>10000</w:t>
             </w:r>
             <w:r>
               <w:rPr>
@@ -2030,7 +2177,7 @@
                 <w:noProof/>
                 <w:lang w:val="id-ID"/>
               </w:rPr>
-              <w:t>1000</w:t>
+              <w:t>0</w:t>
             </w:r>
             <w:r>
               <w:rPr>
@@ -2074,7 +2221,7 @@
                 <w:noProof/>
                 <w:lang w:val="id-ID"/>
               </w:rPr>
-              <w:t>1000</w:t>
+              <w:t>0</w:t>
             </w:r>
             <w:r>
               <w:rPr>
@@ -2159,7 +2306,7 @@
                 <w:noProof/>
                 <w:lang w:val="id-ID"/>
               </w:rPr>
-              <w:t>4000</w:t>
+              <w:t>10000</w:t>
             </w:r>
             <w:r>
               <w:rPr>
@@ -2209,7 +2356,7 @@
                 <w:noProof/>
                 <w:lang w:val="id-ID"/>
               </w:rPr>
-              <w:t>4000</w:t>
+              <w:t>10000</w:t>
             </w:r>
             <w:r>
               <w:rPr>
@@ -2303,6 +2450,14 @@
             <w:pPr>
               <w:jc w:val="center"/>
             </w:pPr>
+            <w:fldSimple w:instr=" MERGEFIELD FullDate_T3 ">
+              <w:r>
+                <w:rPr>
+                  <w:noProof/>
+                </w:rPr>
+                <w:t>11-05-2026</w:t>
+              </w:r>
+            </w:fldSimple>
           </w:p>
         </w:tc>
         <w:tc>
@@ -2369,7 +2524,7 @@
                 <w:noProof/>
                 <w:lang w:val="id-ID"/>
               </w:rPr>
-              <w:t>4000</w:t>
+              <w:t>10000</w:t>
             </w:r>
             <w:r>
               <w:rPr>
@@ -2425,7 +2580,7 @@
                 <w:noProof/>
                 <w:lang w:val="id-ID"/>
               </w:rPr>
-              <w:t>4000</w:t>
+              <w:t>10000</w:t>
             </w:r>
             <w:r>
               <w:rPr>
@@ -2521,7 +2676,7 @@
                 <w:noProof/>
                 <w:lang w:val="id-ID"/>
               </w:rPr>
-              <w:t>0</w:t>
+              <w:t>1000</w:t>
             </w:r>
             <w:r>
               <w:rPr>
@@ -2577,7 +2732,7 @@
                 <w:noProof/>
                 <w:lang w:val="id-ID"/>
               </w:rPr>
-              <w:t>0</w:t>
+              <w:t>1000</w:t>
             </w:r>
             <w:r>
               <w:rPr>
@@ -2669,7 +2824,7 @@
                 <w:noProof/>
                 <w:lang w:val="id-ID"/>
               </w:rPr>
-              <w:t>4000</w:t>
+              <w:t>11000</w:t>
             </w:r>
             <w:r>
               <w:rPr>
@@ -2725,7 +2880,7 @@
                 <w:noProof/>
                 <w:lang w:val="id-ID"/>
               </w:rPr>
-              <w:t>4000</w:t>
+              <w:t>11000</w:t>
             </w:r>
             <w:r>
               <w:rPr>
@@ -2817,7 +2972,7 @@
                 <w:noProof/>
                 <w:lang w:val="id-ID"/>
               </w:rPr>
-              <w:t>1000</w:t>
+              <w:t>0</w:t>
             </w:r>
             <w:r>
               <w:rPr>
@@ -2873,7 +3028,7 @@
                 <w:noProof/>
                 <w:lang w:val="id-ID"/>
               </w:rPr>
-              <w:t>1000</w:t>
+              <w:t>0</w:t>
             </w:r>
             <w:r>
               <w:rPr>
@@ -2972,7 +3127,7 @@
                 <w:noProof/>
                 <w:lang w:val="id-ID"/>
               </w:rPr>
-              <w:t>3000</w:t>
+              <w:t>11000</w:t>
             </w:r>
             <w:r>
               <w:rPr>
@@ -3036,7 +3191,7 @@
                 <w:noProof/>
                 <w:lang w:val="id-ID"/>
               </w:rPr>
-              <w:t>3000</w:t>
+              <w:t>11000</w:t>
             </w:r>
             <w:r>
               <w:rPr>
@@ -3130,6 +3285,14 @@
             <w:pPr>
               <w:jc w:val="center"/>
             </w:pPr>
+            <w:fldSimple w:instr=" MERGEFIELD FullDate_T4 ">
+              <w:r>
+                <w:rPr>
+                  <w:noProof/>
+                </w:rPr>
+                <w:t>18-05-2026</w:t>
+              </w:r>
+            </w:fldSimple>
           </w:p>
         </w:tc>
         <w:tc>
@@ -3176,7 +3339,7 @@
                 <w:noProof/>
                 <w:lang w:val="id-ID"/>
               </w:rPr>
-              <w:t>3000</w:t>
+              <w:t>11000</w:t>
             </w:r>
             <w:r>
               <w:rPr>
@@ -3232,7 +3395,7 @@
                 <w:noProof/>
                 <w:lang w:val="id-ID"/>
               </w:rPr>
-              <w:t>3000</w:t>
+              <w:t>11000</w:t>
             </w:r>
             <w:r>
               <w:rPr>
@@ -3308,7 +3471,7 @@
                 <w:noProof/>
                 <w:lang w:val="id-ID"/>
               </w:rPr>
-              <w:t>1000</w:t>
+              <w:t>0</w:t>
             </w:r>
             <w:r>
               <w:rPr>
@@ -3364,7 +3527,7 @@
                 <w:noProof/>
                 <w:lang w:val="id-ID"/>
               </w:rPr>
-              <w:t>1000</w:t>
+              <w:t>0</w:t>
             </w:r>
             <w:r>
               <w:rPr>
@@ -3445,7 +3608,7 @@
                 <w:noProof/>
                 <w:lang w:val="id-ID"/>
               </w:rPr>
-              <w:t>2000</w:t>
+              <w:t>11000</w:t>
             </w:r>
             <w:r>
               <w:rPr>
@@ -3509,7 +3672,7 @@
                 <w:noProof/>
                 <w:lang w:val="id-ID"/>
               </w:rPr>
-              <w:t>2000</w:t>
+              <w:t>11000</w:t>
             </w:r>
             <w:r>
               <w:rPr>
@@ -3731,6 +3894,14 @@
             <w:pPr>
               <w:jc w:val="center"/>
             </w:pPr>
+            <w:fldSimple w:instr=" MERGEFIELD FullDate_T5 ">
+              <w:r>
+                <w:rPr>
+                  <w:noProof/>
+                </w:rPr>
+                <w:t>25-05-2026</w:t>
+              </w:r>
+            </w:fldSimple>
           </w:p>
         </w:tc>
         <w:tc>
@@ -3777,7 +3948,7 @@
                 <w:noProof/>
                 <w:lang w:val="id-ID"/>
               </w:rPr>
-              <w:t>2000</w:t>
+              <w:t>11000</w:t>
             </w:r>
             <w:r>
               <w:rPr>
@@ -3821,7 +3992,7 @@
                 <w:noProof/>
                 <w:lang w:val="id-ID"/>
               </w:rPr>
-              <w:t>2000</w:t>
+              <w:t>11000</w:t>
             </w:r>
             <w:r>
               <w:rPr>
@@ -3897,7 +4068,7 @@
                 <w:noProof/>
                 <w:lang w:val="id-ID"/>
               </w:rPr>
-              <w:t>1000</w:t>
+              <w:t>0</w:t>
             </w:r>
             <w:r>
               <w:rPr>
@@ -3941,7 +4112,7 @@
                 <w:noProof/>
                 <w:lang w:val="id-ID"/>
               </w:rPr>
-              <w:t>1000</w:t>
+              <w:t>0</w:t>
             </w:r>
             <w:r>
               <w:rPr>
@@ -4022,7 +4193,7 @@
                 <w:noProof/>
                 <w:lang w:val="id-ID"/>
               </w:rPr>
-              <w:t>1000</w:t>
+              <w:t>11000</w:t>
             </w:r>
             <w:r>
               <w:rPr>
@@ -4072,7 +4243,7 @@
                 <w:noProof/>
                 <w:lang w:val="id-ID"/>
               </w:rPr>
-              <w:t>1000</w:t>
+              <w:t>11000</w:t>
             </w:r>
             <w:r>
               <w:rPr>
@@ -4315,7 +4486,7 @@
                 <w:noProof/>
                 <w:lang w:val="id-ID"/>
               </w:rPr>
-              <w:t>1000</w:t>
+              <w:t>10000</w:t>
             </w:r>
             <w:r>
               <w:rPr>
@@ -4359,7 +4530,7 @@
                 <w:noProof/>
                 <w:lang w:val="id-ID"/>
               </w:rPr>
-              <w:t>1000</w:t>
+              <w:t>10000</w:t>
             </w:r>
             <w:r>
               <w:rPr>
@@ -4429,7 +4600,7 @@
                 <w:noProof/>
                 <w:lang w:val="id-ID"/>
               </w:rPr>
-              <w:t>5000</w:t>
+              <w:t>1000</w:t>
             </w:r>
             <w:r>
               <w:rPr>
@@ -4473,7 +4644,7 @@
                 <w:noProof/>
                 <w:lang w:val="id-ID"/>
               </w:rPr>
-              <w:t>5000</w:t>
+              <w:t>1000</w:t>
             </w:r>
             <w:r>
               <w:rPr>
@@ -4491,6 +4662,9 @@
         </w:tc>
       </w:tr>
       <w:tr>
+        <w:trPr>
+          <w:cantSplit/>
+        </w:trPr>
         <w:tc>
           <w:tcPr>
             <w:tcW w:w="2440" w:type="dxa"/>
@@ -4543,7 +4717,7 @@
                 <w:noProof/>
                 <w:lang w:val="id-ID"/>
               </w:rPr>
-              <w:t>6000</w:t>
+              <w:t>11000</w:t>
             </w:r>
             <w:r>
               <w:rPr>
@@ -4587,7 +4761,7 @@
                 <w:noProof/>
                 <w:lang w:val="id-ID"/>
               </w:rPr>
-              <w:t>6000</w:t>
+              <w:t>11000</w:t>
             </w:r>
             <w:r>
               <w:rPr>
@@ -4605,6 +4779,9 @@
         </w:tc>
       </w:tr>
       <w:tr>
+        <w:trPr>
+          <w:cantSplit/>
+        </w:trPr>
         <w:tc>
           <w:tcPr>
             <w:tcW w:w="2440" w:type="dxa"/>
@@ -4657,7 +4834,7 @@
                 <w:noProof/>
                 <w:lang w:val="id-ID"/>
               </w:rPr>
-              <w:t>5000</w:t>
+              <w:t>0</w:t>
             </w:r>
             <w:r>
               <w:rPr>
@@ -4701,7 +4878,7 @@
                 <w:noProof/>
                 <w:lang w:val="id-ID"/>
               </w:rPr>
-              <w:t>5000</w:t>
+              <w:t>0</w:t>
             </w:r>
             <w:r>
               <w:rPr>
@@ -4784,7 +4961,7 @@
                 <w:noProof/>
                 <w:lang w:val="id-ID"/>
               </w:rPr>
-              <w:t>1000</w:t>
+              <w:t>11000</w:t>
             </w:r>
             <w:r>
               <w:rPr>
@@ -4834,7 +5011,7 @@
                 <w:noProof/>
                 <w:lang w:val="id-ID"/>
               </w:rPr>
-              <w:t>1000</w:t>
+              <w:t>11000</w:t>
             </w:r>
             <w:r>
               <w:rPr>
@@ -4878,7 +5055,86 @@
                       <w:sz w:val="20"/>
                       <w:szCs w:val="20"/>
                     </w:rPr>
-                    <w:t xml:space="preserve">Bandung,             </w:t>
+                    <w:t xml:space="preserve">Bandung, </w:t>
+                  </w:r>
+                  <w:r>
+                    <w:rPr>
+                      <w:sz w:val="20"/>
+                      <w:szCs w:val="20"/>
+                    </w:rPr>
+                    <w:fldChar w:fldCharType="begin"/>
+                  </w:r>
+                  <w:r>
+                    <w:rPr>
+                      <w:sz w:val="20"/>
+                      <w:szCs w:val="20"/>
+                    </w:rPr>
+                    <w:instrText xml:space="preserve"> MERGEFIELD Bulan </w:instrText>
+                  </w:r>
+                  <w:r>
+                    <w:rPr>
+                      <w:sz w:val="20"/>
+                      <w:szCs w:val="20"/>
+                    </w:rPr>
+                    <w:fldChar w:fldCharType="separate"/>
+                  </w:r>
+                  <w:r>
+                    <w:rPr>
+                      <w:noProof/>
+                      <w:sz w:val="20"/>
+                      <w:szCs w:val="20"/>
+                    </w:rPr>
+                    <w:t>Mei</w:t>
+                  </w:r>
+                  <w:r>
+                    <w:rPr>
+                      <w:sz w:val="20"/>
+                      <w:szCs w:val="20"/>
+                    </w:rPr>
+                    <w:fldChar w:fldCharType="end"/>
+                  </w:r>
+                  <w:r>
+                    <w:rPr>
+                      <w:sz w:val="20"/>
+                      <w:szCs w:val="20"/>
+                    </w:rPr>
+                    <w:t xml:space="preserve"> </w:t>
+                  </w:r>
+                  <w:r>
+                    <w:rPr>
+                      <w:sz w:val="20"/>
+                      <w:szCs w:val="20"/>
+                    </w:rPr>
+                    <w:fldChar w:fldCharType="begin"/>
+                  </w:r>
+                  <w:r>
+                    <w:rPr>
+                      <w:sz w:val="20"/>
+                      <w:szCs w:val="20"/>
+                    </w:rPr>
+                    <w:instrText xml:space="preserve"> MERGEFIELD Tahun </w:instrText>
+                  </w:r>
+                  <w:r>
+                    <w:rPr>
+                      <w:sz w:val="20"/>
+                      <w:szCs w:val="20"/>
+                    </w:rPr>
+                    <w:fldChar w:fldCharType="separate"/>
+                  </w:r>
+                  <w:r>
+                    <w:rPr>
+                      <w:noProof/>
+                      <w:sz w:val="20"/>
+                      <w:szCs w:val="20"/>
+                    </w:rPr>
+                    <w:t>2026</w:t>
+                  </w:r>
+                  <w:r>
+                    <w:rPr>
+                      <w:sz w:val="20"/>
+                      <w:szCs w:val="20"/>
+                    </w:rPr>
+                    <w:fldChar w:fldCharType="end"/>
                   </w:r>
                 </w:p>
                 <w:p>

</xml_diff>

<commit_message>
alokasi and laporan merge
</commit_message>
<xml_diff>
--- a/static/templates/laporan/BLANKO LAPORAN BULANAN.docx
+++ b/static/templates/laporan/BLANKO LAPORAN BULANAN.docx
@@ -324,11 +324,11 @@
                       <w:lang w:val="id-ID"/>
                     </w:rPr>
                   </w:pPr>
-                  <w:proofErr w:type="gramStart"/>
                   <w:r>
                     <w:rPr>
                       <w:sz w:val="20"/>
                       <w:szCs w:val="20"/>
+                      <w:lang w:val="en-ID"/>
                     </w:rPr>
                     <w:t>.</w:t>
                   </w:r>
@@ -336,21 +336,15 @@
                     <w:rPr>
                       <w:sz w:val="20"/>
                       <w:szCs w:val="20"/>
-                    </w:rPr>
-                    <w:t>BULAN</w:t>
+                      <w:lang w:val="en-ID"/>
+                    </w:rPr>
+                    <w:t xml:space="preserve">BULAN </w:t>
                   </w:r>
-                  <w:proofErr w:type="gramEnd"/>
                   <w:r>
                     <w:rPr>
                       <w:sz w:val="20"/>
                       <w:szCs w:val="20"/>
-                    </w:rPr>
-                    <w:t xml:space="preserve"> </w:t>
-                  </w:r>
-                  <w:r>
-                    <w:rPr>
-                      <w:sz w:val="20"/>
-                      <w:szCs w:val="20"/>
+                      <w:lang w:val="en-ID"/>
                     </w:rPr>
                     <w:tab/>
                   </w:r>
@@ -358,25 +352,10 @@
                     <w:rPr>
                       <w:sz w:val="20"/>
                       <w:szCs w:val="20"/>
+                      <w:lang w:val="en-ID"/>
                     </w:rPr>
                     <w:tab/>
-                    <w:t xml:space="preserve">   </w:t>
-                  </w:r>
-                  <w:proofErr w:type="gramStart"/>
-                  <w:r>
-                    <w:rPr>
-                      <w:sz w:val="20"/>
-                      <w:szCs w:val="20"/>
-                    </w:rPr>
-                    <w:t xml:space="preserve">  :</w:t>
-                  </w:r>
-                  <w:proofErr w:type="gramEnd"/>
-                  <w:r>
-                    <w:rPr>
-                      <w:sz w:val="20"/>
-                      <w:szCs w:val="20"/>
-                    </w:rPr>
-                    <w:t xml:space="preserve"> </w:t>
+                    <w:t xml:space="preserve">     : </w:t>
                   </w:r>
                   <w:r>
                     <w:rPr>
@@ -389,6 +368,7 @@
                     <w:rPr>
                       <w:sz w:val="20"/>
                       <w:szCs w:val="20"/>
+                      <w:lang w:val="en-ID"/>
                     </w:rPr>
                     <w:instrText xml:space="preserve"> MERGEFIELD Bulan </w:instrText>
                   </w:r>
@@ -404,8 +384,9 @@
                       <w:noProof/>
                       <w:sz w:val="20"/>
                       <w:szCs w:val="20"/>
-                    </w:rPr>
-                    <w:t>Mei</w:t>
+                      <w:lang w:val="en-ID"/>
+                    </w:rPr>
+                    <w:t>Juni</w:t>
                   </w:r>
                   <w:r>
                     <w:rPr>
@@ -423,12 +404,14 @@
                     <w:rPr>
                       <w:sz w:val="20"/>
                       <w:szCs w:val="20"/>
+                      <w:lang w:val="en-ID"/>
                     </w:rPr>
                   </w:pPr>
                   <w:r>
                     <w:rPr>
                       <w:sz w:val="20"/>
                       <w:szCs w:val="20"/>
+                      <w:lang w:val="en-ID"/>
                     </w:rPr>
                     <w:t>TRIWULAN</w:t>
                   </w:r>
@@ -436,6 +419,7 @@
                     <w:rPr>
                       <w:sz w:val="20"/>
                       <w:szCs w:val="20"/>
+                      <w:lang w:val="en-ID"/>
                     </w:rPr>
                     <w:tab/>
                   </w:r>
@@ -445,31 +429,15 @@
                       <w:szCs w:val="20"/>
                       <w:lang w:val="id-ID"/>
                     </w:rPr>
-                    <w:t xml:space="preserve">   </w:t>
+                    <w:t xml:space="preserve">     </w:t>
                   </w:r>
-                  <w:proofErr w:type="gramStart"/>
                   <w:r>
                     <w:rPr>
                       <w:sz w:val="20"/>
                       <w:szCs w:val="20"/>
-                      <w:lang w:val="id-ID"/>
-                    </w:rPr>
-                    <w:t xml:space="preserve">  </w:t>
-                  </w:r>
-                  <w:r>
-                    <w:rPr>
-                      <w:sz w:val="20"/>
-                      <w:szCs w:val="20"/>
-                    </w:rPr>
-                    <w:t>:</w:t>
-                  </w:r>
-                  <w:proofErr w:type="gramEnd"/>
-                  <w:r>
-                    <w:rPr>
-                      <w:sz w:val="20"/>
-                      <w:szCs w:val="20"/>
-                    </w:rPr>
-                    <w:t xml:space="preserve"> </w:t>
+                      <w:lang w:val="en-ID"/>
+                    </w:rPr>
+                    <w:t xml:space="preserve">: </w:t>
                   </w:r>
                   <w:r>
                     <w:rPr>
@@ -482,6 +450,7 @@
                     <w:rPr>
                       <w:sz w:val="20"/>
                       <w:szCs w:val="20"/>
+                      <w:lang w:val="en-ID"/>
                     </w:rPr>
                     <w:instrText xml:space="preserve"> MERGEFIELD Triwulan </w:instrText>
                   </w:r>
@@ -497,6 +466,7 @@
                       <w:noProof/>
                       <w:sz w:val="20"/>
                       <w:szCs w:val="20"/>
+                      <w:lang w:val="en-ID"/>
                     </w:rPr>
                     <w:t>II (DUA)</w:t>
                   </w:r>
@@ -516,30 +486,16 @@
                     <w:rPr>
                       <w:sz w:val="20"/>
                       <w:szCs w:val="20"/>
+                      <w:lang w:val="it-IT"/>
                     </w:rPr>
                   </w:pPr>
                   <w:r>
                     <w:rPr>
                       <w:sz w:val="20"/>
                       <w:szCs w:val="20"/>
-                    </w:rPr>
-                    <w:t xml:space="preserve">TAHUN </w:t>
-                  </w:r>
-                  <w:proofErr w:type="gramStart"/>
-                  <w:r>
-                    <w:rPr>
-                      <w:sz w:val="20"/>
-                      <w:szCs w:val="20"/>
-                    </w:rPr>
-                    <w:t>ANGGARAN :</w:t>
-                  </w:r>
-                  <w:proofErr w:type="gramEnd"/>
-                  <w:r>
-                    <w:rPr>
-                      <w:sz w:val="20"/>
-                      <w:szCs w:val="20"/>
-                    </w:rPr>
-                    <w:t xml:space="preserve"> </w:t>
+                      <w:lang w:val="it-IT"/>
+                    </w:rPr>
+                    <w:t xml:space="preserve">TAHUN ANGGARAN : </w:t>
                   </w:r>
                   <w:r>
                     <w:rPr>
@@ -552,6 +508,7 @@
                     <w:rPr>
                       <w:sz w:val="20"/>
                       <w:szCs w:val="20"/>
+                      <w:lang w:val="it-IT"/>
                     </w:rPr>
                     <w:instrText xml:space="preserve"> MERGEFIELD Tahun </w:instrText>
                   </w:r>
@@ -567,6 +524,7 @@
                       <w:noProof/>
                       <w:sz w:val="20"/>
                       <w:szCs w:val="20"/>
+                      <w:lang w:val="it-IT"/>
                     </w:rPr>
                     <w:t>2026</w:t>
                   </w:r>
@@ -586,6 +544,7 @@
                     <w:rPr>
                       <w:sz w:val="20"/>
                       <w:szCs w:val="20"/>
+                      <w:lang w:val="it-IT"/>
                     </w:rPr>
                   </w:pPr>
                 </w:p>
@@ -611,13 +570,14 @@
                     <w:rPr>
                       <w:sz w:val="20"/>
                       <w:szCs w:val="20"/>
+                      <w:lang w:val="it-IT"/>
                     </w:rPr>
                   </w:pPr>
-                  <w:proofErr w:type="gramStart"/>
                   <w:r>
                     <w:rPr>
                       <w:sz w:val="20"/>
                       <w:szCs w:val="20"/>
+                      <w:lang w:val="it-IT"/>
                     </w:rPr>
                     <w:t>.</w:t>
                   </w:r>
@@ -625,89 +585,33 @@
                     <w:rPr>
                       <w:sz w:val="20"/>
                       <w:szCs w:val="20"/>
-                    </w:rPr>
-                    <w:t>SATKAI</w:t>
+                      <w:lang w:val="it-IT"/>
+                    </w:rPr>
+                    <w:t xml:space="preserve">SATKAI </w:t>
                   </w:r>
-                  <w:proofErr w:type="gramEnd"/>
                   <w:r>
                     <w:rPr>
                       <w:sz w:val="20"/>
                       <w:szCs w:val="20"/>
-                    </w:rPr>
-                    <w:t xml:space="preserve"> I</w:t>
+                      <w:lang w:val="it-IT"/>
+                    </w:rPr>
+                    <w:t>I</w:t>
                   </w:r>
                   <w:r>
                     <w:rPr>
                       <w:sz w:val="20"/>
                       <w:szCs w:val="20"/>
-                    </w:rPr>
-                    <w:t xml:space="preserve"> </w:t>
+                      <w:lang w:val="it-IT"/>
+                    </w:rPr>
+                    <w:t xml:space="preserve">  :</w:t>
                   </w:r>
-                  <w:proofErr w:type="gramStart"/>
                   <w:r>
                     <w:rPr>
                       <w:sz w:val="20"/>
                       <w:szCs w:val="20"/>
-                    </w:rPr>
-                    <w:t xml:space="preserve"> :</w:t>
-                  </w:r>
-                  <w:r>
-                    <w:rPr>
-                      <w:sz w:val="20"/>
-                      <w:szCs w:val="20"/>
-                    </w:rPr>
-                    <w:t>…</w:t>
-                  </w:r>
-                  <w:proofErr w:type="gramEnd"/>
-                  <w:r>
-                    <w:rPr>
-                      <w:sz w:val="20"/>
-                      <w:szCs w:val="20"/>
-                    </w:rPr>
-                    <w:t>……………</w:t>
-                  </w:r>
-                  <w:proofErr w:type="gramStart"/>
-                  <w:r>
-                    <w:rPr>
-                      <w:sz w:val="20"/>
-                      <w:szCs w:val="20"/>
-                    </w:rPr>
-                    <w:t>…..</w:t>
-                  </w:r>
-                  <w:proofErr w:type="gramEnd"/>
-                </w:p>
-                <w:p>
-                  <w:pPr>
-                    <w:spacing w:line="360" w:lineRule="auto"/>
-                    <w:contextualSpacing/>
-                    <w:jc w:val="both"/>
-                    <w:rPr>
-                      <w:sz w:val="20"/>
-                      <w:szCs w:val="20"/>
-                    </w:rPr>
-                  </w:pPr>
-                  <w:r>
-                    <w:rPr>
-                      <w:sz w:val="20"/>
-                      <w:szCs w:val="20"/>
-                    </w:rPr>
-                    <w:t xml:space="preserve">SATKAI </w:t>
-                  </w:r>
-                  <w:proofErr w:type="gramStart"/>
-                  <w:r>
-                    <w:rPr>
-                      <w:sz w:val="20"/>
-                      <w:szCs w:val="20"/>
-                    </w:rPr>
-                    <w:t>II :</w:t>
-                  </w:r>
-                  <w:proofErr w:type="gramEnd"/>
-                  <w:r>
-                    <w:rPr>
-                      <w:sz w:val="20"/>
-                      <w:szCs w:val="20"/>
-                    </w:rPr>
-                    <w:t xml:space="preserve"> ………………….</w:t>
+                      <w:lang w:val="it-IT"/>
+                    </w:rPr>
+                    <w:t>…………………..</w:t>
                   </w:r>
                 </w:p>
                 <w:p>
@@ -718,30 +622,16 @@
                     <w:rPr>
                       <w:sz w:val="20"/>
                       <w:szCs w:val="20"/>
+                      <w:lang w:val="it-IT"/>
                     </w:rPr>
                   </w:pPr>
                   <w:r>
                     <w:rPr>
                       <w:sz w:val="20"/>
                       <w:szCs w:val="20"/>
-                    </w:rPr>
-                    <w:t xml:space="preserve">SATKAI </w:t>
-                  </w:r>
-                  <w:proofErr w:type="gramStart"/>
-                  <w:r>
-                    <w:rPr>
-                      <w:sz w:val="20"/>
-                      <w:szCs w:val="20"/>
-                    </w:rPr>
-                    <w:t>III :</w:t>
-                  </w:r>
-                  <w:proofErr w:type="gramEnd"/>
-                  <w:r>
-                    <w:rPr>
-                      <w:sz w:val="20"/>
-                      <w:szCs w:val="20"/>
-                    </w:rPr>
-                    <w:t xml:space="preserve"> BIRO LOGISTIK</w:t>
+                      <w:lang w:val="it-IT"/>
+                    </w:rPr>
+                    <w:t>SATKAI II : ………………….</w:t>
                   </w:r>
                 </w:p>
                 <w:p>
@@ -752,6 +642,27 @@
                     <w:rPr>
                       <w:sz w:val="20"/>
                       <w:szCs w:val="20"/>
+                      <w:lang w:val="it-IT"/>
+                    </w:rPr>
+                  </w:pPr>
+                  <w:r>
+                    <w:rPr>
+                      <w:sz w:val="20"/>
+                      <w:szCs w:val="20"/>
+                      <w:lang w:val="it-IT"/>
+                    </w:rPr>
+                    <w:t>SATKAI III : BIRO LOGISTIK</w:t>
+                  </w:r>
+                </w:p>
+                <w:p>
+                  <w:pPr>
+                    <w:spacing w:line="360" w:lineRule="auto"/>
+                    <w:contextualSpacing/>
+                    <w:jc w:val="both"/>
+                    <w:rPr>
+                      <w:sz w:val="20"/>
+                      <w:szCs w:val="20"/>
+                      <w:lang w:val="it-IT"/>
                     </w:rPr>
                   </w:pPr>
                 </w:p>
@@ -1001,7 +912,7 @@
                 <w:rPr>
                   <w:noProof/>
                 </w:rPr>
-                <w:t>01-05-2026</w:t>
+                <w:t>01-06-2026</w:t>
               </w:r>
             </w:fldSimple>
           </w:p>
@@ -1050,7 +961,7 @@
                 <w:noProof/>
                 <w:lang w:val="id-ID"/>
               </w:rPr>
-              <w:t>10000</w:t>
+              <w:t>13658</w:t>
             </w:r>
             <w:r>
               <w:rPr>
@@ -1094,7 +1005,7 @@
                 <w:noProof/>
                 <w:lang w:val="id-ID"/>
               </w:rPr>
-              <w:t>10000</w:t>
+              <w:t>12892</w:t>
             </w:r>
             <w:r>
               <w:rPr>
@@ -1298,7 +1209,7 @@
                 <w:noProof/>
                 <w:lang w:val="id-ID"/>
               </w:rPr>
-              <w:t>10000</w:t>
+              <w:t>13658</w:t>
             </w:r>
             <w:r>
               <w:rPr>
@@ -1342,7 +1253,7 @@
                 <w:noProof/>
                 <w:lang w:val="id-ID"/>
               </w:rPr>
-              <w:t>10000</w:t>
+              <w:t>12892</w:t>
             </w:r>
             <w:r>
               <w:rPr>
@@ -1422,7 +1333,7 @@
                 <w:noProof/>
                 <w:lang w:val="id-ID"/>
               </w:rPr>
-              <w:t>0</w:t>
+              <w:t>1233</w:t>
             </w:r>
             <w:r>
               <w:rPr>
@@ -1466,7 +1377,7 @@
                 <w:noProof/>
                 <w:lang w:val="id-ID"/>
               </w:rPr>
-              <w:t>0</w:t>
+              <w:t>2040</w:t>
             </w:r>
             <w:r>
               <w:rPr>
@@ -1551,7 +1462,7 @@
                 <w:noProof/>
                 <w:lang w:val="id-ID"/>
               </w:rPr>
-              <w:t>10000</w:t>
+              <w:t>12425</w:t>
             </w:r>
             <w:r>
               <w:rPr>
@@ -1601,7 +1512,7 @@
                 <w:noProof/>
                 <w:lang w:val="id-ID"/>
               </w:rPr>
-              <w:t>10000</w:t>
+              <w:t>10852</w:t>
             </w:r>
             <w:r>
               <w:rPr>
@@ -1743,7 +1654,7 @@
                 <w:noProof/>
                 <w:lang w:val="id-ID"/>
               </w:rPr>
-              <w:t>04-05-2026</w:t>
+              <w:t>08-06-2026</w:t>
             </w:r>
             <w:r>
               <w:rPr>
@@ -1797,7 +1708,7 @@
                 <w:noProof/>
                 <w:lang w:val="id-ID"/>
               </w:rPr>
-              <w:t>10000</w:t>
+              <w:t>12425</w:t>
             </w:r>
             <w:r>
               <w:rPr>
@@ -1841,7 +1752,7 @@
                 <w:noProof/>
                 <w:lang w:val="id-ID"/>
               </w:rPr>
-              <w:t>10000</w:t>
+              <w:t>10852</w:t>
             </w:r>
             <w:r>
               <w:rPr>
@@ -2048,7 +1959,7 @@
                 <w:noProof/>
                 <w:lang w:val="id-ID"/>
               </w:rPr>
-              <w:t>10000</w:t>
+              <w:t>12425</w:t>
             </w:r>
             <w:r>
               <w:rPr>
@@ -2092,7 +2003,7 @@
                 <w:noProof/>
                 <w:lang w:val="id-ID"/>
               </w:rPr>
-              <w:t>10000</w:t>
+              <w:t>10852</w:t>
             </w:r>
             <w:r>
               <w:rPr>
@@ -2177,7 +2088,7 @@
                 <w:noProof/>
                 <w:lang w:val="id-ID"/>
               </w:rPr>
-              <w:t>0</w:t>
+              <w:t>2227</w:t>
             </w:r>
             <w:r>
               <w:rPr>
@@ -2221,7 +2132,7 @@
                 <w:noProof/>
                 <w:lang w:val="id-ID"/>
               </w:rPr>
-              <w:t>0</w:t>
+              <w:t>1979</w:t>
             </w:r>
             <w:r>
               <w:rPr>
@@ -2306,7 +2217,7 @@
                 <w:noProof/>
                 <w:lang w:val="id-ID"/>
               </w:rPr>
-              <w:t>10000</w:t>
+              <w:t>10198</w:t>
             </w:r>
             <w:r>
               <w:rPr>
@@ -2356,7 +2267,7 @@
                 <w:noProof/>
                 <w:lang w:val="id-ID"/>
               </w:rPr>
-              <w:t>10000</w:t>
+              <w:t>8873</w:t>
             </w:r>
             <w:r>
               <w:rPr>
@@ -2455,7 +2366,7 @@
                 <w:rPr>
                   <w:noProof/>
                 </w:rPr>
-                <w:t>11-05-2026</w:t>
+                <w:t>15-06-2026</w:t>
               </w:r>
             </w:fldSimple>
           </w:p>
@@ -2524,7 +2435,7 @@
                 <w:noProof/>
                 <w:lang w:val="id-ID"/>
               </w:rPr>
-              <w:t>10000</w:t>
+              <w:t>10198</w:t>
             </w:r>
             <w:r>
               <w:rPr>
@@ -2580,7 +2491,7 @@
                 <w:noProof/>
                 <w:lang w:val="id-ID"/>
               </w:rPr>
-              <w:t>10000</w:t>
+              <w:t>8873</w:t>
             </w:r>
             <w:r>
               <w:rPr>
@@ -2676,7 +2587,7 @@
                 <w:noProof/>
                 <w:lang w:val="id-ID"/>
               </w:rPr>
-              <w:t>1000</w:t>
+              <w:t>0</w:t>
             </w:r>
             <w:r>
               <w:rPr>
@@ -2732,7 +2643,7 @@
                 <w:noProof/>
                 <w:lang w:val="id-ID"/>
               </w:rPr>
-              <w:t>1000</w:t>
+              <w:t>0</w:t>
             </w:r>
             <w:r>
               <w:rPr>
@@ -2824,7 +2735,7 @@
                 <w:noProof/>
                 <w:lang w:val="id-ID"/>
               </w:rPr>
-              <w:t>11000</w:t>
+              <w:t>10198</w:t>
             </w:r>
             <w:r>
               <w:rPr>
@@ -2880,7 +2791,7 @@
                 <w:noProof/>
                 <w:lang w:val="id-ID"/>
               </w:rPr>
-              <w:t>11000</w:t>
+              <w:t>8873</w:t>
             </w:r>
             <w:r>
               <w:rPr>
@@ -2972,7 +2883,7 @@
                 <w:noProof/>
                 <w:lang w:val="id-ID"/>
               </w:rPr>
-              <w:t>0</w:t>
+              <w:t>1652</w:t>
             </w:r>
             <w:r>
               <w:rPr>
@@ -3028,7 +2939,7 @@
                 <w:noProof/>
                 <w:lang w:val="id-ID"/>
               </w:rPr>
-              <w:t>0</w:t>
+              <w:t>2002</w:t>
             </w:r>
             <w:r>
               <w:rPr>
@@ -3127,7 +3038,7 @@
                 <w:noProof/>
                 <w:lang w:val="id-ID"/>
               </w:rPr>
-              <w:t>11000</w:t>
+              <w:t>8546</w:t>
             </w:r>
             <w:r>
               <w:rPr>
@@ -3191,7 +3102,7 @@
                 <w:noProof/>
                 <w:lang w:val="id-ID"/>
               </w:rPr>
-              <w:t>11000</w:t>
+              <w:t>6871</w:t>
             </w:r>
             <w:r>
               <w:rPr>
@@ -3290,7 +3201,7 @@
                 <w:rPr>
                   <w:noProof/>
                 </w:rPr>
-                <w:t>18-05-2026</w:t>
+                <w:t>22-06-2026</w:t>
               </w:r>
             </w:fldSimple>
           </w:p>
@@ -3339,7 +3250,7 @@
                 <w:noProof/>
                 <w:lang w:val="id-ID"/>
               </w:rPr>
-              <w:t>11000</w:t>
+              <w:t>8546</w:t>
             </w:r>
             <w:r>
               <w:rPr>
@@ -3395,7 +3306,7 @@
                 <w:noProof/>
                 <w:lang w:val="id-ID"/>
               </w:rPr>
-              <w:t>11000</w:t>
+              <w:t>6871</w:t>
             </w:r>
             <w:r>
               <w:rPr>
@@ -3471,7 +3382,7 @@
                 <w:noProof/>
                 <w:lang w:val="id-ID"/>
               </w:rPr>
-              <w:t>0</w:t>
+              <w:t>1641</w:t>
             </w:r>
             <w:r>
               <w:rPr>
@@ -3527,7 +3438,7 @@
                 <w:noProof/>
                 <w:lang w:val="id-ID"/>
               </w:rPr>
-              <w:t>0</w:t>
+              <w:t>1358</w:t>
             </w:r>
             <w:r>
               <w:rPr>
@@ -3608,7 +3519,7 @@
                 <w:noProof/>
                 <w:lang w:val="id-ID"/>
               </w:rPr>
-              <w:t>11000</w:t>
+              <w:t>6905</w:t>
             </w:r>
             <w:r>
               <w:rPr>
@@ -3672,7 +3583,7 @@
                 <w:noProof/>
                 <w:lang w:val="id-ID"/>
               </w:rPr>
-              <w:t>11000</w:t>
+              <w:t>5513</w:t>
             </w:r>
             <w:r>
               <w:rPr>
@@ -3899,7 +3810,7 @@
                 <w:rPr>
                   <w:noProof/>
                 </w:rPr>
-                <w:t>25-05-2026</w:t>
+                <w:t>29-06-2026</w:t>
               </w:r>
             </w:fldSimple>
           </w:p>
@@ -3948,7 +3859,7 @@
                 <w:noProof/>
                 <w:lang w:val="id-ID"/>
               </w:rPr>
-              <w:t>11000</w:t>
+              <w:t>6905</w:t>
             </w:r>
             <w:r>
               <w:rPr>
@@ -3992,7 +3903,7 @@
                 <w:noProof/>
                 <w:lang w:val="id-ID"/>
               </w:rPr>
-              <w:t>11000</w:t>
+              <w:t>5513</w:t>
             </w:r>
             <w:r>
               <w:rPr>
@@ -4068,7 +3979,7 @@
                 <w:noProof/>
                 <w:lang w:val="id-ID"/>
               </w:rPr>
-              <w:t>0</w:t>
+              <w:t>823</w:t>
             </w:r>
             <w:r>
               <w:rPr>
@@ -4112,7 +4023,7 @@
                 <w:noProof/>
                 <w:lang w:val="id-ID"/>
               </w:rPr>
-              <w:t>0</w:t>
+              <w:t>532</w:t>
             </w:r>
             <w:r>
               <w:rPr>
@@ -4193,7 +4104,7 @@
                 <w:noProof/>
                 <w:lang w:val="id-ID"/>
               </w:rPr>
-              <w:t>11000</w:t>
+              <w:t>6082</w:t>
             </w:r>
             <w:r>
               <w:rPr>
@@ -4243,7 +4154,7 @@
                 <w:noProof/>
                 <w:lang w:val="id-ID"/>
               </w:rPr>
-              <w:t>11000</w:t>
+              <w:t>4981</w:t>
             </w:r>
             <w:r>
               <w:rPr>
@@ -4486,7 +4397,7 @@
                 <w:noProof/>
                 <w:lang w:val="id-ID"/>
               </w:rPr>
-              <w:t>10000</w:t>
+              <w:t>13658</w:t>
             </w:r>
             <w:r>
               <w:rPr>
@@ -4530,7 +4441,7 @@
                 <w:noProof/>
                 <w:lang w:val="id-ID"/>
               </w:rPr>
-              <w:t>10000</w:t>
+              <w:t>12892</w:t>
             </w:r>
             <w:r>
               <w:rPr>
@@ -4600,7 +4511,7 @@
                 <w:noProof/>
                 <w:lang w:val="id-ID"/>
               </w:rPr>
-              <w:t>1000</w:t>
+              <w:t>0</w:t>
             </w:r>
             <w:r>
               <w:rPr>
@@ -4644,7 +4555,7 @@
                 <w:noProof/>
                 <w:lang w:val="id-ID"/>
               </w:rPr>
-              <w:t>1000</w:t>
+              <w:t>0</w:t>
             </w:r>
             <w:r>
               <w:rPr>
@@ -4717,7 +4628,7 @@
                 <w:noProof/>
                 <w:lang w:val="id-ID"/>
               </w:rPr>
-              <w:t>11000</w:t>
+              <w:t>13658</w:t>
             </w:r>
             <w:r>
               <w:rPr>
@@ -4761,7 +4672,7 @@
                 <w:noProof/>
                 <w:lang w:val="id-ID"/>
               </w:rPr>
-              <w:t>11000</w:t>
+              <w:t>12892</w:t>
             </w:r>
             <w:r>
               <w:rPr>
@@ -4834,7 +4745,7 @@
                 <w:noProof/>
                 <w:lang w:val="id-ID"/>
               </w:rPr>
-              <w:t>0</w:t>
+              <w:t>7576</w:t>
             </w:r>
             <w:r>
               <w:rPr>
@@ -4878,7 +4789,7 @@
                 <w:noProof/>
                 <w:lang w:val="id-ID"/>
               </w:rPr>
-              <w:t>0</w:t>
+              <w:t>7911</w:t>
             </w:r>
             <w:r>
               <w:rPr>
@@ -4896,6 +4807,9 @@
         </w:tc>
       </w:tr>
       <w:tr>
+        <w:trPr>
+          <w:cantSplit/>
+        </w:trPr>
         <w:tc>
           <w:tcPr>
             <w:tcW w:w="2440" w:type="dxa"/>
@@ -4961,7 +4875,7 @@
                 <w:noProof/>
                 <w:lang w:val="id-ID"/>
               </w:rPr>
-              <w:t>11000</w:t>
+              <w:t>6082</w:t>
             </w:r>
             <w:r>
               <w:rPr>
@@ -5011,7 +4925,7 @@
                 <w:noProof/>
                 <w:lang w:val="id-ID"/>
               </w:rPr>
-              <w:t>11000</w:t>
+              <w:t>4981</w:t>
             </w:r>
             <w:r>
               <w:rPr>
@@ -5084,7 +4998,7 @@
                       <w:sz w:val="20"/>
                       <w:szCs w:val="20"/>
                     </w:rPr>
-                    <w:t>Mei</w:t>
+                    <w:t>Juni</w:t>
                   </w:r>
                   <w:r>
                     <w:rPr>

</xml_diff>